<commit_message>
Deploying to gh-pages from @ Morrison-Lab/psw@f45827dfa3d6a45fce16494edc29108910f7ee52 🚀
</commit_message>
<xml_diff>
--- a/chapters/conciseness.docx
+++ b/chapters/conciseness.docx
@@ -15,7 +15,7 @@
         <w:pStyle w:val="Date"/>
       </w:pPr>
       <w:r>
-        <w:t xml:space="preserve">Last modified: 2026-09-26 05:55:30 (UTC)</w:t>
+        <w:t xml:space="preserve">Last modified: 2026-09-26 17:55:08 (UTC)</w:t>
       </w:r>
     </w:p>
     <w:tbl>
@@ -708,13 +708,352 @@
     </w:p>
     <w:bookmarkEnd w:id="14"/>
     <w:bookmarkEnd w:id="15"/>
-    <w:bookmarkStart w:id="21" w:name="examples-of-concise-writing"/>
+    <w:bookmarkStart w:id="18" w:name="put-lists-in-bullet-points"/>
     <w:p>
       <w:pPr>
         <w:pStyle w:val="Heading2"/>
       </w:pPr>
       <w:r>
-        <w:t xml:space="preserve">4 Examples of concise writing</w:t>
+        <w:t xml:space="preserve">4 Put lists in bullet points</w:t>
+      </w:r>
+    </w:p>
+    <w:p>
+      <w:pPr>
+        <w:pStyle w:val="FirstParagraph"/>
+      </w:pPr>
+      <w:r>
+        <w:t xml:space="preserve">A list of three or more phrases,</w:t>
+      </w:r>
+      <w:r>
+        <w:t xml:space="preserve"> </w:t>
+      </w:r>
+      <w:r>
+        <w:t xml:space="preserve">written inline and separated by commas,</w:t>
+      </w:r>
+      <w:r>
+        <w:t xml:space="preserve"> </w:t>
+      </w:r>
+      <w:r>
+        <w:t xml:space="preserve">makes the reader count commas to find where each item ends.</w:t>
+      </w:r>
+      <w:r>
+        <w:t xml:space="preserve"> </w:t>
+      </w:r>
+      <w:r>
+        <w:t xml:space="preserve">Write it as a bullet list instead,</w:t>
+      </w:r>
+      <w:r>
+        <w:t xml:space="preserve"> </w:t>
+      </w:r>
+      <w:r>
+        <w:t xml:space="preserve">introduced by a sentence ending in a colon.</w:t>
+      </w:r>
+      <w:r>
+        <w:t xml:space="preserve"> </w:t>
+      </w:r>
+      <w:r>
+        <w:t xml:space="preserve">Use a numbered list when the items are steps done in order.</w:t>
+      </w:r>
+    </w:p>
+    <w:p>
+      <w:pPr>
+        <w:pStyle w:val="BodyText"/>
+      </w:pPr>
+      <w:r>
+        <w:t xml:space="preserve">Bullet lists matter most on slides,</w:t>
+      </w:r>
+      <w:r>
+        <w:t xml:space="preserve"> </w:t>
+      </w:r>
+      <w:r>
+        <w:t xml:space="preserve">where a reader scans a list rather than reading it as a sentence.</w:t>
+      </w:r>
+      <w:r>
+        <w:t xml:space="preserve"> </w:t>
+      </w:r>
+      <w:r>
+        <w:t xml:space="preserve">The rule is one case of a broader preference for more structure:</w:t>
+      </w:r>
+      <w:r>
+        <w:t xml:space="preserve"> </w:t>
+      </w:r>
+      <w:r>
+        <w:t xml:space="preserve">when content has a shape, show that shape in the markup.</w:t>
+      </w:r>
+    </w:p>
+    <w:p>
+      <w:pPr>
+        <w:pStyle w:val="BodyText"/>
+      </w:pPr>
+      <w:r>
+        <w:t xml:space="preserve">A few mechanics to keep in mind when writing one:</w:t>
+      </w:r>
+    </w:p>
+    <w:p>
+      <w:pPr>
+        <w:pStyle w:val="Compact"/>
+        <w:numPr>
+          <w:ilvl w:val="0"/>
+          <w:numId w:val="1006"/>
+        </w:numPr>
+      </w:pPr>
+      <w:r>
+        <w:t xml:space="preserve">Keep the items grammatically parallel,</w:t>
+      </w:r>
+      <w:r>
+        <w:t xml:space="preserve"> </w:t>
+      </w:r>
+      <w:r>
+        <w:t xml:space="preserve">so each one completes the introducing sentence the same way.</w:t>
+      </w:r>
+    </w:p>
+    <w:p>
+      <w:pPr>
+        <w:pStyle w:val="Compact"/>
+        <w:numPr>
+          <w:ilvl w:val="0"/>
+          <w:numId w:val="1006"/>
+        </w:numPr>
+      </w:pPr>
+      <w:r>
+        <w:t xml:space="preserve">Leave a blank line before the list;</w:t>
+      </w:r>
+      <w:r>
+        <w:t xml:space="preserve"> </w:t>
+      </w:r>
+      <w:r>
+        <w:t xml:space="preserve">without it, Markdown reads the list as part of the paragraph above.</w:t>
+      </w:r>
+    </w:p>
+    <w:p>
+      <w:pPr>
+        <w:pStyle w:val="Compact"/>
+        <w:numPr>
+          <w:ilvl w:val="0"/>
+          <w:numId w:val="1006"/>
+        </w:numPr>
+      </w:pPr>
+      <w:r>
+        <w:t xml:space="preserve">Keep a short series of single words inline,</w:t>
+      </w:r>
+      <w:r>
+        <w:t xml:space="preserve"> </w:t>
+      </w:r>
+      <w:r>
+        <w:t xml:space="preserve">such as</w:t>
+      </w:r>
+      <w:r>
+        <w:t xml:space="preserve"> </w:t>
+      </w:r>
+      <w:r>
+        <w:t xml:space="preserve">“R, Julia, or Python”</w:t>
+      </w:r>
+      <w:r>
+        <w:t xml:space="preserve">.</w:t>
+      </w:r>
+    </w:p>
+    <w:bookmarkStart w:id="16" w:name="exm-bullet-lists"/>
+    <w:p>
+      <w:pPr>
+        <w:pStyle w:val="FirstParagraph"/>
+      </w:pPr>
+      <w:r>
+        <w:rPr>
+          <w:b/>
+          <w:bCs/>
+        </w:rPr>
+        <w:t xml:space="preserve">Example 2 (Turning an inline list into bullet points)</w:t>
+      </w:r>
+      <w:r>
+        <w:t xml:space="preserve"> </w:t>
+      </w:r>
+      <w:r>
+        <w:t xml:space="preserve"> </w:t>
+      </w:r>
+    </w:p>
+    <w:p>
+      <w:pPr>
+        <w:pStyle w:val="BlockText"/>
+      </w:pPr>
+      <w:r>
+        <w:t xml:space="preserve">❌ Machine learning combines data to learn from, statistics to say what a finite sample of data supports, and optimization to find the model that fits the data best.</w:t>
+      </w:r>
+    </w:p>
+    <w:p>
+      <w:pPr>
+        <w:pStyle w:val="BlockText"/>
+      </w:pPr>
+      <w:r>
+        <w:t xml:space="preserve">✅ Machine learning combines three components:</w:t>
+      </w:r>
+    </w:p>
+    <w:p>
+      <w:pPr>
+        <w:pStyle w:val="Compact"/>
+        <w:numPr>
+          <w:ilvl w:val="0"/>
+          <w:numId w:val="1007"/>
+        </w:numPr>
+      </w:pPr>
+      <w:r>
+        <w:t xml:space="preserve">data to learn from;</w:t>
+      </w:r>
+    </w:p>
+    <w:p>
+      <w:pPr>
+        <w:pStyle w:val="Compact"/>
+        <w:numPr>
+          <w:ilvl w:val="0"/>
+          <w:numId w:val="1007"/>
+        </w:numPr>
+      </w:pPr>
+      <w:r>
+        <w:t xml:space="preserve">statistics to say what a finite sample of data supports;</w:t>
+      </w:r>
+    </w:p>
+    <w:p>
+      <w:pPr>
+        <w:pStyle w:val="Compact"/>
+        <w:numPr>
+          <w:ilvl w:val="0"/>
+          <w:numId w:val="1007"/>
+        </w:numPr>
+      </w:pPr>
+      <w:r>
+        <w:t xml:space="preserve">optimization to find the model that fits the data best.</w:t>
+      </w:r>
+    </w:p>
+    <w:p>
+      <w:pPr>
+        <w:pStyle w:val="FirstParagraph"/>
+      </w:pPr>
+      <w:r>
+        <w:t xml:space="preserve">The revised version puts each component on its own line,</w:t>
+      </w:r>
+      <w:r>
+        <w:t xml:space="preserve"> </w:t>
+      </w:r>
+      <w:r>
+        <w:t xml:space="preserve">so the reader sees at a glance that there are three.</w:t>
+      </w:r>
+    </w:p>
+    <w:bookmarkEnd w:id="16"/>
+    <w:bookmarkStart w:id="17" w:name="exm-numbered-lists"/>
+    <w:p>
+      <w:pPr>
+        <w:pStyle w:val="BodyText"/>
+      </w:pPr>
+      <w:r>
+        <w:rPr>
+          <w:b/>
+          <w:bCs/>
+        </w:rPr>
+        <w:t xml:space="preserve">Example 3 (Turning inline steps into a numbered list)</w:t>
+      </w:r>
+      <w:r>
+        <w:t xml:space="preserve"> </w:t>
+      </w:r>
+      <w:r>
+        <w:t xml:space="preserve"> </w:t>
+      </w:r>
+    </w:p>
+    <w:p>
+      <w:pPr>
+        <w:pStyle w:val="BlockText"/>
+      </w:pPr>
+      <w:r>
+        <w:t xml:space="preserve">❌ k-means starts with</w:t>
+      </w:r>
+      <w:r>
+        <w:t xml:space="preserve"> </w:t>
+      </w:r>
+      <m:oMath>
+        <m:r>
+          <m:t>k</m:t>
+        </m:r>
+      </m:oMath>
+      <w:r>
+        <w:t xml:space="preserve"> </w:t>
+      </w:r>
+      <w:r>
+        <w:t xml:space="preserve">group centers, assigns each point to its nearest center, moves each center to the mean of its points, and repeats until the assignments stop changing.</w:t>
+      </w:r>
+    </w:p>
+    <w:p>
+      <w:pPr>
+        <w:pStyle w:val="BlockText"/>
+      </w:pPr>
+      <w:r>
+        <w:t xml:space="preserve">✅ k-means starts with</w:t>
+      </w:r>
+      <w:r>
+        <w:t xml:space="preserve"> </w:t>
+      </w:r>
+      <m:oMath>
+        <m:r>
+          <m:t>k</m:t>
+        </m:r>
+      </m:oMath>
+      <w:r>
+        <w:t xml:space="preserve"> </w:t>
+      </w:r>
+      <w:r>
+        <w:t xml:space="preserve">group centers</w:t>
+      </w:r>
+      <w:r>
+        <w:t xml:space="preserve"> </w:t>
+      </w:r>
+      <w:r>
+        <w:t xml:space="preserve">and repeats two steps until the assignments stop changing:</w:t>
+      </w:r>
+    </w:p>
+    <w:p>
+      <w:pPr>
+        <w:pStyle w:val="Compact"/>
+        <w:numPr>
+          <w:ilvl w:val="0"/>
+          <w:numId w:val="1008"/>
+        </w:numPr>
+      </w:pPr>
+      <w:r>
+        <w:t xml:space="preserve">assign each point to its nearest center;</w:t>
+      </w:r>
+    </w:p>
+    <w:p>
+      <w:pPr>
+        <w:pStyle w:val="Compact"/>
+        <w:numPr>
+          <w:ilvl w:val="0"/>
+          <w:numId w:val="1008"/>
+        </w:numPr>
+      </w:pPr>
+      <w:r>
+        <w:t xml:space="preserve">move each center to the mean of its points.</w:t>
+      </w:r>
+    </w:p>
+    <w:p>
+      <w:pPr>
+        <w:pStyle w:val="FirstParagraph"/>
+      </w:pPr>
+      <w:r>
+        <w:t xml:space="preserve">The numbers show the order of the steps,</w:t>
+      </w:r>
+      <w:r>
+        <w:t xml:space="preserve"> </w:t>
+      </w:r>
+      <w:r>
+        <w:t xml:space="preserve">and the loop condition moves into the introducing sentence.</w:t>
+      </w:r>
+    </w:p>
+    <w:bookmarkEnd w:id="17"/>
+    <w:bookmarkEnd w:id="18"/>
+    <w:bookmarkStart w:id="24" w:name="examples-of-concise-writing"/>
+    <w:p>
+      <w:pPr>
+        <w:pStyle w:val="Heading2"/>
+      </w:pPr>
+      <w:r>
+        <w:t xml:space="preserve">5 Examples of concise writing</w:t>
       </w:r>
     </w:p>
     <w:p>
@@ -805,8 +1144,8 @@
         <w:t xml:space="preserve">.</w:t>
       </w:r>
     </w:p>
-    <w:bookmarkStart w:id="20" w:name="refs"/>
-    <w:bookmarkStart w:id="17" w:name="ref-hemingway_style"/>
+    <w:bookmarkStart w:id="23" w:name="refs"/>
+    <w:bookmarkStart w:id="20" w:name="ref-hemingway_style"/>
     <w:p>
       <w:pPr>
         <w:pStyle w:val="Bibliography"/>
@@ -865,7 +1204,7 @@
       <w:r>
         <w:t xml:space="preserve"> </w:t>
       </w:r>
-      <w:hyperlink r:id="rId16">
+      <w:hyperlink r:id="rId19">
         <w:r>
           <w:rPr>
             <w:rStyle w:val="Hyperlink"/>
@@ -877,8 +1216,8 @@
         <w:t xml:space="preserve">.</w:t>
       </w:r>
     </w:p>
-    <w:bookmarkEnd w:id="17"/>
-    <w:bookmarkStart w:id="19" w:name="ref-caesar_gallic"/>
+    <w:bookmarkEnd w:id="20"/>
+    <w:bookmarkStart w:id="22" w:name="ref-caesar_gallic"/>
     <w:p>
       <w:pPr>
         <w:pStyle w:val="Bibliography"/>
@@ -937,7 +1276,7 @@
       <w:r>
         <w:t xml:space="preserve"> </w:t>
       </w:r>
-      <w:hyperlink r:id="rId18">
+      <w:hyperlink r:id="rId21">
         <w:r>
           <w:rPr>
             <w:rStyle w:val="Hyperlink"/>
@@ -949,9 +1288,9 @@
         <w:t xml:space="preserve">.</w:t>
       </w:r>
     </w:p>
-    <w:bookmarkEnd w:id="19"/>
-    <w:bookmarkEnd w:id="20"/>
-    <w:bookmarkEnd w:id="21"/>
+    <w:bookmarkEnd w:id="22"/>
+    <w:bookmarkEnd w:id="23"/>
+    <w:bookmarkEnd w:id="24"/>
     <w:sectPr>
       <w:footnotePr>
         <w:numRestart w:val="eachSect"/>
@@ -1163,6 +1502,91 @@
       <w:rPr>
         <w:rFonts w:ascii="Wingdings" w:hAnsi="Wingdings" w:cs="Wingdings" w:hint="default"/>
       </w:rPr>
+    </w:lvl>
+  </w:abstractNum>
+  <w:abstractNum w:abstractNumId="99411">
+    <w:nsid w:val="00A99411"/>
+    <w:multiLevelType w:val="multilevel"/>
+    <w:lvl w:ilvl="0">
+      <w:start w:val="1"/>
+      <w:numFmt w:val="decimal"/>
+      <w:lvlText w:val="%1."/>
+      <w:lvlJc w:val="left"/>
+      <w:pPr>
+        <w:ind w:left="720" w:hanging="360"/>
+      </w:pPr>
+    </w:lvl>
+    <w:lvl w:ilvl="1">
+      <w:start w:val="1"/>
+      <w:numFmt w:val="decimal"/>
+      <w:lvlText w:val="%2."/>
+      <w:lvlJc w:val="left"/>
+      <w:pPr>
+        <w:ind w:left="1440" w:hanging="360"/>
+      </w:pPr>
+    </w:lvl>
+    <w:lvl w:ilvl="2">
+      <w:start w:val="1"/>
+      <w:numFmt w:val="decimal"/>
+      <w:lvlText w:val="%3."/>
+      <w:lvlJc w:val="left"/>
+      <w:pPr>
+        <w:ind w:left="2160" w:hanging="360"/>
+      </w:pPr>
+    </w:lvl>
+    <w:lvl w:ilvl="3">
+      <w:start w:val="1"/>
+      <w:numFmt w:val="decimal"/>
+      <w:lvlText w:val="%4."/>
+      <w:lvlJc w:val="left"/>
+      <w:pPr>
+        <w:ind w:left="2880" w:hanging="360"/>
+      </w:pPr>
+    </w:lvl>
+    <w:lvl w:ilvl="4">
+      <w:start w:val="1"/>
+      <w:numFmt w:val="decimal"/>
+      <w:lvlText w:val="%5."/>
+      <w:lvlJc w:val="left"/>
+      <w:pPr>
+        <w:ind w:left="3600" w:hanging="360"/>
+      </w:pPr>
+    </w:lvl>
+    <w:lvl w:ilvl="5">
+      <w:start w:val="1"/>
+      <w:numFmt w:val="decimal"/>
+      <w:lvlText w:val="%6."/>
+      <w:lvlJc w:val="left"/>
+      <w:pPr>
+        <w:ind w:left="4320" w:hanging="360"/>
+      </w:pPr>
+    </w:lvl>
+    <w:lvl w:ilvl="6">
+      <w:start w:val="1"/>
+      <w:numFmt w:val="decimal"/>
+      <w:lvlText w:val="%7."/>
+      <w:lvlJc w:val="left"/>
+      <w:pPr>
+        <w:ind w:left="5040" w:hanging="360"/>
+      </w:pPr>
+    </w:lvl>
+    <w:lvl w:ilvl="7">
+      <w:start w:val="1"/>
+      <w:numFmt w:val="decimal"/>
+      <w:lvlText w:val="%8."/>
+      <w:lvlJc w:val="left"/>
+      <w:pPr>
+        <w:ind w:left="5760" w:hanging="360"/>
+      </w:pPr>
+    </w:lvl>
+    <w:lvl w:ilvl="8">
+      <w:start w:val="1"/>
+      <w:numFmt w:val="decimal"/>
+      <w:lvlText w:val="%9."/>
+      <w:lvlJc w:val="left"/>
+      <w:pPr>
+        <w:ind w:left="6480" w:hanging="360"/>
+      </w:pPr>
     </w:lvl>
   </w:abstractNum>
   <w:num w:numId="1000">
@@ -1182,6 +1606,42 @@
   </w:num>
   <w:num w:numId="1005">
     <w:abstractNumId w:val="991"/>
+  </w:num>
+  <w:num w:numId="1006">
+    <w:abstractNumId w:val="991"/>
+  </w:num>
+  <w:num w:numId="1007">
+    <w:abstractNumId w:val="991"/>
+  </w:num>
+  <w:num w:numId="1008">
+    <w:abstractNumId w:val="99411"/>
+    <w:lvlOverride w:ilvl="0">
+      <w:startOverride w:val="1"/>
+    </w:lvlOverride>
+    <w:lvlOverride w:ilvl="1">
+      <w:startOverride w:val="1"/>
+    </w:lvlOverride>
+    <w:lvlOverride w:ilvl="2">
+      <w:startOverride w:val="1"/>
+    </w:lvlOverride>
+    <w:lvlOverride w:ilvl="3">
+      <w:startOverride w:val="1"/>
+    </w:lvlOverride>
+    <w:lvlOverride w:ilvl="4">
+      <w:startOverride w:val="1"/>
+    </w:lvlOverride>
+    <w:lvlOverride w:ilvl="5">
+      <w:startOverride w:val="1"/>
+    </w:lvlOverride>
+    <w:lvlOverride w:ilvl="6">
+      <w:startOverride w:val="1"/>
+    </w:lvlOverride>
+    <w:lvlOverride w:ilvl="7">
+      <w:startOverride w:val="1"/>
+    </w:lvlOverride>
+    <w:lvlOverride w:ilvl="8">
+      <w:startOverride w:val="1"/>
+    </w:lvlOverride>
   </w:num>
 </w:numbering>
 </file>

</xml_diff>

<commit_message>
Deploying to gh-pages from @ Morrison-Lab/psw@8141319b5387d0fd71f506aef068873bc4847775 🚀
</commit_message>
<xml_diff>
--- a/chapters/conciseness.docx
+++ b/chapters/conciseness.docx
@@ -15,7 +15,7 @@
         <w:pStyle w:val="Date"/>
       </w:pPr>
       <w:r>
-        <w:t xml:space="preserve">Last modified: 2026-10-05 09:01:55 (UTC)</w:t>
+        <w:t xml:space="preserve">Last modified: 2026-10-05 09:07:36 (UTC)</w:t>
       </w:r>
     </w:p>
     <w:tbl>
@@ -708,13 +708,13 @@
     </w:p>
     <w:bookmarkEnd w:id="14"/>
     <w:bookmarkEnd w:id="15"/>
-    <w:bookmarkStart w:id="18" w:name="put-lists-in-bullet-points"/>
+    <w:bookmarkStart w:id="17" w:name="avoid-double-negatives"/>
     <w:p>
       <w:pPr>
         <w:pStyle w:val="Heading2"/>
       </w:pPr>
       <w:r>
-        <w:t xml:space="preserve">4 Put lists in bullet points</w:t>
+        <w:t xml:space="preserve">4 Avoid double negatives</w:t>
       </w:r>
     </w:p>
     <w:p>
@@ -722,71 +722,13 @@
         <w:pStyle w:val="FirstParagraph"/>
       </w:pPr>
       <w:r>
-        <w:t xml:space="preserve">A list of three or more phrases,</w:t>
-      </w:r>
-      <w:r>
-        <w:t xml:space="preserve"> </w:t>
-      </w:r>
-      <w:r>
-        <w:t xml:space="preserve">written inline and separated by commas,</w:t>
-      </w:r>
-      <w:r>
-        <w:t xml:space="preserve"> </w:t>
-      </w:r>
-      <w:r>
-        <w:t xml:space="preserve">makes the reader count commas to find where each item ends.</w:t>
-      </w:r>
-      <w:r>
-        <w:t xml:space="preserve"> </w:t>
-      </w:r>
-      <w:r>
-        <w:t xml:space="preserve">Write it as a bullet list instead,</w:t>
-      </w:r>
-      <w:r>
-        <w:t xml:space="preserve"> </w:t>
-      </w:r>
-      <w:r>
-        <w:t xml:space="preserve">introduced by a sentence ending in a colon.</w:t>
-      </w:r>
-      <w:r>
-        <w:t xml:space="preserve"> </w:t>
-      </w:r>
-      <w:r>
-        <w:t xml:space="preserve">Use a numbered list when the items are steps done in order.</w:t>
-      </w:r>
-    </w:p>
-    <w:p>
-      <w:pPr>
-        <w:pStyle w:val="BodyText"/>
-      </w:pPr>
-      <w:r>
-        <w:t xml:space="preserve">Bullet lists matter most on slides,</w:t>
-      </w:r>
-      <w:r>
-        <w:t xml:space="preserve"> </w:t>
-      </w:r>
-      <w:r>
-        <w:t xml:space="preserve">where a reader scans a list rather than reading it as a sentence.</w:t>
-      </w:r>
-      <w:r>
-        <w:t xml:space="preserve"> </w:t>
-      </w:r>
-      <w:r>
-        <w:t xml:space="preserve">The rule is one case of a broader preference for more structure:</w:t>
-      </w:r>
-      <w:r>
-        <w:t xml:space="preserve"> </w:t>
-      </w:r>
-      <w:r>
-        <w:t xml:space="preserve">when content has a shape, show that shape in the markup.</w:t>
-      </w:r>
-    </w:p>
-    <w:p>
-      <w:pPr>
-        <w:pStyle w:val="BodyText"/>
-      </w:pPr>
-      <w:r>
-        <w:t xml:space="preserve">A few mechanics to keep in mind when writing one:</w:t>
+        <w:t xml:space="preserve">A double negative states a claim by denying its opposite,</w:t>
+      </w:r>
+      <w:r>
+        <w:t xml:space="preserve"> </w:t>
+      </w:r>
+      <w:r>
+        <w:t xml:space="preserve">as in these phrases:</w:t>
       </w:r>
     </w:p>
     <w:p>
@@ -798,13 +740,7 @@
         </w:numPr>
       </w:pPr>
       <w:r>
-        <w:t xml:space="preserve">Keep the items grammatically parallel,</w:t>
-      </w:r>
-      <w:r>
-        <w:t xml:space="preserve"> </w:t>
-      </w:r>
-      <w:r>
-        <w:t xml:space="preserve">so each one completes the introducing sentence the same way.</w:t>
+        <w:t xml:space="preserve">“not uncommon”</w:t>
       </w:r>
     </w:p>
     <w:p>
@@ -816,13 +752,7 @@
         </w:numPr>
       </w:pPr>
       <w:r>
-        <w:t xml:space="preserve">Leave a blank line before the list;</w:t>
-      </w:r>
-      <w:r>
-        <w:t xml:space="preserve"> </w:t>
-      </w:r>
-      <w:r>
-        <w:t xml:space="preserve">without it, Markdown reads the list as part of the paragraph above.</w:t>
+        <w:t xml:space="preserve">“not unlikely”</w:t>
       </w:r>
     </w:p>
     <w:p>
@@ -834,35 +764,78 @@
         </w:numPr>
       </w:pPr>
       <w:r>
-        <w:t xml:space="preserve">Keep a short series of single words inline,</w:t>
-      </w:r>
-      <w:r>
-        <w:t xml:space="preserve"> </w:t>
-      </w:r>
-      <w:r>
-        <w:t xml:space="preserve">such as</w:t>
-      </w:r>
-      <w:r>
-        <w:t xml:space="preserve"> </w:t>
-      </w:r>
-      <w:r>
-        <w:t xml:space="preserve">“R, Julia, or Python”</w:t>
-      </w:r>
-      <w:r>
-        <w:t xml:space="preserve">.</w:t>
-      </w:r>
-    </w:p>
-    <w:bookmarkStart w:id="16" w:name="exm-bullet-lists"/>
+        <w:t xml:space="preserve">“not inconsistent with”</w:t>
+      </w:r>
+    </w:p>
     <w:p>
       <w:pPr>
         <w:pStyle w:val="FirstParagraph"/>
+      </w:pPr>
+      <w:r>
+        <w:t xml:space="preserve">The reader has to cancel the two negatives to recover the claim,</w:t>
+      </w:r>
+      <w:r>
+        <w:t xml:space="preserve"> </w:t>
+      </w:r>
+      <w:r>
+        <w:t xml:space="preserve">and the result is often vaguer than the writer intended.</w:t>
+      </w:r>
+      <w:r>
+        <w:t xml:space="preserve"> </w:t>
+      </w:r>
+      <w:r>
+        <w:t xml:space="preserve">State the claim directly.</w:t>
+      </w:r>
+      <w:r>
+        <w:t xml:space="preserve"> </w:t>
+      </w:r>
+      <w:r>
+        <w:t xml:space="preserve">If you mean something weaker than the direct claim,</w:t>
+      </w:r>
+      <w:r>
+        <w:t xml:space="preserve"> </w:t>
+      </w:r>
+      <w:r>
+        <w:t xml:space="preserve">say what the weaker claim is.</w:t>
+      </w:r>
+    </w:p>
+    <w:p>
+      <w:pPr>
+        <w:pStyle w:val="BodyText"/>
+      </w:pPr>
+      <w:r>
+        <w:t xml:space="preserve">A single negative is fine.</w:t>
+      </w:r>
+      <w:r>
+        <w:t xml:space="preserve"> </w:t>
+      </w:r>
+      <w:r>
+        <w:t xml:space="preserve">“We did not reject the null hypothesis”</w:t>
+      </w:r>
+      <w:r>
+        <w:t xml:space="preserve"> </w:t>
+      </w:r>
+      <w:r>
+        <w:t xml:space="preserve">denies one thing,</w:t>
+      </w:r>
+      <w:r>
+        <w:t xml:space="preserve"> </w:t>
+      </w:r>
+      <w:r>
+        <w:t xml:space="preserve">and it is the standard wording for a test result.</w:t>
+      </w:r>
+    </w:p>
+    <w:bookmarkStart w:id="16" w:name="exm-double-negative"/>
+    <w:p>
+      <w:pPr>
+        <w:pStyle w:val="BodyText"/>
       </w:pPr>
       <w:r>
         <w:rPr>
           <w:b/>
           <w:bCs/>
         </w:rPr>
-        <w:t xml:space="preserve">Example 2 (Turning an inline list into bullet points)</w:t>
+        <w:t xml:space="preserve">Example 2 (Stating a claim directly)</w:t>
       </w:r>
       <w:r>
         <w:t xml:space="preserve"> </w:t>
@@ -876,7 +849,7 @@
         <w:pStyle w:val="BlockText"/>
       </w:pPr>
       <w:r>
-        <w:t xml:space="preserve">❌ Machine learning combines data to learn from, statistics to say what a finite sample of data supports, and optimization to find the model that fits the data best.</w:t>
+        <w:t xml:space="preserve">❌ The association was not inconsistent with a dose-response relationship.</w:t>
       </w:r>
     </w:p>
     <w:p>
@@ -884,7 +857,145 @@
         <w:pStyle w:val="BlockText"/>
       </w:pPr>
       <w:r>
-        <w:t xml:space="preserve">✅ Machine learning combines three components:</w:t>
+        <w:t xml:space="preserve">✅ The association was consistent with a dose-response relationship.</w:t>
+      </w:r>
+    </w:p>
+    <w:p>
+      <w:pPr>
+        <w:pStyle w:val="BlockText"/>
+      </w:pPr>
+      <w:r>
+        <w:t xml:space="preserve">✅ The data do not rule out a dose-response relationship, but they do not support one either.</w:t>
+      </w:r>
+    </w:p>
+    <w:p>
+      <w:pPr>
+        <w:pStyle w:val="FirstParagraph"/>
+      </w:pPr>
+      <w:r>
+        <w:t xml:space="preserve">Writers usually choose</w:t>
+      </w:r>
+      <w:r>
+        <w:t xml:space="preserve"> </w:t>
+      </w:r>
+      <w:r>
+        <w:t xml:space="preserve">“not inconsistent with”</w:t>
+      </w:r>
+      <w:r>
+        <w:t xml:space="preserve"> </w:t>
+      </w:r>
+      <w:r>
+        <w:t xml:space="preserve">to hedge</w:t>
+      </w:r>
+      <w:r>
+        <w:t xml:space="preserve"> </w:t>
+      </w:r>
+      <w:r>
+        <w:t xml:space="preserve">“consistent with”</w:t>
+      </w:r>
+      <w:r>
+        <w:t xml:space="preserve">.</w:t>
+      </w:r>
+      <w:r>
+        <w:t xml:space="preserve"> </w:t>
+      </w:r>
+      <w:r>
+        <w:t xml:space="preserve">The first rewrite drops the hedge;</w:t>
+      </w:r>
+      <w:r>
+        <w:t xml:space="preserve"> </w:t>
+      </w:r>
+      <w:r>
+        <w:t xml:space="preserve">the second says what the hedge was for.</w:t>
+      </w:r>
+      <w:r>
+        <w:t xml:space="preserve"> </w:t>
+      </w:r>
+      <w:r>
+        <w:t xml:space="preserve">Choose the one you mean.</w:t>
+      </w:r>
+    </w:p>
+    <w:bookmarkEnd w:id="16"/>
+    <w:bookmarkEnd w:id="17"/>
+    <w:bookmarkStart w:id="20" w:name="put-lists-in-bullet-points"/>
+    <w:p>
+      <w:pPr>
+        <w:pStyle w:val="Heading2"/>
+      </w:pPr>
+      <w:r>
+        <w:t xml:space="preserve">5 Put lists in bullet points</w:t>
+      </w:r>
+    </w:p>
+    <w:p>
+      <w:pPr>
+        <w:pStyle w:val="FirstParagraph"/>
+      </w:pPr>
+      <w:r>
+        <w:t xml:space="preserve">A list of three or more phrases,</w:t>
+      </w:r>
+      <w:r>
+        <w:t xml:space="preserve"> </w:t>
+      </w:r>
+      <w:r>
+        <w:t xml:space="preserve">written inline and separated by commas,</w:t>
+      </w:r>
+      <w:r>
+        <w:t xml:space="preserve"> </w:t>
+      </w:r>
+      <w:r>
+        <w:t xml:space="preserve">makes the reader count commas to find where each item ends.</w:t>
+      </w:r>
+      <w:r>
+        <w:t xml:space="preserve"> </w:t>
+      </w:r>
+      <w:r>
+        <w:t xml:space="preserve">Write it as a bullet list instead,</w:t>
+      </w:r>
+      <w:r>
+        <w:t xml:space="preserve"> </w:t>
+      </w:r>
+      <w:r>
+        <w:t xml:space="preserve">introduced by a sentence ending in a colon.</w:t>
+      </w:r>
+      <w:r>
+        <w:t xml:space="preserve"> </w:t>
+      </w:r>
+      <w:r>
+        <w:t xml:space="preserve">Use a numbered list when the items are steps done in order.</w:t>
+      </w:r>
+    </w:p>
+    <w:p>
+      <w:pPr>
+        <w:pStyle w:val="BodyText"/>
+      </w:pPr>
+      <w:r>
+        <w:t xml:space="preserve">Bullet lists matter most on slides,</w:t>
+      </w:r>
+      <w:r>
+        <w:t xml:space="preserve"> </w:t>
+      </w:r>
+      <w:r>
+        <w:t xml:space="preserve">where a reader scans a list rather than reading it as a sentence.</w:t>
+      </w:r>
+      <w:r>
+        <w:t xml:space="preserve"> </w:t>
+      </w:r>
+      <w:r>
+        <w:t xml:space="preserve">The rule is one case of a broader preference for more structure:</w:t>
+      </w:r>
+      <w:r>
+        <w:t xml:space="preserve"> </w:t>
+      </w:r>
+      <w:r>
+        <w:t xml:space="preserve">when content has a shape, show that shape in the markup.</w:t>
+      </w:r>
+    </w:p>
+    <w:p>
+      <w:pPr>
+        <w:pStyle w:val="BodyText"/>
+      </w:pPr>
+      <w:r>
+        <w:t xml:space="preserve">A few mechanics to keep in mind when writing one:</w:t>
       </w:r>
     </w:p>
     <w:p>
@@ -896,7 +1007,13 @@
         </w:numPr>
       </w:pPr>
       <w:r>
-        <w:t xml:space="preserve">data to learn from;</w:t>
+        <w:t xml:space="preserve">Keep the items grammatically parallel,</w:t>
+      </w:r>
+      <w:r>
+        <w:t xml:space="preserve"> </w:t>
+      </w:r>
+      <w:r>
+        <w:t xml:space="preserve">so each one completes the introducing sentence the same way.</w:t>
       </w:r>
     </w:p>
     <w:p>
@@ -908,7 +1025,13 @@
         </w:numPr>
       </w:pPr>
       <w:r>
-        <w:t xml:space="preserve">statistics to say what a finite sample of data supports;</w:t>
+        <w:t xml:space="preserve">Leave a blank line before the list;</w:t>
+      </w:r>
+      <w:r>
+        <w:t xml:space="preserve"> </w:t>
+      </w:r>
+      <w:r>
+        <w:t xml:space="preserve">without it, Markdown reads the list as part of the paragraph above.</w:t>
       </w:r>
     </w:p>
     <w:p>
@@ -920,35 +1043,121 @@
         </w:numPr>
       </w:pPr>
       <w:r>
-        <w:t xml:space="preserve">optimization to find the model that fits the data best.</w:t>
-      </w:r>
-    </w:p>
+        <w:t xml:space="preserve">Keep a short series of single words inline,</w:t>
+      </w:r>
+      <w:r>
+        <w:t xml:space="preserve"> </w:t>
+      </w:r>
+      <w:r>
+        <w:t xml:space="preserve">such as</w:t>
+      </w:r>
+      <w:r>
+        <w:t xml:space="preserve"> </w:t>
+      </w:r>
+      <w:r>
+        <w:t xml:space="preserve">“R, Julia, or Python”</w:t>
+      </w:r>
+      <w:r>
+        <w:t xml:space="preserve">.</w:t>
+      </w:r>
+    </w:p>
+    <w:bookmarkStart w:id="18" w:name="exm-bullet-lists"/>
     <w:p>
       <w:pPr>
         <w:pStyle w:val="FirstParagraph"/>
-      </w:pPr>
-      <w:r>
-        <w:t xml:space="preserve">The revised version puts each component on its own line,</w:t>
-      </w:r>
-      <w:r>
-        <w:t xml:space="preserve"> </w:t>
-      </w:r>
-      <w:r>
-        <w:t xml:space="preserve">so the reader sees at a glance that there are three.</w:t>
-      </w:r>
-    </w:p>
-    <w:bookmarkEnd w:id="16"/>
-    <w:bookmarkStart w:id="17" w:name="exm-numbered-lists"/>
-    <w:p>
-      <w:pPr>
-        <w:pStyle w:val="BodyText"/>
       </w:pPr>
       <w:r>
         <w:rPr>
           <w:b/>
           <w:bCs/>
         </w:rPr>
-        <w:t xml:space="preserve">Example 3 (Turning inline steps into a numbered list)</w:t>
+        <w:t xml:space="preserve">Example 3 (Turning an inline list into bullet points)</w:t>
+      </w:r>
+      <w:r>
+        <w:t xml:space="preserve"> </w:t>
+      </w:r>
+      <w:r>
+        <w:t xml:space="preserve"> </w:t>
+      </w:r>
+    </w:p>
+    <w:p>
+      <w:pPr>
+        <w:pStyle w:val="BlockText"/>
+      </w:pPr>
+      <w:r>
+        <w:t xml:space="preserve">❌ Machine learning combines data to learn from, statistics to say what a finite sample of data supports, and optimization to find the model that fits the data best.</w:t>
+      </w:r>
+    </w:p>
+    <w:p>
+      <w:pPr>
+        <w:pStyle w:val="BlockText"/>
+      </w:pPr>
+      <w:r>
+        <w:t xml:space="preserve">✅ Machine learning combines three components:</w:t>
+      </w:r>
+    </w:p>
+    <w:p>
+      <w:pPr>
+        <w:pStyle w:val="Compact"/>
+        <w:numPr>
+          <w:ilvl w:val="0"/>
+          <w:numId w:val="1008"/>
+        </w:numPr>
+      </w:pPr>
+      <w:r>
+        <w:t xml:space="preserve">data to learn from;</w:t>
+      </w:r>
+    </w:p>
+    <w:p>
+      <w:pPr>
+        <w:pStyle w:val="Compact"/>
+        <w:numPr>
+          <w:ilvl w:val="0"/>
+          <w:numId w:val="1008"/>
+        </w:numPr>
+      </w:pPr>
+      <w:r>
+        <w:t xml:space="preserve">statistics to say what a finite sample of data supports;</w:t>
+      </w:r>
+    </w:p>
+    <w:p>
+      <w:pPr>
+        <w:pStyle w:val="Compact"/>
+        <w:numPr>
+          <w:ilvl w:val="0"/>
+          <w:numId w:val="1008"/>
+        </w:numPr>
+      </w:pPr>
+      <w:r>
+        <w:t xml:space="preserve">optimization to find the model that fits the data best.</w:t>
+      </w:r>
+    </w:p>
+    <w:p>
+      <w:pPr>
+        <w:pStyle w:val="FirstParagraph"/>
+      </w:pPr>
+      <w:r>
+        <w:t xml:space="preserve">The revised version puts each component on its own line,</w:t>
+      </w:r>
+      <w:r>
+        <w:t xml:space="preserve"> </w:t>
+      </w:r>
+      <w:r>
+        <w:t xml:space="preserve">so the reader sees at a glance that there are three.</w:t>
+      </w:r>
+    </w:p>
+    <w:bookmarkEnd w:id="18"/>
+    <w:bookmarkStart w:id="19" w:name="exm-numbered-lists"/>
+    <w:p>
+      <w:pPr>
+        <w:pStyle w:val="BodyText"/>
+      </w:pPr>
+      <w:r>
+        <w:rPr>
+          <w:b/>
+          <w:bCs/>
+        </w:rPr>
+        <w:t xml:space="preserve">Example 4 (Turning inline steps into a numbered list)</w:t>
       </w:r>
       <w:r>
         <w:t xml:space="preserve"> </w:t>
@@ -1012,7 +1221,7 @@
         <w:pStyle w:val="Compact"/>
         <w:numPr>
           <w:ilvl w:val="0"/>
-          <w:numId w:val="1008"/>
+          <w:numId w:val="1009"/>
         </w:numPr>
       </w:pPr>
       <w:r>
@@ -1024,7 +1233,7 @@
         <w:pStyle w:val="Compact"/>
         <w:numPr>
           <w:ilvl w:val="0"/>
-          <w:numId w:val="1008"/>
+          <w:numId w:val="1009"/>
         </w:numPr>
       </w:pPr>
       <w:r>
@@ -1045,15 +1254,15 @@
         <w:t xml:space="preserve">and the loop condition moves into the introducing sentence.</w:t>
       </w:r>
     </w:p>
-    <w:bookmarkEnd w:id="17"/>
-    <w:bookmarkEnd w:id="18"/>
-    <w:bookmarkStart w:id="24" w:name="examples-of-concise-writing"/>
+    <w:bookmarkEnd w:id="19"/>
+    <w:bookmarkEnd w:id="20"/>
+    <w:bookmarkStart w:id="26" w:name="examples-of-concise-writing"/>
     <w:p>
       <w:pPr>
         <w:pStyle w:val="Heading2"/>
       </w:pPr>
       <w:r>
-        <w:t xml:space="preserve">5 Examples of concise writing</w:t>
+        <w:t xml:space="preserve">6 Examples of concise writing</w:t>
       </w:r>
     </w:p>
     <w:p>
@@ -1144,8 +1353,8 @@
         <w:t xml:space="preserve">.</w:t>
       </w:r>
     </w:p>
-    <w:bookmarkStart w:id="23" w:name="refs"/>
-    <w:bookmarkStart w:id="20" w:name="ref-hemingway_style"/>
+    <w:bookmarkStart w:id="25" w:name="refs"/>
+    <w:bookmarkStart w:id="22" w:name="ref-hemingway_style"/>
     <w:p>
       <w:pPr>
         <w:pStyle w:val="Bibliography"/>
@@ -1204,7 +1413,7 @@
       <w:r>
         <w:t xml:space="preserve"> </w:t>
       </w:r>
-      <w:hyperlink r:id="rId19">
+      <w:hyperlink r:id="rId21">
         <w:r>
           <w:rPr>
             <w:rStyle w:val="Hyperlink"/>
@@ -1216,8 +1425,8 @@
         <w:t xml:space="preserve">.</w:t>
       </w:r>
     </w:p>
-    <w:bookmarkEnd w:id="20"/>
-    <w:bookmarkStart w:id="22" w:name="ref-caesar_gallic"/>
+    <w:bookmarkEnd w:id="22"/>
+    <w:bookmarkStart w:id="24" w:name="ref-caesar_gallic"/>
     <w:p>
       <w:pPr>
         <w:pStyle w:val="Bibliography"/>
@@ -1276,7 +1485,7 @@
       <w:r>
         <w:t xml:space="preserve"> </w:t>
       </w:r>
-      <w:hyperlink r:id="rId21">
+      <w:hyperlink r:id="rId23">
         <w:r>
           <w:rPr>
             <w:rStyle w:val="Hyperlink"/>
@@ -1288,9 +1497,9 @@
         <w:t xml:space="preserve">.</w:t>
       </w:r>
     </w:p>
-    <w:bookmarkEnd w:id="22"/>
-    <w:bookmarkEnd w:id="23"/>
     <w:bookmarkEnd w:id="24"/>
+    <w:bookmarkEnd w:id="25"/>
+    <w:bookmarkEnd w:id="26"/>
     <w:sectPr>
       <w:footnotePr>
         <w:numRestart w:val="eachSect"/>
@@ -1614,6 +1823,9 @@
     <w:abstractNumId w:val="991"/>
   </w:num>
   <w:num w:numId="1008">
+    <w:abstractNumId w:val="991"/>
+  </w:num>
+  <w:num w:numId="1009">
     <w:abstractNumId w:val="99411"/>
     <w:lvlOverride w:ilvl="0">
       <w:startOverride w:val="1"/>

</xml_diff>

<commit_message>
Deploying to gh-pages from @ Morrison-Lab/psw@a9774abbbc6891893214abe25fed5ddd8fe9f8dc 🚀
</commit_message>
<xml_diff>
--- a/chapters/conciseness.docx
+++ b/chapters/conciseness.docx
@@ -15,7 +15,7 @@
         <w:pStyle w:val="Date"/>
       </w:pPr>
       <w:r>
-        <w:t xml:space="preserve">Last modified: 2026-10-05 17:30:35 (UTC)</w:t>
+        <w:t xml:space="preserve">Last modified: 2026-10-05 17:40:43 (UTC)</w:t>
       </w:r>
     </w:p>
     <w:tbl>
@@ -917,13 +917,13 @@
     </w:p>
     <w:bookmarkEnd w:id="16"/>
     <w:bookmarkEnd w:id="17"/>
-    <w:bookmarkStart w:id="20" w:name="put-lists-in-bullet-points"/>
+    <w:bookmarkStart w:id="20" w:name="Xa757197b9b942a803dc05820332a104a8aaeee4"/>
     <w:p>
       <w:pPr>
         <w:pStyle w:val="Heading2"/>
       </w:pPr>
       <w:r>
-        <w:t xml:space="preserve">5 Put lists in bullet points</w:t>
+        <w:t xml:space="preserve">5 Write about the subject, not about the text</w:t>
       </w:r>
     </w:p>
     <w:p>
@@ -931,71 +931,13 @@
         <w:pStyle w:val="FirstParagraph"/>
       </w:pPr>
       <w:r>
-        <w:t xml:space="preserve">A list of three or more phrases,</w:t>
-      </w:r>
-      <w:r>
-        <w:t xml:space="preserve"> </w:t>
-      </w:r>
-      <w:r>
-        <w:t xml:space="preserve">written inline and separated by commas,</w:t>
-      </w:r>
-      <w:r>
-        <w:t xml:space="preserve"> </w:t>
-      </w:r>
-      <w:r>
-        <w:t xml:space="preserve">makes the reader count commas to find where each item ends.</w:t>
-      </w:r>
-      <w:r>
-        <w:t xml:space="preserve"> </w:t>
-      </w:r>
-      <w:r>
-        <w:t xml:space="preserve">Write it as a bullet list instead,</w:t>
-      </w:r>
-      <w:r>
-        <w:t xml:space="preserve"> </w:t>
-      </w:r>
-      <w:r>
-        <w:t xml:space="preserve">introduced by a sentence ending in a colon.</w:t>
-      </w:r>
-      <w:r>
-        <w:t xml:space="preserve"> </w:t>
-      </w:r>
-      <w:r>
-        <w:t xml:space="preserve">Use a numbered list when the items are steps done in order.</w:t>
-      </w:r>
-    </w:p>
-    <w:p>
-      <w:pPr>
-        <w:pStyle w:val="BodyText"/>
-      </w:pPr>
-      <w:r>
-        <w:t xml:space="preserve">Bullet lists matter most on slides,</w:t>
-      </w:r>
-      <w:r>
-        <w:t xml:space="preserve"> </w:t>
-      </w:r>
-      <w:r>
-        <w:t xml:space="preserve">where a reader scans a list rather than reading it as a sentence.</w:t>
-      </w:r>
-      <w:r>
-        <w:t xml:space="preserve"> </w:t>
-      </w:r>
-      <w:r>
-        <w:t xml:space="preserve">The rule is one case of a broader preference for more structure:</w:t>
-      </w:r>
-      <w:r>
-        <w:t xml:space="preserve"> </w:t>
-      </w:r>
-      <w:r>
-        <w:t xml:space="preserve">when content has a shape, show that shape in the markup.</w:t>
-      </w:r>
-    </w:p>
-    <w:p>
-      <w:pPr>
-        <w:pStyle w:val="BodyText"/>
-      </w:pPr>
-      <w:r>
-        <w:t xml:space="preserve">A few mechanics to keep in mind when writing one:</w:t>
+        <w:t xml:space="preserve">Some sentences describe the document instead of its subject.</w:t>
+      </w:r>
+      <w:r>
+        <w:t xml:space="preserve"> </w:t>
+      </w:r>
+      <w:r>
+        <w:t xml:space="preserve">They do one of these things:</w:t>
       </w:r>
     </w:p>
     <w:p>
@@ -1007,13 +949,7 @@
         </w:numPr>
       </w:pPr>
       <w:r>
-        <w:t xml:space="preserve">Keep the items grammatically parallel,</w:t>
-      </w:r>
-      <w:r>
-        <w:t xml:space="preserve"> </w:t>
-      </w:r>
-      <w:r>
-        <w:t xml:space="preserve">so each one completes the introducing sentence the same way.</w:t>
+        <w:t xml:space="preserve">announce that a point is coming;</w:t>
       </w:r>
     </w:p>
     <w:p>
@@ -1025,13 +961,7 @@
         </w:numPr>
       </w:pPr>
       <w:r>
-        <w:t xml:space="preserve">Leave a blank line before the list;</w:t>
-      </w:r>
-      <w:r>
-        <w:t xml:space="preserve"> </w:t>
-      </w:r>
-      <w:r>
-        <w:t xml:space="preserve">without it, Markdown reads the list as part of the paragraph above.</w:t>
+        <w:t xml:space="preserve">rank a point;</w:t>
       </w:r>
     </w:p>
     <w:p>
@@ -1043,35 +973,66 @@
         </w:numPr>
       </w:pPr>
       <w:r>
-        <w:t xml:space="preserve">Keep a short series of single words inline,</w:t>
-      </w:r>
-      <w:r>
-        <w:t xml:space="preserve"> </w:t>
-      </w:r>
-      <w:r>
-        <w:t xml:space="preserve">such as</w:t>
-      </w:r>
-      <w:r>
-        <w:t xml:space="preserve"> </w:t>
-      </w:r>
-      <w:r>
-        <w:t xml:space="preserve">“R, Julia, or Python”</w:t>
+        <w:t xml:space="preserve">comment on how a point changes what follows.</w:t>
+      </w:r>
+    </w:p>
+    <w:p>
+      <w:pPr>
+        <w:pStyle w:val="FirstParagraph"/>
+      </w:pPr>
+      <w:r>
+        <w:t xml:space="preserve">Each one makes the reader read a sentence</w:t>
+      </w:r>
+      <w:r>
+        <w:t xml:space="preserve"> </w:t>
+      </w:r>
+      <w:r>
+        <w:t xml:space="preserve">before reaching the content it promises.</w:t>
+      </w:r>
+      <w:r>
+        <w:t xml:space="preserve"> </w:t>
+      </w:r>
+      <w:r>
+        <w:t xml:space="preserve">State the content directly.</w:t>
+      </w:r>
+      <w:r>
+        <w:t xml:space="preserve"> </w:t>
+      </w:r>
+      <w:hyperlink r:id="rId18">
+        <w:r>
+          <w:rPr>
+            <w:rStyle w:val="Hyperlink"/>
+          </w:rPr>
+          <w:t xml:space="preserve">Rhetorical reflexes</w:t>
+        </w:r>
+      </w:hyperlink>
+      <w:r>
+        <w:t xml:space="preserve"> </w:t>
+      </w:r>
+      <w:r>
+        <w:t xml:space="preserve">lists related signpost phrases, such as</w:t>
+      </w:r>
+      <w:r>
+        <w:t xml:space="preserve"> </w:t>
+      </w:r>
+      <w:r>
+        <w:t xml:space="preserve">“it is worth noting that”</w:t>
       </w:r>
       <w:r>
         <w:t xml:space="preserve">.</w:t>
       </w:r>
     </w:p>
-    <w:bookmarkStart w:id="18" w:name="exm-bullet-lists"/>
-    <w:p>
-      <w:pPr>
-        <w:pStyle w:val="FirstParagraph"/>
+    <w:bookmarkStart w:id="19" w:name="exm-self-referential"/>
+    <w:p>
+      <w:pPr>
+        <w:pStyle w:val="BodyText"/>
       </w:pPr>
       <w:r>
         <w:rPr>
           <w:b/>
           <w:bCs/>
         </w:rPr>
-        <w:t xml:space="preserve">Example 3 (Turning an inline list into bullet points)</w:t>
+        <w:t xml:space="preserve">Example 3 (Replacing a sentence about the text)</w:t>
       </w:r>
       <w:r>
         <w:t xml:space="preserve"> </w:t>
@@ -1085,7 +1046,7 @@
         <w:pStyle w:val="BlockText"/>
       </w:pPr>
       <w:r>
-        <w:t xml:space="preserve">❌ Machine learning combines data to learn from, statistics to say what a finite sample of data supports, and optimization to find the model that fits the data best.</w:t>
+        <w:t xml:space="preserve">❌ One trap worth naming: the sample excludes people who moved.</w:t>
       </w:r>
     </w:p>
     <w:p>
@@ -1093,7 +1054,154 @@
         <w:pStyle w:val="BlockText"/>
       </w:pPr>
       <w:r>
-        <w:t xml:space="preserve">✅ Machine learning combines three components:</w:t>
+        <w:t xml:space="preserve">✅ The sample excludes people who moved.</w:t>
+      </w:r>
+    </w:p>
+    <w:p>
+      <w:pPr>
+        <w:pStyle w:val="BlockText"/>
+      </w:pPr>
+      <w:r>
+        <w:t xml:space="preserve">❌ The most important point is that the survey was voluntary.</w:t>
+      </w:r>
+    </w:p>
+    <w:p>
+      <w:pPr>
+        <w:pStyle w:val="BlockText"/>
+      </w:pPr>
+      <w:r>
+        <w:t xml:space="preserve">✅ The survey was voluntary.</w:t>
+      </w:r>
+    </w:p>
+    <w:p>
+      <w:pPr>
+        <w:pStyle w:val="BlockText"/>
+      </w:pPr>
+      <w:r>
+        <w:t xml:space="preserve">❌ One documented detail changes how the rest of this section reads:</w:t>
+      </w:r>
+      <w:r>
+        <w:t xml:space="preserve"> </w:t>
+      </w:r>
+      <w:r>
+        <w:t xml:space="preserve">the survey was voluntary.</w:t>
+      </w:r>
+    </w:p>
+    <w:p>
+      <w:pPr>
+        <w:pStyle w:val="BlockText"/>
+      </w:pPr>
+      <w:r>
+        <w:t xml:space="preserve">✅ The survey was voluntary,</w:t>
+      </w:r>
+      <w:r>
+        <w:t xml:space="preserve"> </w:t>
+      </w:r>
+      <w:r>
+        <w:t xml:space="preserve">so the estimates apply only to people who chose to respond.</w:t>
+      </w:r>
+    </w:p>
+    <w:p>
+      <w:pPr>
+        <w:pStyle w:val="FirstParagraph"/>
+      </w:pPr>
+      <w:r>
+        <w:t xml:space="preserve">In the third pair,</w:t>
+      </w:r>
+      <w:r>
+        <w:t xml:space="preserve"> </w:t>
+      </w:r>
+      <w:r>
+        <w:t xml:space="preserve">the rewrite states what the detail changes</w:t>
+      </w:r>
+      <w:r>
+        <w:t xml:space="preserve"> </w:t>
+      </w:r>
+      <w:r>
+        <w:t xml:space="preserve">instead of saying that it changes something.</w:t>
+      </w:r>
+    </w:p>
+    <w:bookmarkEnd w:id="19"/>
+    <w:bookmarkEnd w:id="20"/>
+    <w:bookmarkStart w:id="23" w:name="put-lists-in-bullet-points"/>
+    <w:p>
+      <w:pPr>
+        <w:pStyle w:val="Heading2"/>
+      </w:pPr>
+      <w:r>
+        <w:t xml:space="preserve">6 Put lists in bullet points</w:t>
+      </w:r>
+    </w:p>
+    <w:p>
+      <w:pPr>
+        <w:pStyle w:val="FirstParagraph"/>
+      </w:pPr>
+      <w:r>
+        <w:t xml:space="preserve">A list of three or more phrases,</w:t>
+      </w:r>
+      <w:r>
+        <w:t xml:space="preserve"> </w:t>
+      </w:r>
+      <w:r>
+        <w:t xml:space="preserve">written inline and separated by commas,</w:t>
+      </w:r>
+      <w:r>
+        <w:t xml:space="preserve"> </w:t>
+      </w:r>
+      <w:r>
+        <w:t xml:space="preserve">makes the reader count commas to find where each item ends.</w:t>
+      </w:r>
+      <w:r>
+        <w:t xml:space="preserve"> </w:t>
+      </w:r>
+      <w:r>
+        <w:t xml:space="preserve">Write it as a bullet list instead,</w:t>
+      </w:r>
+      <w:r>
+        <w:t xml:space="preserve"> </w:t>
+      </w:r>
+      <w:r>
+        <w:t xml:space="preserve">introduced by a sentence ending in a colon.</w:t>
+      </w:r>
+      <w:r>
+        <w:t xml:space="preserve"> </w:t>
+      </w:r>
+      <w:r>
+        <w:t xml:space="preserve">Use a numbered list when the items are steps done in order.</w:t>
+      </w:r>
+    </w:p>
+    <w:p>
+      <w:pPr>
+        <w:pStyle w:val="BodyText"/>
+      </w:pPr>
+      <w:r>
+        <w:t xml:space="preserve">Bullet lists matter most on slides,</w:t>
+      </w:r>
+      <w:r>
+        <w:t xml:space="preserve"> </w:t>
+      </w:r>
+      <w:r>
+        <w:t xml:space="preserve">where a reader scans a list rather than reading it as a sentence.</w:t>
+      </w:r>
+      <w:r>
+        <w:t xml:space="preserve"> </w:t>
+      </w:r>
+      <w:r>
+        <w:t xml:space="preserve">The rule is one case of a broader preference for more structure:</w:t>
+      </w:r>
+      <w:r>
+        <w:t xml:space="preserve"> </w:t>
+      </w:r>
+      <w:r>
+        <w:t xml:space="preserve">when content has a shape, show that shape in the markup.</w:t>
+      </w:r>
+    </w:p>
+    <w:p>
+      <w:pPr>
+        <w:pStyle w:val="BodyText"/>
+      </w:pPr>
+      <w:r>
+        <w:t xml:space="preserve">A few mechanics to keep in mind when writing one:</w:t>
       </w:r>
     </w:p>
     <w:p>
@@ -1105,7 +1213,13 @@
         </w:numPr>
       </w:pPr>
       <w:r>
-        <w:t xml:space="preserve">data to learn from;</w:t>
+        <w:t xml:space="preserve">Keep the items grammatically parallel,</w:t>
+      </w:r>
+      <w:r>
+        <w:t xml:space="preserve"> </w:t>
+      </w:r>
+      <w:r>
+        <w:t xml:space="preserve">so each one completes the introducing sentence the same way.</w:t>
       </w:r>
     </w:p>
     <w:p>
@@ -1117,7 +1231,13 @@
         </w:numPr>
       </w:pPr>
       <w:r>
-        <w:t xml:space="preserve">statistics to say what a finite sample of data supports;</w:t>
+        <w:t xml:space="preserve">Leave a blank line before the list;</w:t>
+      </w:r>
+      <w:r>
+        <w:t xml:space="preserve"> </w:t>
+      </w:r>
+      <w:r>
+        <w:t xml:space="preserve">without it, Markdown reads the list as part of the paragraph above.</w:t>
       </w:r>
     </w:p>
     <w:p>
@@ -1129,35 +1249,121 @@
         </w:numPr>
       </w:pPr>
       <w:r>
-        <w:t xml:space="preserve">optimization to find the model that fits the data best.</w:t>
-      </w:r>
-    </w:p>
+        <w:t xml:space="preserve">Keep a short series of single words inline,</w:t>
+      </w:r>
+      <w:r>
+        <w:t xml:space="preserve"> </w:t>
+      </w:r>
+      <w:r>
+        <w:t xml:space="preserve">such as</w:t>
+      </w:r>
+      <w:r>
+        <w:t xml:space="preserve"> </w:t>
+      </w:r>
+      <w:r>
+        <w:t xml:space="preserve">“R, Julia, or Python”</w:t>
+      </w:r>
+      <w:r>
+        <w:t xml:space="preserve">.</w:t>
+      </w:r>
+    </w:p>
+    <w:bookmarkStart w:id="21" w:name="exm-bullet-lists"/>
     <w:p>
       <w:pPr>
         <w:pStyle w:val="FirstParagraph"/>
-      </w:pPr>
-      <w:r>
-        <w:t xml:space="preserve">The revised version puts each component on its own line,</w:t>
-      </w:r>
-      <w:r>
-        <w:t xml:space="preserve"> </w:t>
-      </w:r>
-      <w:r>
-        <w:t xml:space="preserve">so the reader sees at a glance that there are three.</w:t>
-      </w:r>
-    </w:p>
-    <w:bookmarkEnd w:id="18"/>
-    <w:bookmarkStart w:id="19" w:name="exm-numbered-lists"/>
-    <w:p>
-      <w:pPr>
-        <w:pStyle w:val="BodyText"/>
       </w:pPr>
       <w:r>
         <w:rPr>
           <w:b/>
           <w:bCs/>
         </w:rPr>
-        <w:t xml:space="preserve">Example 4 (Turning inline steps into a numbered list)</w:t>
+        <w:t xml:space="preserve">Example 4 (Turning an inline list into bullet points)</w:t>
+      </w:r>
+      <w:r>
+        <w:t xml:space="preserve"> </w:t>
+      </w:r>
+      <w:r>
+        <w:t xml:space="preserve"> </w:t>
+      </w:r>
+    </w:p>
+    <w:p>
+      <w:pPr>
+        <w:pStyle w:val="BlockText"/>
+      </w:pPr>
+      <w:r>
+        <w:t xml:space="preserve">❌ Machine learning combines data to learn from, statistics to say what a finite sample of data supports, and optimization to find the model that fits the data best.</w:t>
+      </w:r>
+    </w:p>
+    <w:p>
+      <w:pPr>
+        <w:pStyle w:val="BlockText"/>
+      </w:pPr>
+      <w:r>
+        <w:t xml:space="preserve">✅ Machine learning combines three components:</w:t>
+      </w:r>
+    </w:p>
+    <w:p>
+      <w:pPr>
+        <w:pStyle w:val="Compact"/>
+        <w:numPr>
+          <w:ilvl w:val="0"/>
+          <w:numId w:val="1009"/>
+        </w:numPr>
+      </w:pPr>
+      <w:r>
+        <w:t xml:space="preserve">data to learn from;</w:t>
+      </w:r>
+    </w:p>
+    <w:p>
+      <w:pPr>
+        <w:pStyle w:val="Compact"/>
+        <w:numPr>
+          <w:ilvl w:val="0"/>
+          <w:numId w:val="1009"/>
+        </w:numPr>
+      </w:pPr>
+      <w:r>
+        <w:t xml:space="preserve">statistics to say what a finite sample of data supports;</w:t>
+      </w:r>
+    </w:p>
+    <w:p>
+      <w:pPr>
+        <w:pStyle w:val="Compact"/>
+        <w:numPr>
+          <w:ilvl w:val="0"/>
+          <w:numId w:val="1009"/>
+        </w:numPr>
+      </w:pPr>
+      <w:r>
+        <w:t xml:space="preserve">optimization to find the model that fits the data best.</w:t>
+      </w:r>
+    </w:p>
+    <w:p>
+      <w:pPr>
+        <w:pStyle w:val="FirstParagraph"/>
+      </w:pPr>
+      <w:r>
+        <w:t xml:space="preserve">The revised version puts each component on its own line,</w:t>
+      </w:r>
+      <w:r>
+        <w:t xml:space="preserve"> </w:t>
+      </w:r>
+      <w:r>
+        <w:t xml:space="preserve">so the reader sees at a glance that there are three.</w:t>
+      </w:r>
+    </w:p>
+    <w:bookmarkEnd w:id="21"/>
+    <w:bookmarkStart w:id="22" w:name="exm-numbered-lists"/>
+    <w:p>
+      <w:pPr>
+        <w:pStyle w:val="BodyText"/>
+      </w:pPr>
+      <w:r>
+        <w:rPr>
+          <w:b/>
+          <w:bCs/>
+        </w:rPr>
+        <w:t xml:space="preserve">Example 5 (Turning inline steps into a numbered list)</w:t>
       </w:r>
       <w:r>
         <w:t xml:space="preserve"> </w:t>
@@ -1221,7 +1427,7 @@
         <w:pStyle w:val="Compact"/>
         <w:numPr>
           <w:ilvl w:val="0"/>
-          <w:numId w:val="1009"/>
+          <w:numId w:val="1010"/>
         </w:numPr>
       </w:pPr>
       <w:r>
@@ -1233,7 +1439,7 @@
         <w:pStyle w:val="Compact"/>
         <w:numPr>
           <w:ilvl w:val="0"/>
-          <w:numId w:val="1009"/>
+          <w:numId w:val="1010"/>
         </w:numPr>
       </w:pPr>
       <w:r>
@@ -1254,15 +1460,15 @@
         <w:t xml:space="preserve">and the loop condition moves into the introducing sentence.</w:t>
       </w:r>
     </w:p>
-    <w:bookmarkEnd w:id="19"/>
-    <w:bookmarkEnd w:id="20"/>
-    <w:bookmarkStart w:id="26" w:name="examples-of-concise-writing"/>
+    <w:bookmarkEnd w:id="22"/>
+    <w:bookmarkEnd w:id="23"/>
+    <w:bookmarkStart w:id="29" w:name="examples-of-concise-writing"/>
     <w:p>
       <w:pPr>
         <w:pStyle w:val="Heading2"/>
       </w:pPr>
       <w:r>
-        <w:t xml:space="preserve">6 Examples of concise writing</w:t>
+        <w:t xml:space="preserve">7 Examples of concise writing</w:t>
       </w:r>
     </w:p>
     <w:p>
@@ -1353,8 +1559,8 @@
         <w:t xml:space="preserve">.</w:t>
       </w:r>
     </w:p>
-    <w:bookmarkStart w:id="25" w:name="refs"/>
-    <w:bookmarkStart w:id="22" w:name="ref-hemingway_style"/>
+    <w:bookmarkStart w:id="28" w:name="refs"/>
+    <w:bookmarkStart w:id="25" w:name="ref-hemingway_style"/>
     <w:p>
       <w:pPr>
         <w:pStyle w:val="Bibliography"/>
@@ -1413,7 +1619,7 @@
       <w:r>
         <w:t xml:space="preserve"> </w:t>
       </w:r>
-      <w:hyperlink r:id="rId21">
+      <w:hyperlink r:id="rId24">
         <w:r>
           <w:rPr>
             <w:rStyle w:val="Hyperlink"/>
@@ -1425,8 +1631,8 @@
         <w:t xml:space="preserve">.</w:t>
       </w:r>
     </w:p>
-    <w:bookmarkEnd w:id="22"/>
-    <w:bookmarkStart w:id="24" w:name="ref-caesar_gallic"/>
+    <w:bookmarkEnd w:id="25"/>
+    <w:bookmarkStart w:id="27" w:name="ref-caesar_gallic"/>
     <w:p>
       <w:pPr>
         <w:pStyle w:val="Bibliography"/>
@@ -1485,7 +1691,7 @@
       <w:r>
         <w:t xml:space="preserve"> </w:t>
       </w:r>
-      <w:hyperlink r:id="rId23">
+      <w:hyperlink r:id="rId26">
         <w:r>
           <w:rPr>
             <w:rStyle w:val="Hyperlink"/>
@@ -1497,9 +1703,9 @@
         <w:t xml:space="preserve">.</w:t>
       </w:r>
     </w:p>
-    <w:bookmarkEnd w:id="24"/>
-    <w:bookmarkEnd w:id="25"/>
-    <w:bookmarkEnd w:id="26"/>
+    <w:bookmarkEnd w:id="27"/>
+    <w:bookmarkEnd w:id="28"/>
+    <w:bookmarkEnd w:id="29"/>
     <w:sectPr>
       <w:footnotePr>
         <w:numRestart w:val="eachSect"/>
@@ -1826,6 +2032,9 @@
     <w:abstractNumId w:val="991"/>
   </w:num>
   <w:num w:numId="1009">
+    <w:abstractNumId w:val="991"/>
+  </w:num>
+  <w:num w:numId="1010">
     <w:abstractNumId w:val="99411"/>
     <w:lvlOverride w:ilvl="0">
       <w:startOverride w:val="1"/>

</xml_diff>

<commit_message>
Deploying to gh-pages from @ Morrison-Lab/psw@f26965299f7a68f5cfe080cc4e5bec8df03772df 🚀
</commit_message>
<xml_diff>
--- a/chapters/conciseness.docx
+++ b/chapters/conciseness.docx
@@ -15,7 +15,7 @@
         <w:pStyle w:val="Date"/>
       </w:pPr>
       <w:r>
-        <w:t xml:space="preserve">Last modified: 2026-10-05 17:40:43 (UTC)</w:t>
+        <w:t xml:space="preserve">Last modified: 2026-10-05 17:44:06 (UTC)</w:t>
       </w:r>
     </w:p>
     <w:tbl>
@@ -708,13 +708,217 @@
     </w:p>
     <w:bookmarkEnd w:id="14"/>
     <w:bookmarkEnd w:id="15"/>
-    <w:bookmarkStart w:id="17" w:name="avoid-double-negatives"/>
+    <w:bookmarkStart w:id="17" w:name="X831e99641ea6e3d916f49fb78be48dc576ff061"/>
     <w:p>
       <w:pPr>
         <w:pStyle w:val="Heading2"/>
       </w:pPr>
       <w:r>
-        <w:t xml:space="preserve">4 Avoid double negatives</w:t>
+        <w:t xml:space="preserve">4 Do not rule out readings no reader would make</w:t>
+      </w:r>
+    </w:p>
+    <w:p>
+      <w:pPr>
+        <w:pStyle w:val="FirstParagraph"/>
+      </w:pPr>
+      <w:r>
+        <w:t xml:space="preserve">A definition says what a term means.</w:t>
+      </w:r>
+      <w:r>
+        <w:t xml:space="preserve"> </w:t>
+      </w:r>
+      <w:r>
+        <w:t xml:space="preserve">It does not need to list the things the term does not mean,</w:t>
+      </w:r>
+      <w:r>
+        <w:t xml:space="preserve"> </w:t>
+      </w:r>
+      <w:r>
+        <w:t xml:space="preserve">unless a reader is likely to confuse the two.</w:t>
+      </w:r>
+      <w:r>
+        <w:t xml:space="preserve"> </w:t>
+      </w:r>
+      <w:r>
+        <w:t xml:space="preserve">A disclaimer against a reading nobody would make</w:t>
+      </w:r>
+      <w:r>
+        <w:t xml:space="preserve"> </w:t>
+      </w:r>
+      <w:r>
+        <w:t xml:space="preserve">costs the reader a sentence</w:t>
+      </w:r>
+      <w:r>
+        <w:t xml:space="preserve"> </w:t>
+      </w:r>
+      <w:r>
+        <w:t xml:space="preserve">and can plant the confusion it was meant to prevent.</w:t>
+      </w:r>
+    </w:p>
+    <w:bookmarkStart w:id="16" w:name="exm-gratuitous-disclaimer"/>
+    <w:p>
+      <w:pPr>
+        <w:pStyle w:val="BodyText"/>
+      </w:pPr>
+      <w:r>
+        <w:rPr>
+          <w:b/>
+          <w:bCs/>
+        </w:rPr>
+        <w:t xml:space="preserve">Example 2 (Dropping a needless disclaimer)</w:t>
+      </w:r>
+      <w:r>
+        <w:t xml:space="preserve"> </w:t>
+      </w:r>
+      <w:r>
+        <w:t xml:space="preserve"> </w:t>
+      </w:r>
+    </w:p>
+    <w:p>
+      <w:pPr>
+        <w:pStyle w:val="BlockText"/>
+      </w:pPr>
+      <w:r>
+        <w:t xml:space="preserve">❌ In this manuscript, TTE means target trial emulation.</w:t>
+      </w:r>
+      <w:r>
+        <w:t xml:space="preserve"> </w:t>
+      </w:r>
+      <w:r>
+        <w:t xml:space="preserve">It does not mean effect of treatment on the treated.</w:t>
+      </w:r>
+    </w:p>
+    <w:p>
+      <w:pPr>
+        <w:pStyle w:val="BlockText"/>
+      </w:pPr>
+      <w:r>
+        <w:t xml:space="preserve">✅ In this manuscript, TTE means target trial emulation.</w:t>
+      </w:r>
+    </w:p>
+    <w:p>
+      <w:pPr>
+        <w:pStyle w:val="FirstParagraph"/>
+      </w:pPr>
+      <w:r>
+        <w:t xml:space="preserve">In causal inference,</w:t>
+      </w:r>
+      <w:r>
+        <w:t xml:space="preserve"> </w:t>
+      </w:r>
+      <w:r>
+        <w:t xml:space="preserve">the average effect of treatment on the treated is usually abbreviated ATT,</w:t>
+      </w:r>
+      <w:r>
+        <w:t xml:space="preserve"> </w:t>
+      </w:r>
+      <w:r>
+        <w:t xml:space="preserve">so a reader is unlikely to read</w:t>
+      </w:r>
+      <w:r>
+        <w:t xml:space="preserve"> </w:t>
+      </w:r>
+      <w:r>
+        <w:t xml:space="preserve">“TTE”</w:t>
+      </w:r>
+      <w:r>
+        <w:t xml:space="preserve"> </w:t>
+      </w:r>
+      <w:r>
+        <w:t xml:space="preserve">that way.</w:t>
+      </w:r>
+      <w:r>
+        <w:t xml:space="preserve"> </w:t>
+      </w:r>
+      <w:r>
+        <w:t xml:space="preserve">The second sentence introduces a meaning</w:t>
+      </w:r>
+      <w:r>
+        <w:t xml:space="preserve"> </w:t>
+      </w:r>
+      <w:r>
+        <w:t xml:space="preserve">that the reader would not otherwise have considered.</w:t>
+      </w:r>
+    </w:p>
+    <w:bookmarkEnd w:id="16"/>
+    <w:p>
+      <w:pPr>
+        <w:pStyle w:val="BodyText"/>
+      </w:pPr>
+      <w:r>
+        <w:t xml:space="preserve">Keep a disclaimer when the confusion is real.</w:t>
+      </w:r>
+      <w:r>
+        <w:t xml:space="preserve"> </w:t>
+      </w:r>
+      <w:r>
+        <w:t xml:space="preserve">For example, if</w:t>
+      </w:r>
+      <w:r>
+        <w:t xml:space="preserve"> </w:t>
+      </w:r>
+      <w:r>
+        <w:t xml:space="preserve">“CI”</w:t>
+      </w:r>
+      <w:r>
+        <w:t xml:space="preserve"> </w:t>
+      </w:r>
+      <w:r>
+        <w:t xml:space="preserve">could mean confidence interval or cumulative incidence</w:t>
+      </w:r>
+      <w:r>
+        <w:t xml:space="preserve"> </w:t>
+      </w:r>
+      <w:r>
+        <w:t xml:space="preserve">in the same paper,</w:t>
+      </w:r>
+      <w:r>
+        <w:t xml:space="preserve"> </w:t>
+      </w:r>
+      <w:r>
+        <w:t xml:space="preserve">say which one you mean each time.</w:t>
+      </w:r>
+    </w:p>
+    <w:p>
+      <w:pPr>
+        <w:pStyle w:val="BodyText"/>
+      </w:pPr>
+      <w:r>
+        <w:t xml:space="preserve">The same test applies to explanations:</w:t>
+      </w:r>
+      <w:r>
+        <w:t xml:space="preserve"> </w:t>
+      </w:r>
+      <w:r>
+        <w:t xml:space="preserve">explain what your intended readers do not already know,</w:t>
+      </w:r>
+      <w:r>
+        <w:t xml:space="preserve"> </w:t>
+      </w:r>
+      <w:r>
+        <w:t xml:space="preserve">and leave out what they do.</w:t>
+      </w:r>
+      <w:r>
+        <w:t xml:space="preserve"> </w:t>
+      </w:r>
+      <w:r>
+        <w:t xml:space="preserve">A methods section for statisticians does not need to define a p-value;</w:t>
+      </w:r>
+      <w:r>
+        <w:t xml:space="preserve"> </w:t>
+      </w:r>
+      <w:r>
+        <w:t xml:space="preserve">a report for clinicians might.</w:t>
+      </w:r>
+    </w:p>
+    <w:bookmarkEnd w:id="17"/>
+    <w:bookmarkStart w:id="19" w:name="avoid-double-negatives"/>
+    <w:p>
+      <w:pPr>
+        <w:pStyle w:val="Heading2"/>
+      </w:pPr>
+      <w:r>
+        <w:t xml:space="preserve">5 Avoid double negatives</w:t>
       </w:r>
     </w:p>
     <w:p>
@@ -825,7 +1029,7 @@
         <w:t xml:space="preserve">and it is the standard wording for a test result.</w:t>
       </w:r>
     </w:p>
-    <w:bookmarkStart w:id="16" w:name="exm-double-negative"/>
+    <w:bookmarkStart w:id="18" w:name="exm-double-negative"/>
     <w:p>
       <w:pPr>
         <w:pStyle w:val="BodyText"/>
@@ -835,7 +1039,7 @@
           <w:b/>
           <w:bCs/>
         </w:rPr>
-        <w:t xml:space="preserve">Example 2 (Stating a claim directly)</w:t>
+        <w:t xml:space="preserve">Example 3 (Stating a claim directly)</w:t>
       </w:r>
       <w:r>
         <w:t xml:space="preserve"> </w:t>
@@ -915,15 +1119,15 @@
         <w:t xml:space="preserve">Choose the one you mean.</w:t>
       </w:r>
     </w:p>
-    <w:bookmarkEnd w:id="16"/>
-    <w:bookmarkEnd w:id="17"/>
-    <w:bookmarkStart w:id="20" w:name="Xa757197b9b942a803dc05820332a104a8aaeee4"/>
+    <w:bookmarkEnd w:id="18"/>
+    <w:bookmarkEnd w:id="19"/>
+    <w:bookmarkStart w:id="22" w:name="Xa757197b9b942a803dc05820332a104a8aaeee4"/>
     <w:p>
       <w:pPr>
         <w:pStyle w:val="Heading2"/>
       </w:pPr>
       <w:r>
-        <w:t xml:space="preserve">5 Write about the subject, not about the text</w:t>
+        <w:t xml:space="preserve">6 Write about the subject, not about the text</w:t>
       </w:r>
     </w:p>
     <w:p>
@@ -998,7 +1202,7 @@
       <w:r>
         <w:t xml:space="preserve"> </w:t>
       </w:r>
-      <w:hyperlink r:id="rId18">
+      <w:hyperlink r:id="rId20">
         <w:r>
           <w:rPr>
             <w:rStyle w:val="Hyperlink"/>
@@ -1022,7 +1226,7 @@
         <w:t xml:space="preserve">.</w:t>
       </w:r>
     </w:p>
-    <w:bookmarkStart w:id="19" w:name="exm-self-referential"/>
+    <w:bookmarkStart w:id="21" w:name="exm-self-referential"/>
     <w:p>
       <w:pPr>
         <w:pStyle w:val="BodyText"/>
@@ -1032,7 +1236,7 @@
           <w:b/>
           <w:bCs/>
         </w:rPr>
-        <w:t xml:space="preserve">Example 3 (Replacing a sentence about the text)</w:t>
+        <w:t xml:space="preserve">Example 4 (Replacing a sentence about the text)</w:t>
       </w:r>
       <w:r>
         <w:t xml:space="preserve"> </w:t>
@@ -1121,15 +1325,15 @@
         <w:t xml:space="preserve">instead of saying that it changes something.</w:t>
       </w:r>
     </w:p>
-    <w:bookmarkEnd w:id="19"/>
-    <w:bookmarkEnd w:id="20"/>
-    <w:bookmarkStart w:id="23" w:name="put-lists-in-bullet-points"/>
+    <w:bookmarkEnd w:id="21"/>
+    <w:bookmarkEnd w:id="22"/>
+    <w:bookmarkStart w:id="25" w:name="put-lists-in-bullet-points"/>
     <w:p>
       <w:pPr>
         <w:pStyle w:val="Heading2"/>
       </w:pPr>
       <w:r>
-        <w:t xml:space="preserve">6 Put lists in bullet points</w:t>
+        <w:t xml:space="preserve">7 Put lists in bullet points</w:t>
       </w:r>
     </w:p>
     <w:p>
@@ -1267,7 +1471,7 @@
         <w:t xml:space="preserve">.</w:t>
       </w:r>
     </w:p>
-    <w:bookmarkStart w:id="21" w:name="exm-bullet-lists"/>
+    <w:bookmarkStart w:id="23" w:name="exm-bullet-lists"/>
     <w:p>
       <w:pPr>
         <w:pStyle w:val="FirstParagraph"/>
@@ -1277,7 +1481,7 @@
           <w:b/>
           <w:bCs/>
         </w:rPr>
-        <w:t xml:space="preserve">Example 4 (Turning an inline list into bullet points)</w:t>
+        <w:t xml:space="preserve">Example 5 (Turning an inline list into bullet points)</w:t>
       </w:r>
       <w:r>
         <w:t xml:space="preserve"> </w:t>
@@ -1352,8 +1556,8 @@
         <w:t xml:space="preserve">so the reader sees at a glance that there are three.</w:t>
       </w:r>
     </w:p>
-    <w:bookmarkEnd w:id="21"/>
-    <w:bookmarkStart w:id="22" w:name="exm-numbered-lists"/>
+    <w:bookmarkEnd w:id="23"/>
+    <w:bookmarkStart w:id="24" w:name="exm-numbered-lists"/>
     <w:p>
       <w:pPr>
         <w:pStyle w:val="BodyText"/>
@@ -1363,7 +1567,7 @@
           <w:b/>
           <w:bCs/>
         </w:rPr>
-        <w:t xml:space="preserve">Example 5 (Turning inline steps into a numbered list)</w:t>
+        <w:t xml:space="preserve">Example 6 (Turning inline steps into a numbered list)</w:t>
       </w:r>
       <w:r>
         <w:t xml:space="preserve"> </w:t>
@@ -1460,15 +1664,15 @@
         <w:t xml:space="preserve">and the loop condition moves into the introducing sentence.</w:t>
       </w:r>
     </w:p>
-    <w:bookmarkEnd w:id="22"/>
-    <w:bookmarkEnd w:id="23"/>
-    <w:bookmarkStart w:id="29" w:name="examples-of-concise-writing"/>
+    <w:bookmarkEnd w:id="24"/>
+    <w:bookmarkEnd w:id="25"/>
+    <w:bookmarkStart w:id="31" w:name="examples-of-concise-writing"/>
     <w:p>
       <w:pPr>
         <w:pStyle w:val="Heading2"/>
       </w:pPr>
       <w:r>
-        <w:t xml:space="preserve">7 Examples of concise writing</w:t>
+        <w:t xml:space="preserve">8 Examples of concise writing</w:t>
       </w:r>
     </w:p>
     <w:p>
@@ -1559,8 +1763,8 @@
         <w:t xml:space="preserve">.</w:t>
       </w:r>
     </w:p>
-    <w:bookmarkStart w:id="28" w:name="refs"/>
-    <w:bookmarkStart w:id="25" w:name="ref-hemingway_style"/>
+    <w:bookmarkStart w:id="30" w:name="refs"/>
+    <w:bookmarkStart w:id="27" w:name="ref-hemingway_style"/>
     <w:p>
       <w:pPr>
         <w:pStyle w:val="Bibliography"/>
@@ -1619,7 +1823,7 @@
       <w:r>
         <w:t xml:space="preserve"> </w:t>
       </w:r>
-      <w:hyperlink r:id="rId24">
+      <w:hyperlink r:id="rId26">
         <w:r>
           <w:rPr>
             <w:rStyle w:val="Hyperlink"/>
@@ -1631,8 +1835,8 @@
         <w:t xml:space="preserve">.</w:t>
       </w:r>
     </w:p>
-    <w:bookmarkEnd w:id="25"/>
-    <w:bookmarkStart w:id="27" w:name="ref-caesar_gallic"/>
+    <w:bookmarkEnd w:id="27"/>
+    <w:bookmarkStart w:id="29" w:name="ref-caesar_gallic"/>
     <w:p>
       <w:pPr>
         <w:pStyle w:val="Bibliography"/>
@@ -1691,7 +1895,7 @@
       <w:r>
         <w:t xml:space="preserve"> </w:t>
       </w:r>
-      <w:hyperlink r:id="rId26">
+      <w:hyperlink r:id="rId28">
         <w:r>
           <w:rPr>
             <w:rStyle w:val="Hyperlink"/>
@@ -1703,9 +1907,9 @@
         <w:t xml:space="preserve">.</w:t>
       </w:r>
     </w:p>
-    <w:bookmarkEnd w:id="27"/>
-    <w:bookmarkEnd w:id="28"/>
     <w:bookmarkEnd w:id="29"/>
+    <w:bookmarkEnd w:id="30"/>
+    <w:bookmarkEnd w:id="31"/>
     <w:sectPr>
       <w:footnotePr>
         <w:numRestart w:val="eachSect"/>

</xml_diff>

<commit_message>
Deploying to gh-pages from @ Morrison-Lab/psw@e521bfabf59ab4759d789f162dc2aa70c2f61a0c 🚀
</commit_message>
<xml_diff>
--- a/chapters/conciseness.docx
+++ b/chapters/conciseness.docx
@@ -15,7 +15,7 @@
         <w:pStyle w:val="Date"/>
       </w:pPr>
       <w:r>
-        <w:t xml:space="preserve">Last modified: 2026-10-05 18:34:36 (UTC)</w:t>
+        <w:t xml:space="preserve">Last modified: 2026-10-05 18:41:41 (UTC)</w:t>
       </w:r>
     </w:p>
     <w:tbl>
@@ -504,7 +504,7 @@
         <w:pStyle w:val="FirstParagraph"/>
       </w:pPr>
       <w:r>
-        <w:t xml:space="preserve">Start a sentence with its subject, not a dependent clause.</w:t>
+        <w:t xml:space="preserve">Start a sentence with its subject, not a dependent clause or a fronted phrase.</w:t>
       </w:r>
       <w:r>
         <w:t xml:space="preserve"> </w:t>
@@ -533,6 +533,92 @@
       </w:pPr>
       <w:r>
         <w:t xml:space="preserve">✅ The estimate becomes more precise as the sample size grows.</w:t>
+      </w:r>
+    </w:p>
+    <w:p>
+      <w:pPr>
+        <w:pStyle w:val="FirstParagraph"/>
+      </w:pPr>
+      <w:r>
+        <w:t xml:space="preserve">A fronted phrase delays the subject in the same way.</w:t>
+      </w:r>
+      <w:r>
+        <w:t xml:space="preserve"> </w:t>
+      </w:r>
+      <w:r>
+        <w:t xml:space="preserve">Move a phrase such as</w:t>
+      </w:r>
+      <w:r>
+        <w:t xml:space="preserve"> </w:t>
+      </w:r>
+      <w:r>
+        <w:t xml:space="preserve">“in technical writing”</w:t>
+      </w:r>
+      <w:r>
+        <w:t xml:space="preserve"> </w:t>
+      </w:r>
+      <w:r>
+        <w:t xml:space="preserve">or</w:t>
+      </w:r>
+      <w:r>
+        <w:t xml:space="preserve"> </w:t>
+      </w:r>
+      <w:r>
+        <w:t xml:space="preserve">“in this study”</w:t>
+      </w:r>
+      <w:r>
+        <w:t xml:space="preserve"> </w:t>
+      </w:r>
+      <w:r>
+        <w:t xml:space="preserve">after the noun it limits,</w:t>
+      </w:r>
+      <w:r>
+        <w:t xml:space="preserve"> </w:t>
+      </w:r>
+      <w:r>
+        <w:t xml:space="preserve">unless it sets a scope that the whole paragraph depends on.</w:t>
+      </w:r>
+    </w:p>
+    <w:p>
+      <w:pPr>
+        <w:pStyle w:val="BlockText"/>
+      </w:pPr>
+      <w:r>
+        <w:t xml:space="preserve">❌ In technical writing, a common cause of garden-path sentences is a missing</w:t>
+      </w:r>
+      <w:r>
+        <w:t xml:space="preserve"> </w:t>
+      </w:r>
+      <w:r>
+        <w:rPr>
+          <w:i/>
+          <w:iCs/>
+        </w:rPr>
+        <w:t xml:space="preserve">that</w:t>
+      </w:r>
+      <w:r>
+        <w:t xml:space="preserve">.</w:t>
+      </w:r>
+    </w:p>
+    <w:p>
+      <w:pPr>
+        <w:pStyle w:val="BlockText"/>
+      </w:pPr>
+      <w:r>
+        <w:t xml:space="preserve">✅ A common cause of garden-path sentences in technical writing is a missing</w:t>
+      </w:r>
+      <w:r>
+        <w:t xml:space="preserve"> </w:t>
+      </w:r>
+      <w:r>
+        <w:rPr>
+          <w:i/>
+          <w:iCs/>
+        </w:rPr>
+        <w:t xml:space="preserve">that</w:t>
+      </w:r>
+      <w:r>
+        <w:t xml:space="preserve">.</w:t>
       </w:r>
     </w:p>
     <w:bookmarkEnd w:id="13"/>

</xml_diff>

<commit_message>
Deploying to gh-pages from @ Morrison-Lab/psw@95fe214c3982beaa1013ec49c27ff98a7796a8ac 🚀
</commit_message>
<xml_diff>
--- a/chapters/conciseness.docx
+++ b/chapters/conciseness.docx
@@ -15,7 +15,7 @@
         <w:pStyle w:val="Date"/>
       </w:pPr>
       <w:r>
-        <w:t xml:space="preserve">Last modified: 2026-10-08 22:20:34 (PDT)</w:t>
+        <w:t xml:space="preserve">Last modified: 2026-10-08 22:24:07 (PDT)</w:t>
       </w:r>
     </w:p>
     <w:tbl>
@@ -1413,7 +1413,7 @@
     </w:p>
     <w:bookmarkEnd w:id="21"/>
     <w:bookmarkEnd w:id="22"/>
-    <w:bookmarkStart w:id="25" w:name="put-lists-in-bullet-points"/>
+    <w:bookmarkStart w:id="29" w:name="put-lists-in-bullet-points"/>
     <w:p>
       <w:pPr>
         <w:pStyle w:val="Heading2"/>
@@ -1458,6 +1458,56 @@
       </w:r>
       <w:r>
         <w:t xml:space="preserve">Use a numbered list when the items are steps done in order.</w:t>
+      </w:r>
+    </w:p>
+    <w:p>
+      <w:pPr>
+        <w:pStyle w:val="BodyText"/>
+      </w:pPr>
+      <w:r>
+        <w:t xml:space="preserve">A run of parallel sentences is a list too,</w:t>
+      </w:r>
+      <w:r>
+        <w:t xml:space="preserve"> </w:t>
+      </w:r>
+      <w:r>
+        <w:t xml:space="preserve">even with only two items.</w:t>
+      </w:r>
+      <w:r>
+        <w:t xml:space="preserve"> </w:t>
+      </w:r>
+      <w:r>
+        <w:t xml:space="preserve">The common case is a set of resources,</w:t>
+      </w:r>
+      <w:r>
+        <w:t xml:space="preserve"> </w:t>
+      </w:r>
+      <w:r>
+        <w:t xml:space="preserve">such as videos or readings,</w:t>
+      </w:r>
+      <w:r>
+        <w:t xml:space="preserve"> </w:t>
+      </w:r>
+      <w:r>
+        <w:t xml:space="preserve">where each sentence names one resource and links to it.</w:t>
+      </w:r>
+      <w:r>
+        <w:t xml:space="preserve"> </w:t>
+      </w:r>
+      <w:r>
+        <w:t xml:space="preserve">Put each sentence in its own bullet,</w:t>
+      </w:r>
+      <w:r>
+        <w:t xml:space="preserve"> </w:t>
+      </w:r>
+      <w:r>
+        <w:t xml:space="preserve">so the reader sees how many resources there are</w:t>
+      </w:r>
+      <w:r>
+        <w:t xml:space="preserve"> </w:t>
+      </w:r>
+      <w:r>
+        <w:t xml:space="preserve">and where each one starts.</w:t>
       </w:r>
     </w:p>
     <w:p>
@@ -1643,7 +1693,7 @@
       </w:r>
     </w:p>
     <w:bookmarkEnd w:id="23"/>
-    <w:bookmarkStart w:id="24" w:name="exm-numbered-lists"/>
+    <w:bookmarkStart w:id="27" w:name="exm-resource-lists"/>
     <w:p>
       <w:pPr>
         <w:pStyle w:val="BodyText"/>
@@ -1653,7 +1703,157 @@
           <w:b/>
           <w:bCs/>
         </w:rPr>
-        <w:t xml:space="preserve">Example 6 (Turning inline steps into a numbered list)</w:t>
+        <w:t xml:space="preserve">Example 6 (Turning a run of resource sentences into bullet points)</w:t>
+      </w:r>
+      <w:r>
+        <w:t xml:space="preserve"> </w:t>
+      </w:r>
+      <w:r>
+        <w:t xml:space="preserve"> </w:t>
+      </w:r>
+    </w:p>
+    <w:p>
+      <w:pPr>
+        <w:pStyle w:val="BlockText"/>
+      </w:pPr>
+      <w:r>
+        <w:t xml:space="preserve">❌ Hastie and Tibshirani</w:t>
+      </w:r>
+      <w:r>
+        <w:t xml:space="preserve"> </w:t>
+      </w:r>
+      <w:hyperlink r:id="rId24">
+        <w:r>
+          <w:rPr>
+            <w:rStyle w:val="Hyperlink"/>
+          </w:rPr>
+          <w:t xml:space="preserve">extend least squares to several predictors</w:t>
+        </w:r>
+      </w:hyperlink>
+      <w:r>
+        <w:t xml:space="preserve">. Starmer explains</w:t>
+      </w:r>
+      <w:r>
+        <w:t xml:space="preserve"> </w:t>
+      </w:r>
+      <w:hyperlink r:id="rId25">
+        <w:r>
+          <w:rPr>
+            <w:rStyle w:val="Hyperlink"/>
+          </w:rPr>
+          <w:t xml:space="preserve">multiple regression</w:t>
+        </w:r>
+      </w:hyperlink>
+      <w:r>
+        <w:t xml:space="preserve">.</w:t>
+      </w:r>
+    </w:p>
+    <w:p>
+      <w:pPr>
+        <w:pStyle w:val="BlockText"/>
+      </w:pPr>
+      <w:r>
+        <w:t xml:space="preserve">✅ Videos:</w:t>
+      </w:r>
+    </w:p>
+    <w:p>
+      <w:pPr>
+        <w:pStyle w:val="Compact"/>
+        <w:numPr>
+          <w:ilvl w:val="0"/>
+          <w:numId w:val="1010"/>
+        </w:numPr>
+      </w:pPr>
+      <w:r>
+        <w:t xml:space="preserve">Hastie and Tibshirani</w:t>
+      </w:r>
+      <w:r>
+        <w:t xml:space="preserve"> </w:t>
+      </w:r>
+      <w:hyperlink r:id="rId24">
+        <w:r>
+          <w:rPr>
+            <w:rStyle w:val="Hyperlink"/>
+          </w:rPr>
+          <w:t xml:space="preserve">extend least squares to several predictors</w:t>
+        </w:r>
+      </w:hyperlink>
+      <w:r>
+        <w:t xml:space="preserve">.</w:t>
+      </w:r>
+    </w:p>
+    <w:p>
+      <w:pPr>
+        <w:pStyle w:val="Compact"/>
+        <w:numPr>
+          <w:ilvl w:val="0"/>
+          <w:numId w:val="1010"/>
+        </w:numPr>
+      </w:pPr>
+      <w:r>
+        <w:t xml:space="preserve">Starmer explains</w:t>
+      </w:r>
+      <w:r>
+        <w:t xml:space="preserve"> </w:t>
+      </w:r>
+      <w:hyperlink r:id="rId25">
+        <w:r>
+          <w:rPr>
+            <w:rStyle w:val="Hyperlink"/>
+          </w:rPr>
+          <w:t xml:space="preserve">multiple regression</w:t>
+        </w:r>
+      </w:hyperlink>
+      <w:r>
+        <w:t xml:space="preserve">.</w:t>
+      </w:r>
+    </w:p>
+    <w:p>
+      <w:pPr>
+        <w:pStyle w:val="FirstParagraph"/>
+      </w:pPr>
+      <w:r>
+        <w:t xml:space="preserve">This example is adapted from video notes in the DATA 571 chapter on</w:t>
+      </w:r>
+      <w:r>
+        <w:t xml:space="preserve"> </w:t>
+      </w:r>
+      <w:hyperlink r:id="rId26">
+        <w:r>
+          <w:rPr>
+            <w:rStyle w:val="Hyperlink"/>
+          </w:rPr>
+          <w:t xml:space="preserve">linear regression</w:t>
+        </w:r>
+      </w:hyperlink>
+      <w:r>
+        <w:t xml:space="preserve">.</w:t>
+      </w:r>
+      <w:r>
+        <w:t xml:space="preserve"> </w:t>
+      </w:r>
+      <w:r>
+        <w:t xml:space="preserve">Each bullet holds one video,</w:t>
+      </w:r>
+      <w:r>
+        <w:t xml:space="preserve"> </w:t>
+      </w:r>
+      <w:r>
+        <w:t xml:space="preserve">so the reader can pick one without parsing the paragraph.</w:t>
+      </w:r>
+    </w:p>
+    <w:bookmarkEnd w:id="27"/>
+    <w:bookmarkStart w:id="28" w:name="exm-numbered-lists"/>
+    <w:p>
+      <w:pPr>
+        <w:pStyle w:val="BodyText"/>
+      </w:pPr>
+      <w:r>
+        <w:rPr>
+          <w:b/>
+          <w:bCs/>
+        </w:rPr>
+        <w:t xml:space="preserve">Example 7 (Turning inline steps into a numbered list)</w:t>
       </w:r>
       <w:r>
         <w:t xml:space="preserve"> </w:t>
@@ -1717,7 +1917,7 @@
         <w:pStyle w:val="Compact"/>
         <w:numPr>
           <w:ilvl w:val="0"/>
-          <w:numId w:val="1010"/>
+          <w:numId w:val="1011"/>
         </w:numPr>
       </w:pPr>
       <w:r>
@@ -1729,7 +1929,7 @@
         <w:pStyle w:val="Compact"/>
         <w:numPr>
           <w:ilvl w:val="0"/>
-          <w:numId w:val="1010"/>
+          <w:numId w:val="1011"/>
         </w:numPr>
       </w:pPr>
       <w:r>
@@ -1750,9 +1950,9 @@
         <w:t xml:space="preserve">and the loop condition moves into the introducing sentence.</w:t>
       </w:r>
     </w:p>
-    <w:bookmarkEnd w:id="24"/>
-    <w:bookmarkEnd w:id="25"/>
-    <w:bookmarkStart w:id="31" w:name="examples-of-concise-writing"/>
+    <w:bookmarkEnd w:id="28"/>
+    <w:bookmarkEnd w:id="29"/>
+    <w:bookmarkStart w:id="35" w:name="examples-of-concise-writing"/>
     <w:p>
       <w:pPr>
         <w:pStyle w:val="Heading2"/>
@@ -1849,8 +2049,8 @@
         <w:t xml:space="preserve">.</w:t>
       </w:r>
     </w:p>
-    <w:bookmarkStart w:id="30" w:name="refs"/>
-    <w:bookmarkStart w:id="27" w:name="ref-hemingway_style"/>
+    <w:bookmarkStart w:id="34" w:name="refs"/>
+    <w:bookmarkStart w:id="31" w:name="ref-hemingway_style"/>
     <w:p>
       <w:pPr>
         <w:pStyle w:val="Bibliography"/>
@@ -1909,7 +2109,7 @@
       <w:r>
         <w:t xml:space="preserve"> </w:t>
       </w:r>
-      <w:hyperlink r:id="rId26">
+      <w:hyperlink r:id="rId30">
         <w:r>
           <w:rPr>
             <w:rStyle w:val="Hyperlink"/>
@@ -1921,8 +2121,8 @@
         <w:t xml:space="preserve">.</w:t>
       </w:r>
     </w:p>
-    <w:bookmarkEnd w:id="27"/>
-    <w:bookmarkStart w:id="29" w:name="ref-caesar_gallic"/>
+    <w:bookmarkEnd w:id="31"/>
+    <w:bookmarkStart w:id="33" w:name="ref-caesar_gallic"/>
     <w:p>
       <w:pPr>
         <w:pStyle w:val="Bibliography"/>
@@ -1981,7 +2181,7 @@
       <w:r>
         <w:t xml:space="preserve"> </w:t>
       </w:r>
-      <w:hyperlink r:id="rId28">
+      <w:hyperlink r:id="rId32">
         <w:r>
           <w:rPr>
             <w:rStyle w:val="Hyperlink"/>
@@ -1993,9 +2193,9 @@
         <w:t xml:space="preserve">.</w:t>
       </w:r>
     </w:p>
-    <w:bookmarkEnd w:id="29"/>
-    <w:bookmarkEnd w:id="30"/>
-    <w:bookmarkEnd w:id="31"/>
+    <w:bookmarkEnd w:id="33"/>
+    <w:bookmarkEnd w:id="34"/>
+    <w:bookmarkEnd w:id="35"/>
     <w:sectPr>
       <w:footnotePr>
         <w:numRestart w:val="eachSect"/>
@@ -2325,6 +2525,9 @@
     <w:abstractNumId w:val="991"/>
   </w:num>
   <w:num w:numId="1010">
+    <w:abstractNumId w:val="991"/>
+  </w:num>
+  <w:num w:numId="1011">
     <w:abstractNumId w:val="99411"/>
     <w:lvlOverride w:ilvl="0">
       <w:startOverride w:val="1"/>

</xml_diff>

<commit_message>
Deploying to gh-pages from @ Morrison-Lab/psw@2d1cb2aa4bfee3bbcac1bb439e94c172601d4138 🚀
</commit_message>
<xml_diff>
--- a/chapters/conciseness.docx
+++ b/chapters/conciseness.docx
@@ -15,7 +15,7 @@
         <w:pStyle w:val="Date"/>
       </w:pPr>
       <w:r>
-        <w:t xml:space="preserve">Last modified: 2026-10-13 16:39:58 (PDT)</w:t>
+        <w:t xml:space="preserve">Last modified: 2026-10-13 17:50:10 (PDT)</w:t>
       </w:r>
     </w:p>
     <w:tbl>
@@ -316,7 +316,21 @@
         </w:numPr>
       </w:pPr>
       <w:r>
-        <w:t xml:space="preserve">Use active voice instead of passive where appropriate</w:t>
+        <w:t xml:space="preserve">Use the active voice (see</w:t>
+      </w:r>
+      <w:r>
+        <w:t xml:space="preserve"> </w:t>
+      </w:r>
+      <w:hyperlink w:anchor="write-in-the-active-voice">
+        <w:r>
+          <w:rPr>
+            <w:rStyle w:val="Hyperlink"/>
+          </w:rPr>
+          <w:t xml:space="preserve">Write in the active voice</w:t>
+        </w:r>
+      </w:hyperlink>
+      <w:r>
+        <w:t xml:space="preserve">)</w:t>
       </w:r>
     </w:p>
     <w:p>
@@ -490,13 +504,255 @@
       </w:r>
     </w:p>
     <w:bookmarkEnd w:id="12"/>
-    <w:bookmarkStart w:id="13" w:name="lead-with-the-subject"/>
+    <w:bookmarkStart w:id="14" w:name="write-in-the-active-voice"/>
     <w:p>
       <w:pPr>
         <w:pStyle w:val="Heading2"/>
       </w:pPr>
       <w:r>
-        <w:t xml:space="preserve">2 Lead with the subject</w:t>
+        <w:t xml:space="preserve">2 Write in the active voice</w:t>
+      </w:r>
+    </w:p>
+    <w:p>
+      <w:pPr>
+        <w:pStyle w:val="FirstParagraph"/>
+      </w:pPr>
+      <w:r>
+        <w:t xml:space="preserve">Use the</w:t>
+      </w:r>
+      <w:r>
+        <w:t xml:space="preserve"> </w:t>
+      </w:r>
+      <w:hyperlink r:id="rId13">
+        <w:r>
+          <w:rPr>
+            <w:rStyle w:val="Hyperlink"/>
+          </w:rPr>
+          <w:t xml:space="preserve">active voice</w:t>
+        </w:r>
+      </w:hyperlink>
+      <w:r>
+        <w:t xml:space="preserve"> </w:t>
+      </w:r>
+      <w:r>
+        <w:t xml:space="preserve">unless you have a specific reason to use the passive.</w:t>
+      </w:r>
+      <w:r>
+        <w:t xml:space="preserve"> </w:t>
+      </w:r>
+      <w:r>
+        <w:t xml:space="preserve">An active sentence names who did what, and it is usually shorter.</w:t>
+      </w:r>
+      <w:r>
+        <w:t xml:space="preserve"> </w:t>
+      </w:r>
+      <w:r>
+        <w:t xml:space="preserve">A passive sentence can hide the actor, and the reader then has to guess who made the choice.</w:t>
+      </w:r>
+    </w:p>
+    <w:p>
+      <w:pPr>
+        <w:pStyle w:val="BodyText"/>
+      </w:pPr>
+      <w:r>
+        <w:t xml:space="preserve">Choose the actor by who did the work:</w:t>
+      </w:r>
+    </w:p>
+    <w:p>
+      <w:pPr>
+        <w:pStyle w:val="Compact"/>
+        <w:numPr>
+          <w:ilvl w:val="0"/>
+          <w:numId w:val="1006"/>
+        </w:numPr>
+      </w:pPr>
+      <w:r>
+        <w:t xml:space="preserve">Use</w:t>
+      </w:r>
+      <w:r>
+        <w:t xml:space="preserve"> </w:t>
+      </w:r>
+      <w:r>
+        <w:t xml:space="preserve">“I”</w:t>
+      </w:r>
+      <w:r>
+        <w:t xml:space="preserve"> </w:t>
+      </w:r>
+      <w:r>
+        <w:t xml:space="preserve">for what the author did, such as a choice the author made or a step in the author’s analysis.</w:t>
+      </w:r>
+      <w:r>
+        <w:t xml:space="preserve"> </w:t>
+      </w:r>
+      <w:r>
+        <w:t xml:space="preserve">With several authors, use</w:t>
+      </w:r>
+      <w:r>
+        <w:t xml:space="preserve"> </w:t>
+      </w:r>
+      <w:r>
+        <w:t xml:space="preserve">“we”</w:t>
+      </w:r>
+      <w:r>
+        <w:t xml:space="preserve">.</w:t>
+      </w:r>
+    </w:p>
+    <w:p>
+      <w:pPr>
+        <w:pStyle w:val="Compact"/>
+        <w:numPr>
+          <w:ilvl w:val="0"/>
+          <w:numId w:val="1006"/>
+        </w:numPr>
+      </w:pPr>
+      <w:r>
+        <w:t xml:space="preserve">Use</w:t>
+      </w:r>
+      <w:r>
+        <w:t xml:space="preserve"> </w:t>
+      </w:r>
+      <w:r>
+        <w:t xml:space="preserve">“we”</w:t>
+      </w:r>
+      <w:r>
+        <w:t xml:space="preserve"> </w:t>
+      </w:r>
+      <w:r>
+        <w:t xml:space="preserve">when the author and the reader work through an argument together, as in</w:t>
+      </w:r>
+      <w:r>
+        <w:t xml:space="preserve"> </w:t>
+      </w:r>
+      <w:r>
+        <w:t xml:space="preserve">“we now compute the gradient”</w:t>
+      </w:r>
+      <w:r>
+        <w:t xml:space="preserve">.</w:t>
+      </w:r>
+    </w:p>
+    <w:p>
+      <w:pPr>
+        <w:pStyle w:val="BlockText"/>
+      </w:pPr>
+      <w:r>
+        <w:t xml:space="preserve">❌ The minimum was found exactly, and the model was chosen by eye.</w:t>
+      </w:r>
+    </w:p>
+    <w:p>
+      <w:pPr>
+        <w:pStyle w:val="BlockText"/>
+      </w:pPr>
+      <w:r>
+        <w:t xml:space="preserve">✅ We found the minimum exactly, and we chose the model by eye.</w:t>
+      </w:r>
+      <w:r>
+        <w:t xml:space="preserve"> </w:t>
+      </w:r>
+      <w:r>
+        <w:t xml:space="preserve">(The author and reader work through the example together.)</w:t>
+      </w:r>
+    </w:p>
+    <w:p>
+      <w:pPr>
+        <w:pStyle w:val="BlockText"/>
+      </w:pPr>
+      <w:r>
+        <w:t xml:space="preserve">✅ I chose the model by eye, because the study had five points.</w:t>
+      </w:r>
+      <w:r>
+        <w:t xml:space="preserve"> </w:t>
+      </w:r>
+      <w:r>
+        <w:t xml:space="preserve">(A single author reports a choice.)</w:t>
+      </w:r>
+    </w:p>
+    <w:p>
+      <w:pPr>
+        <w:pStyle w:val="FirstParagraph"/>
+      </w:pPr>
+      <w:r>
+        <w:t xml:space="preserve">Passive voice is the right choice in a few cases:</w:t>
+      </w:r>
+    </w:p>
+    <w:p>
+      <w:pPr>
+        <w:pStyle w:val="Compact"/>
+        <w:numPr>
+          <w:ilvl w:val="0"/>
+          <w:numId w:val="1007"/>
+        </w:numPr>
+      </w:pPr>
+      <w:r>
+        <w:t xml:space="preserve">The actor is unknown or does not matter, as in</w:t>
+      </w:r>
+      <w:r>
+        <w:t xml:space="preserve"> </w:t>
+      </w:r>
+      <w:r>
+        <w:t xml:space="preserve">“The samples were contaminated.”</w:t>
+      </w:r>
+    </w:p>
+    <w:p>
+      <w:pPr>
+        <w:pStyle w:val="Compact"/>
+        <w:numPr>
+          <w:ilvl w:val="0"/>
+          <w:numId w:val="1007"/>
+        </w:numPr>
+      </w:pPr>
+      <w:r>
+        <w:t xml:space="preserve">The receiver of the action is the topic of the paragraph, and the sentence is easier to follow with it as the subject.</w:t>
+      </w:r>
+    </w:p>
+    <w:p>
+      <w:pPr>
+        <w:pStyle w:val="Compact"/>
+        <w:numPr>
+          <w:ilvl w:val="0"/>
+          <w:numId w:val="1007"/>
+        </w:numPr>
+      </w:pPr>
+      <w:r>
+        <w:t xml:space="preserve">The actor would be a vague</w:t>
+      </w:r>
+      <w:r>
+        <w:t xml:space="preserve"> </w:t>
+      </w:r>
+      <w:r>
+        <w:t xml:space="preserve">“someone”</w:t>
+      </w:r>
+      <w:r>
+        <w:t xml:space="preserve"> </w:t>
+      </w:r>
+      <w:r>
+        <w:t xml:space="preserve">or</w:t>
+      </w:r>
+      <w:r>
+        <w:t xml:space="preserve"> </w:t>
+      </w:r>
+      <w:r>
+        <w:t xml:space="preserve">“one”</w:t>
+      </w:r>
+      <w:r>
+        <w:t xml:space="preserve">, and no real person or group acts.</w:t>
+      </w:r>
+    </w:p>
+    <w:p>
+      <w:pPr>
+        <w:pStyle w:val="FirstParagraph"/>
+      </w:pPr>
+      <w:r>
+        <w:t xml:space="preserve">When none of these applies, rewrite the sentence with an active verb.</w:t>
+      </w:r>
+    </w:p>
+    <w:bookmarkEnd w:id="14"/>
+    <w:bookmarkStart w:id="15" w:name="lead-with-the-subject"/>
+    <w:p>
+      <w:pPr>
+        <w:pStyle w:val="Heading2"/>
+      </w:pPr>
+      <w:r>
+        <w:t xml:space="preserve">3 Lead with the subject</w:t>
       </w:r>
     </w:p>
     <w:p>
@@ -621,14 +877,14 @@
         <w:t xml:space="preserve">.</w:t>
       </w:r>
     </w:p>
-    <w:bookmarkEnd w:id="13"/>
-    <w:bookmarkStart w:id="15" w:name="limit-complex-sentence-structures"/>
+    <w:bookmarkEnd w:id="15"/>
+    <w:bookmarkStart w:id="17" w:name="limit-complex-sentence-structures"/>
     <w:p>
       <w:pPr>
         <w:pStyle w:val="Heading2"/>
       </w:pPr>
       <w:r>
-        <w:t xml:space="preserve">3 Limit complex sentence structures</w:t>
+        <w:t xml:space="preserve">4 Limit complex sentence structures</w:t>
       </w:r>
     </w:p>
     <w:p>
@@ -731,7 +987,7 @@
         <w:t xml:space="preserve">each carrying one main idea.</w:t>
       </w:r>
     </w:p>
-    <w:bookmarkStart w:id="14" w:name="exm-nested-clauses"/>
+    <w:bookmarkStart w:id="16" w:name="exm-nested-clauses"/>
     <w:p>
       <w:pPr>
         <w:pStyle w:val="BodyText"/>
@@ -792,15 +1048,15 @@
         <w:t xml:space="preserve">so the reader can absorb each idea before moving on.</w:t>
       </w:r>
     </w:p>
-    <w:bookmarkEnd w:id="14"/>
-    <w:bookmarkEnd w:id="15"/>
-    <w:bookmarkStart w:id="17" w:name="X831e99641ea6e3d916f49fb78be48dc576ff061"/>
+    <w:bookmarkEnd w:id="16"/>
+    <w:bookmarkEnd w:id="17"/>
+    <w:bookmarkStart w:id="19" w:name="X831e99641ea6e3d916f49fb78be48dc576ff061"/>
     <w:p>
       <w:pPr>
         <w:pStyle w:val="Heading2"/>
       </w:pPr>
       <w:r>
-        <w:t xml:space="preserve">4 Do not rule out readings no reader would make</w:t>
+        <w:t xml:space="preserve">5 Do not rule out readings no reader would make</w:t>
       </w:r>
     </w:p>
     <w:p>
@@ -841,7 +1097,7 @@
         <w:t xml:space="preserve">and can plant the confusion it was meant to prevent.</w:t>
       </w:r>
     </w:p>
-    <w:bookmarkStart w:id="16" w:name="exm-gratuitous-disclaimer"/>
+    <w:bookmarkStart w:id="18" w:name="exm-gratuitous-disclaimer"/>
     <w:p>
       <w:pPr>
         <w:pStyle w:val="BodyText"/>
@@ -926,7 +1182,7 @@
         <w:t xml:space="preserve">that the reader would not otherwise have considered.</w:t>
       </w:r>
     </w:p>
-    <w:bookmarkEnd w:id="16"/>
+    <w:bookmarkEnd w:id="18"/>
     <w:p>
       <w:pPr>
         <w:pStyle w:val="BodyText"/>
@@ -997,14 +1253,14 @@
         <w:t xml:space="preserve">a report for clinicians might.</w:t>
       </w:r>
     </w:p>
-    <w:bookmarkEnd w:id="17"/>
-    <w:bookmarkStart w:id="19" w:name="avoid-double-negatives"/>
+    <w:bookmarkEnd w:id="19"/>
+    <w:bookmarkStart w:id="21" w:name="avoid-double-negatives"/>
     <w:p>
       <w:pPr>
         <w:pStyle w:val="Heading2"/>
       </w:pPr>
       <w:r>
-        <w:t xml:space="preserve">5 Avoid double negatives</w:t>
+        <w:t xml:space="preserve">6 Avoid double negatives</w:t>
       </w:r>
     </w:p>
     <w:p>
@@ -1026,7 +1282,7 @@
         <w:pStyle w:val="Compact"/>
         <w:numPr>
           <w:ilvl w:val="0"/>
-          <w:numId w:val="1006"/>
+          <w:numId w:val="1008"/>
         </w:numPr>
       </w:pPr>
       <w:r>
@@ -1038,7 +1294,7 @@
         <w:pStyle w:val="Compact"/>
         <w:numPr>
           <w:ilvl w:val="0"/>
-          <w:numId w:val="1006"/>
+          <w:numId w:val="1008"/>
         </w:numPr>
       </w:pPr>
       <w:r>
@@ -1050,7 +1306,7 @@
         <w:pStyle w:val="Compact"/>
         <w:numPr>
           <w:ilvl w:val="0"/>
-          <w:numId w:val="1006"/>
+          <w:numId w:val="1008"/>
         </w:numPr>
       </w:pPr>
       <w:r>
@@ -1115,7 +1371,7 @@
         <w:t xml:space="preserve">and it is the standard wording for a test result.</w:t>
       </w:r>
     </w:p>
-    <w:bookmarkStart w:id="18" w:name="exm-double-negative"/>
+    <w:bookmarkStart w:id="20" w:name="exm-double-negative"/>
     <w:p>
       <w:pPr>
         <w:pStyle w:val="BodyText"/>
@@ -1205,15 +1461,15 @@
         <w:t xml:space="preserve">Choose the one you mean.</w:t>
       </w:r>
     </w:p>
-    <w:bookmarkEnd w:id="18"/>
-    <w:bookmarkEnd w:id="19"/>
-    <w:bookmarkStart w:id="22" w:name="Xa757197b9b942a803dc05820332a104a8aaeee4"/>
+    <w:bookmarkEnd w:id="20"/>
+    <w:bookmarkEnd w:id="21"/>
+    <w:bookmarkStart w:id="24" w:name="Xa757197b9b942a803dc05820332a104a8aaeee4"/>
     <w:p>
       <w:pPr>
         <w:pStyle w:val="Heading2"/>
       </w:pPr>
       <w:r>
-        <w:t xml:space="preserve">6 Write about the subject, not about the text</w:t>
+        <w:t xml:space="preserve">7 Write about the subject, not about the text</w:t>
       </w:r>
     </w:p>
     <w:p>
@@ -1235,7 +1491,7 @@
         <w:pStyle w:val="Compact"/>
         <w:numPr>
           <w:ilvl w:val="0"/>
-          <w:numId w:val="1007"/>
+          <w:numId w:val="1009"/>
         </w:numPr>
       </w:pPr>
       <w:r>
@@ -1247,7 +1503,7 @@
         <w:pStyle w:val="Compact"/>
         <w:numPr>
           <w:ilvl w:val="0"/>
-          <w:numId w:val="1007"/>
+          <w:numId w:val="1009"/>
         </w:numPr>
       </w:pPr>
       <w:r>
@@ -1259,7 +1515,7 @@
         <w:pStyle w:val="Compact"/>
         <w:numPr>
           <w:ilvl w:val="0"/>
-          <w:numId w:val="1007"/>
+          <w:numId w:val="1009"/>
         </w:numPr>
       </w:pPr>
       <w:r>
@@ -1288,7 +1544,7 @@
       <w:r>
         <w:t xml:space="preserve"> </w:t>
       </w:r>
-      <w:hyperlink r:id="rId20">
+      <w:hyperlink r:id="rId22">
         <w:r>
           <w:rPr>
             <w:rStyle w:val="Hyperlink"/>
@@ -1312,7 +1568,7 @@
         <w:t xml:space="preserve">.</w:t>
       </w:r>
     </w:p>
-    <w:bookmarkStart w:id="21" w:name="exm-self-referential"/>
+    <w:bookmarkStart w:id="23" w:name="exm-self-referential"/>
     <w:p>
       <w:pPr>
         <w:pStyle w:val="BodyText"/>
@@ -1411,15 +1667,15 @@
         <w:t xml:space="preserve">instead of saying that it changes something.</w:t>
       </w:r>
     </w:p>
-    <w:bookmarkEnd w:id="21"/>
-    <w:bookmarkEnd w:id="22"/>
-    <w:bookmarkStart w:id="29" w:name="put-lists-in-bullet-points"/>
+    <w:bookmarkEnd w:id="23"/>
+    <w:bookmarkEnd w:id="24"/>
+    <w:bookmarkStart w:id="31" w:name="put-lists-in-bullet-points"/>
     <w:p>
       <w:pPr>
         <w:pStyle w:val="Heading2"/>
       </w:pPr>
       <w:r>
-        <w:t xml:space="preserve">7 Put lists in bullet points</w:t>
+        <w:t xml:space="preserve">8 Put lists in bullet points</w:t>
       </w:r>
     </w:p>
     <w:p>
@@ -1549,7 +1805,7 @@
         <w:pStyle w:val="Compact"/>
         <w:numPr>
           <w:ilvl w:val="0"/>
-          <w:numId w:val="1008"/>
+          <w:numId w:val="1010"/>
         </w:numPr>
       </w:pPr>
       <w:r>
@@ -1567,7 +1823,7 @@
         <w:pStyle w:val="Compact"/>
         <w:numPr>
           <w:ilvl w:val="0"/>
-          <w:numId w:val="1008"/>
+          <w:numId w:val="1010"/>
         </w:numPr>
       </w:pPr>
       <w:r>
@@ -1585,7 +1841,7 @@
         <w:pStyle w:val="Compact"/>
         <w:numPr>
           <w:ilvl w:val="0"/>
-          <w:numId w:val="1008"/>
+          <w:numId w:val="1010"/>
         </w:numPr>
       </w:pPr>
       <w:r>
@@ -1607,7 +1863,7 @@
         <w:t xml:space="preserve">.</w:t>
       </w:r>
     </w:p>
-    <w:bookmarkStart w:id="23" w:name="exm-bullet-lists"/>
+    <w:bookmarkStart w:id="25" w:name="exm-bullet-lists"/>
     <w:p>
       <w:pPr>
         <w:pStyle w:val="FirstParagraph"/>
@@ -1647,7 +1903,7 @@
         <w:pStyle w:val="Compact"/>
         <w:numPr>
           <w:ilvl w:val="0"/>
-          <w:numId w:val="1009"/>
+          <w:numId w:val="1011"/>
         </w:numPr>
       </w:pPr>
       <w:r>
@@ -1659,7 +1915,7 @@
         <w:pStyle w:val="Compact"/>
         <w:numPr>
           <w:ilvl w:val="0"/>
-          <w:numId w:val="1009"/>
+          <w:numId w:val="1011"/>
         </w:numPr>
       </w:pPr>
       <w:r>
@@ -1671,7 +1927,7 @@
         <w:pStyle w:val="Compact"/>
         <w:numPr>
           <w:ilvl w:val="0"/>
-          <w:numId w:val="1009"/>
+          <w:numId w:val="1011"/>
         </w:numPr>
       </w:pPr>
       <w:r>
@@ -1692,8 +1948,8 @@
         <w:t xml:space="preserve">so the reader sees at a glance that there are three.</w:t>
       </w:r>
     </w:p>
-    <w:bookmarkEnd w:id="23"/>
-    <w:bookmarkStart w:id="27" w:name="exm-resource-lists"/>
+    <w:bookmarkEnd w:id="25"/>
+    <w:bookmarkStart w:id="29" w:name="exm-resource-lists"/>
     <w:p>
       <w:pPr>
         <w:pStyle w:val="BodyText"/>
@@ -1722,7 +1978,7 @@
       <w:r>
         <w:t xml:space="preserve"> </w:t>
       </w:r>
-      <w:hyperlink r:id="rId24">
+      <w:hyperlink r:id="rId26">
         <w:r>
           <w:rPr>
             <w:rStyle w:val="Hyperlink"/>
@@ -1736,7 +1992,7 @@
       <w:r>
         <w:t xml:space="preserve"> </w:t>
       </w:r>
-      <w:hyperlink r:id="rId25">
+      <w:hyperlink r:id="rId27">
         <w:r>
           <w:rPr>
             <w:rStyle w:val="Hyperlink"/>
@@ -1761,7 +2017,7 @@
         <w:pStyle w:val="Compact"/>
         <w:numPr>
           <w:ilvl w:val="0"/>
-          <w:numId w:val="1010"/>
+          <w:numId w:val="1012"/>
         </w:numPr>
       </w:pPr>
       <w:r>
@@ -1770,7 +2026,7 @@
       <w:r>
         <w:t xml:space="preserve"> </w:t>
       </w:r>
-      <w:hyperlink r:id="rId24">
+      <w:hyperlink r:id="rId26">
         <w:r>
           <w:rPr>
             <w:rStyle w:val="Hyperlink"/>
@@ -1787,7 +2043,7 @@
         <w:pStyle w:val="Compact"/>
         <w:numPr>
           <w:ilvl w:val="0"/>
-          <w:numId w:val="1010"/>
+          <w:numId w:val="1012"/>
         </w:numPr>
       </w:pPr>
       <w:r>
@@ -1796,7 +2052,7 @@
       <w:r>
         <w:t xml:space="preserve"> </w:t>
       </w:r>
-      <w:hyperlink r:id="rId25">
+      <w:hyperlink r:id="rId27">
         <w:r>
           <w:rPr>
             <w:rStyle w:val="Hyperlink"/>
@@ -1818,7 +2074,7 @@
       <w:r>
         <w:t xml:space="preserve"> </w:t>
       </w:r>
-      <w:hyperlink r:id="rId26">
+      <w:hyperlink r:id="rId28">
         <w:r>
           <w:rPr>
             <w:rStyle w:val="Hyperlink"/>
@@ -1842,8 +2098,8 @@
         <w:t xml:space="preserve">so the reader can pick one without parsing the paragraph.</w:t>
       </w:r>
     </w:p>
-    <w:bookmarkEnd w:id="27"/>
-    <w:bookmarkStart w:id="28" w:name="exm-numbered-lists"/>
+    <w:bookmarkEnd w:id="29"/>
+    <w:bookmarkStart w:id="30" w:name="exm-numbered-lists"/>
     <w:p>
       <w:pPr>
         <w:pStyle w:val="BodyText"/>
@@ -1917,7 +2173,7 @@
         <w:pStyle w:val="Compact"/>
         <w:numPr>
           <w:ilvl w:val="0"/>
-          <w:numId w:val="1011"/>
+          <w:numId w:val="1013"/>
         </w:numPr>
       </w:pPr>
       <w:r>
@@ -1929,7 +2185,7 @@
         <w:pStyle w:val="Compact"/>
         <w:numPr>
           <w:ilvl w:val="0"/>
-          <w:numId w:val="1011"/>
+          <w:numId w:val="1013"/>
         </w:numPr>
       </w:pPr>
       <w:r>
@@ -1950,15 +2206,15 @@
         <w:t xml:space="preserve">and the loop condition moves into the introducing sentence.</w:t>
       </w:r>
     </w:p>
-    <w:bookmarkEnd w:id="28"/>
-    <w:bookmarkEnd w:id="29"/>
-    <w:bookmarkStart w:id="35" w:name="examples-of-concise-writing"/>
+    <w:bookmarkEnd w:id="30"/>
+    <w:bookmarkEnd w:id="31"/>
+    <w:bookmarkStart w:id="37" w:name="examples-of-concise-writing"/>
     <w:p>
       <w:pPr>
         <w:pStyle w:val="Heading2"/>
       </w:pPr>
       <w:r>
-        <w:t xml:space="preserve">8 Examples of concise writing</w:t>
+        <w:t xml:space="preserve">9 Examples of concise writing</w:t>
       </w:r>
     </w:p>
     <w:p>
@@ -2049,8 +2305,8 @@
         <w:t xml:space="preserve">.</w:t>
       </w:r>
     </w:p>
-    <w:bookmarkStart w:id="34" w:name="refs"/>
-    <w:bookmarkStart w:id="31" w:name="ref-hemingway_style"/>
+    <w:bookmarkStart w:id="36" w:name="refs"/>
+    <w:bookmarkStart w:id="33" w:name="ref-hemingway_style"/>
     <w:p>
       <w:pPr>
         <w:pStyle w:val="Bibliography"/>
@@ -2109,7 +2365,7 @@
       <w:r>
         <w:t xml:space="preserve"> </w:t>
       </w:r>
-      <w:hyperlink r:id="rId30">
+      <w:hyperlink r:id="rId32">
         <w:r>
           <w:rPr>
             <w:rStyle w:val="Hyperlink"/>
@@ -2121,8 +2377,8 @@
         <w:t xml:space="preserve">.</w:t>
       </w:r>
     </w:p>
-    <w:bookmarkEnd w:id="31"/>
-    <w:bookmarkStart w:id="33" w:name="ref-caesar_gallic"/>
+    <w:bookmarkEnd w:id="33"/>
+    <w:bookmarkStart w:id="35" w:name="ref-caesar_gallic"/>
     <w:p>
       <w:pPr>
         <w:pStyle w:val="Bibliography"/>
@@ -2181,7 +2437,7 @@
       <w:r>
         <w:t xml:space="preserve"> </w:t>
       </w:r>
-      <w:hyperlink r:id="rId32">
+      <w:hyperlink r:id="rId34">
         <w:r>
           <w:rPr>
             <w:rStyle w:val="Hyperlink"/>
@@ -2193,9 +2449,9 @@
         <w:t xml:space="preserve">.</w:t>
       </w:r>
     </w:p>
-    <w:bookmarkEnd w:id="33"/>
-    <w:bookmarkEnd w:id="34"/>
     <w:bookmarkEnd w:id="35"/>
+    <w:bookmarkEnd w:id="36"/>
+    <w:bookmarkEnd w:id="37"/>
     <w:sectPr>
       <w:footnotePr>
         <w:numRestart w:val="eachSect"/>
@@ -2528,6 +2784,12 @@
     <w:abstractNumId w:val="991"/>
   </w:num>
   <w:num w:numId="1011">
+    <w:abstractNumId w:val="991"/>
+  </w:num>
+  <w:num w:numId="1012">
+    <w:abstractNumId w:val="991"/>
+  </w:num>
+  <w:num w:numId="1013">
     <w:abstractNumId w:val="99411"/>
     <w:lvlOverride w:ilvl="0">
       <w:startOverride w:val="1"/>

</xml_diff>

<commit_message>
Deploying to gh-pages from @ Morrison-Lab/psw@977014eb2acc2565d2b1198f97f638ad4c50eb96 🚀
</commit_message>
<xml_diff>
--- a/chapters/conciseness.docx
+++ b/chapters/conciseness.docx
@@ -15,7 +15,7 @@
         <w:pStyle w:val="Date"/>
       </w:pPr>
       <w:r>
-        <w:t xml:space="preserve">Last modified: 2026-10-16 02:42:44 (PDT)</w:t>
+        <w:t xml:space="preserve">Last modified: 2026-10-16 02:49:17 (PDT)</w:t>
       </w:r>
     </w:p>
     <w:tbl>
@@ -1698,13 +1698,99 @@
     </w:p>
     <w:bookmarkEnd w:id="24"/>
     <w:bookmarkEnd w:id="25"/>
-    <w:bookmarkStart w:id="32" w:name="put-lists-in-bullet-points"/>
+    <w:bookmarkStart w:id="27" w:name="do-not-overexplain"/>
     <w:p>
       <w:pPr>
         <w:pStyle w:val="Heading2"/>
       </w:pPr>
       <w:r>
-        <w:t xml:space="preserve">8 Put lists in bullet points</w:t>
+        <w:t xml:space="preserve">8 Do not overexplain</w:t>
+      </w:r>
+    </w:p>
+    <w:p>
+      <w:pPr>
+        <w:pStyle w:val="FirstParagraph"/>
+      </w:pPr>
+      <w:r>
+        <w:t xml:space="preserve">Say what the reader needs, and stop.</w:t>
+      </w:r>
+      <w:r>
+        <w:t xml:space="preserve"> </w:t>
+      </w:r>
+      <w:r>
+        <w:t xml:space="preserve">Cut a qualifier, a restatement or a reason that the words before it already imply.</w:t>
+      </w:r>
+    </w:p>
+    <w:bookmarkStart w:id="26" w:name="exm-overexplain"/>
+    <w:p>
+      <w:pPr>
+        <w:pStyle w:val="BodyText"/>
+      </w:pPr>
+      <w:r>
+        <w:rPr>
+          <w:b/>
+          <w:bCs/>
+        </w:rPr>
+        <w:t xml:space="preserve">Example 5 (Cutting a clause the term already implies)</w:t>
+      </w:r>
+      <w:r>
+        <w:t xml:space="preserve"> </w:t>
+      </w:r>
+      <w:r>
+        <w:t xml:space="preserve"> </w:t>
+      </w:r>
+    </w:p>
+    <w:p>
+      <w:pPr>
+        <w:pStyle w:val="BlockText"/>
+      </w:pPr>
+      <w:r>
+        <w:t xml:space="preserve">❌ Estimated mean: the estimated value of the mean, whether or not it is a mean of an outcome.</w:t>
+      </w:r>
+    </w:p>
+    <w:p>
+      <w:pPr>
+        <w:pStyle w:val="BlockText"/>
+      </w:pPr>
+      <w:r>
+        <w:t xml:space="preserve">✅ Estimated mean: the estimated value of the mean.</w:t>
+      </w:r>
+    </w:p>
+    <w:p>
+      <w:pPr>
+        <w:pStyle w:val="FirstParagraph"/>
+      </w:pPr>
+      <w:r>
+        <w:t xml:space="preserve">The first version adds a clause that</w:t>
+      </w:r>
+      <w:r>
+        <w:t xml:space="preserve"> </w:t>
+      </w:r>
+      <w:r>
+        <w:t xml:space="preserve">“the mean”</w:t>
+      </w:r>
+      <w:r>
+        <w:t xml:space="preserve"> </w:t>
+      </w:r>
+      <w:r>
+        <w:t xml:space="preserve">already covers.</w:t>
+      </w:r>
+      <w:r>
+        <w:t xml:space="preserve"> </w:t>
+      </w:r>
+      <w:r>
+        <w:t xml:space="preserve">The second is complete.</w:t>
+      </w:r>
+    </w:p>
+    <w:bookmarkEnd w:id="26"/>
+    <w:bookmarkEnd w:id="27"/>
+    <w:bookmarkStart w:id="34" w:name="put-lists-in-bullet-points"/>
+    <w:p>
+      <w:pPr>
+        <w:pStyle w:val="Heading2"/>
+      </w:pPr>
+      <w:r>
+        <w:t xml:space="preserve">9 Put lists in bullet points</w:t>
       </w:r>
     </w:p>
     <w:p>
@@ -1892,7 +1978,7 @@
         <w:t xml:space="preserve">.</w:t>
       </w:r>
     </w:p>
-    <w:bookmarkStart w:id="26" w:name="exm-bullet-lists"/>
+    <w:bookmarkStart w:id="28" w:name="exm-bullet-lists"/>
     <w:p>
       <w:pPr>
         <w:pStyle w:val="FirstParagraph"/>
@@ -1902,7 +1988,7 @@
           <w:b/>
           <w:bCs/>
         </w:rPr>
-        <w:t xml:space="preserve">Example 5 (Turning an inline list into bullet points)</w:t>
+        <w:t xml:space="preserve">Example 6 (Turning an inline list into bullet points)</w:t>
       </w:r>
       <w:r>
         <w:t xml:space="preserve"> </w:t>
@@ -1977,8 +2063,8 @@
         <w:t xml:space="preserve">so the reader sees at a glance that there are three.</w:t>
       </w:r>
     </w:p>
-    <w:bookmarkEnd w:id="26"/>
-    <w:bookmarkStart w:id="30" w:name="exm-resource-lists"/>
+    <w:bookmarkEnd w:id="28"/>
+    <w:bookmarkStart w:id="32" w:name="exm-resource-lists"/>
     <w:p>
       <w:pPr>
         <w:pStyle w:val="BodyText"/>
@@ -1988,7 +2074,7 @@
           <w:b/>
           <w:bCs/>
         </w:rPr>
-        <w:t xml:space="preserve">Example 6 (Turning a run of resource sentences into bullet points)</w:t>
+        <w:t xml:space="preserve">Example 7 (Turning a run of resource sentences into bullet points)</w:t>
       </w:r>
       <w:r>
         <w:t xml:space="preserve"> </w:t>
@@ -2007,7 +2093,7 @@
       <w:r>
         <w:t xml:space="preserve"> </w:t>
       </w:r>
-      <w:hyperlink r:id="rId27">
+      <w:hyperlink r:id="rId29">
         <w:r>
           <w:rPr>
             <w:rStyle w:val="Hyperlink"/>
@@ -2021,7 +2107,7 @@
       <w:r>
         <w:t xml:space="preserve"> </w:t>
       </w:r>
-      <w:hyperlink r:id="rId28">
+      <w:hyperlink r:id="rId30">
         <w:r>
           <w:rPr>
             <w:rStyle w:val="Hyperlink"/>
@@ -2055,7 +2141,7 @@
       <w:r>
         <w:t xml:space="preserve"> </w:t>
       </w:r>
-      <w:hyperlink r:id="rId27">
+      <w:hyperlink r:id="rId29">
         <w:r>
           <w:rPr>
             <w:rStyle w:val="Hyperlink"/>
@@ -2081,7 +2167,7 @@
       <w:r>
         <w:t xml:space="preserve"> </w:t>
       </w:r>
-      <w:hyperlink r:id="rId28">
+      <w:hyperlink r:id="rId30">
         <w:r>
           <w:rPr>
             <w:rStyle w:val="Hyperlink"/>
@@ -2103,7 +2189,7 @@
       <w:r>
         <w:t xml:space="preserve"> </w:t>
       </w:r>
-      <w:hyperlink r:id="rId29">
+      <w:hyperlink r:id="rId31">
         <w:r>
           <w:rPr>
             <w:rStyle w:val="Hyperlink"/>
@@ -2127,8 +2213,8 @@
         <w:t xml:space="preserve">so the reader can pick one without parsing the paragraph.</w:t>
       </w:r>
     </w:p>
-    <w:bookmarkEnd w:id="30"/>
-    <w:bookmarkStart w:id="31" w:name="exm-numbered-lists"/>
+    <w:bookmarkEnd w:id="32"/>
+    <w:bookmarkStart w:id="33" w:name="exm-numbered-lists"/>
     <w:p>
       <w:pPr>
         <w:pStyle w:val="BodyText"/>
@@ -2138,7 +2224,7 @@
           <w:b/>
           <w:bCs/>
         </w:rPr>
-        <w:t xml:space="preserve">Example 7 (Turning inline steps into a numbered list)</w:t>
+        <w:t xml:space="preserve">Example 8 (Turning inline steps into a numbered list)</w:t>
       </w:r>
       <w:r>
         <w:t xml:space="preserve"> </w:t>
@@ -2235,15 +2321,15 @@
         <w:t xml:space="preserve">and the loop condition moves into the introducing sentence.</w:t>
       </w:r>
     </w:p>
-    <w:bookmarkEnd w:id="31"/>
-    <w:bookmarkEnd w:id="32"/>
-    <w:bookmarkStart w:id="38" w:name="examples-of-concise-writing"/>
+    <w:bookmarkEnd w:id="33"/>
+    <w:bookmarkEnd w:id="34"/>
+    <w:bookmarkStart w:id="40" w:name="examples-of-concise-writing"/>
     <w:p>
       <w:pPr>
         <w:pStyle w:val="Heading2"/>
       </w:pPr>
       <w:r>
-        <w:t xml:space="preserve">9 Examples of concise writing</w:t>
+        <w:t xml:space="preserve">10 Examples of concise writing</w:t>
       </w:r>
     </w:p>
     <w:p>
@@ -2334,8 +2420,8 @@
         <w:t xml:space="preserve">.</w:t>
       </w:r>
     </w:p>
-    <w:bookmarkStart w:id="37" w:name="refs"/>
-    <w:bookmarkStart w:id="34" w:name="ref-hemingway_style"/>
+    <w:bookmarkStart w:id="39" w:name="refs"/>
+    <w:bookmarkStart w:id="36" w:name="ref-hemingway_style"/>
     <w:p>
       <w:pPr>
         <w:pStyle w:val="Bibliography"/>
@@ -2394,7 +2480,7 @@
       <w:r>
         <w:t xml:space="preserve"> </w:t>
       </w:r>
-      <w:hyperlink r:id="rId33">
+      <w:hyperlink r:id="rId35">
         <w:r>
           <w:rPr>
             <w:rStyle w:val="Hyperlink"/>
@@ -2406,8 +2492,8 @@
         <w:t xml:space="preserve">.</w:t>
       </w:r>
     </w:p>
-    <w:bookmarkEnd w:id="34"/>
-    <w:bookmarkStart w:id="36" w:name="ref-caesar_gallic"/>
+    <w:bookmarkEnd w:id="36"/>
+    <w:bookmarkStart w:id="38" w:name="ref-caesar_gallic"/>
     <w:p>
       <w:pPr>
         <w:pStyle w:val="Bibliography"/>
@@ -2466,7 +2552,7 @@
       <w:r>
         <w:t xml:space="preserve"> </w:t>
       </w:r>
-      <w:hyperlink r:id="rId35">
+      <w:hyperlink r:id="rId37">
         <w:r>
           <w:rPr>
             <w:rStyle w:val="Hyperlink"/>
@@ -2478,9 +2564,9 @@
         <w:t xml:space="preserve">.</w:t>
       </w:r>
     </w:p>
-    <w:bookmarkEnd w:id="36"/>
-    <w:bookmarkEnd w:id="37"/>
     <w:bookmarkEnd w:id="38"/>
+    <w:bookmarkEnd w:id="39"/>
+    <w:bookmarkEnd w:id="40"/>
     <w:sectPr>
       <w:footnotePr>
         <w:numRestart w:val="eachSect"/>

</xml_diff>

<commit_message>
Deploying to gh-pages from @ Morrison-Lab/psw@a625b704848fa30febccfb63ac661b2ae8ac658f 🚀
</commit_message>
<xml_diff>
--- a/chapters/conciseness.docx
+++ b/chapters/conciseness.docx
@@ -15,7 +15,7 @@
         <w:pStyle w:val="Date"/>
       </w:pPr>
       <w:r>
-        <w:t xml:space="preserve">Last modified: 2026-10-16 03:13:33 (PDT)</w:t>
+        <w:t xml:space="preserve">Last modified: 2026-10-16 03:18:47 (PDT)</w:t>
       </w:r>
     </w:p>
     <w:tbl>
@@ -533,13 +533,13 @@
       </w:r>
     </w:p>
     <w:bookmarkEnd w:id="13"/>
-    <w:bookmarkStart w:id="15" w:name="write-in-the-active-voice"/>
+    <w:bookmarkStart w:id="14" w:name="make-every-word-tell"/>
     <w:p>
       <w:pPr>
         <w:pStyle w:val="Heading2"/>
       </w:pPr>
       <w:r>
-        <w:t xml:space="preserve">2 Write in the active voice</w:t>
+        <w:t xml:space="preserve">2 Make every word tell</w:t>
       </w:r>
     </w:p>
     <w:p>
@@ -547,12 +547,274 @@
         <w:pStyle w:val="FirstParagraph"/>
       </w:pPr>
       <w:r>
+        <w:t xml:space="preserve">Strunk’s rule 13 states the principle:</w:t>
+      </w:r>
+      <w:r>
+        <w:t xml:space="preserve"> </w:t>
+      </w:r>
+      <w:r>
+        <w:t xml:space="preserve">“Vigorous writing is concise.</w:t>
+      </w:r>
+      <w:r>
+        <w:t xml:space="preserve"> </w:t>
+      </w:r>
+      <w:r>
+        <w:t xml:space="preserve">A sentence should contain no unnecessary words,</w:t>
+      </w:r>
+      <w:r>
+        <w:t xml:space="preserve"> </w:t>
+      </w:r>
+      <w:r>
+        <w:t xml:space="preserve">a paragraph no unnecessary sentences,</w:t>
+      </w:r>
+      <w:r>
+        <w:t xml:space="preserve"> </w:t>
+      </w:r>
+      <w:r>
+        <w:t xml:space="preserve">for the same reason that a drawing should have no unnecessary lines</w:t>
+      </w:r>
+      <w:r>
+        <w:t xml:space="preserve"> </w:t>
+      </w:r>
+      <w:r>
+        <w:t xml:space="preserve">and a machine no unnecessary parts.”</w:t>
+      </w:r>
+      <w:r>
+        <w:t xml:space="preserve"> </w:t>
+      </w:r>
+      <w:r>
+        <w:t xml:space="preserve">He adds that this</w:t>
+      </w:r>
+      <w:r>
+        <w:t xml:space="preserve"> </w:t>
+      </w:r>
+      <w:r>
+        <w:t xml:space="preserve">“requires not that the writer make all his sentences short,</w:t>
+      </w:r>
+      <w:r>
+        <w:t xml:space="preserve"> </w:t>
+      </w:r>
+      <w:r>
+        <w:t xml:space="preserve">or that he avoid all detail and treat his subjects only in outline,</w:t>
+      </w:r>
+      <w:r>
+        <w:t xml:space="preserve"> </w:t>
+      </w:r>
+      <w:r>
+        <w:t xml:space="preserve">but that he make every word tell”</w:t>
+      </w:r>
+      <w:r>
+        <w:t xml:space="preserve"> </w:t>
+      </w:r>
+      <w:r>
+        <w:t xml:space="preserve">(Strunk 1920, rule 13)</w:t>
+      </w:r>
+      <w:r>
+        <w:t xml:space="preserve">.</w:t>
+      </w:r>
+    </w:p>
+    <w:p>
+      <w:pPr>
+        <w:pStyle w:val="BodyText"/>
+      </w:pPr>
+      <w:r>
+        <w:t xml:space="preserve">Strunk’s examples of expressions that waste words:</w:t>
+      </w:r>
+    </w:p>
+    <w:p>
+      <w:pPr>
+        <w:pStyle w:val="Compact"/>
+        <w:numPr>
+          <w:ilvl w:val="0"/>
+          <w:numId w:val="1006"/>
+        </w:numPr>
+      </w:pPr>
+      <w:r>
+        <w:t xml:space="preserve">“the question as to whether”</w:t>
+      </w:r>
+      <w:r>
+        <w:t xml:space="preserve"> </w:t>
+      </w:r>
+      <w:r>
+        <w:t xml:space="preserve">→</w:t>
+      </w:r>
+      <w:r>
+        <w:t xml:space="preserve"> </w:t>
+      </w:r>
+      <w:r>
+        <w:t xml:space="preserve">“whether”</w:t>
+      </w:r>
+    </w:p>
+    <w:p>
+      <w:pPr>
+        <w:pStyle w:val="Compact"/>
+        <w:numPr>
+          <w:ilvl w:val="0"/>
+          <w:numId w:val="1006"/>
+        </w:numPr>
+      </w:pPr>
+      <w:r>
+        <w:t xml:space="preserve">“used for fuel purposes”</w:t>
+      </w:r>
+      <w:r>
+        <w:t xml:space="preserve"> </w:t>
+      </w:r>
+      <w:r>
+        <w:t xml:space="preserve">→</w:t>
+      </w:r>
+      <w:r>
+        <w:t xml:space="preserve"> </w:t>
+      </w:r>
+      <w:r>
+        <w:t xml:space="preserve">“used for fuel”</w:t>
+      </w:r>
+    </w:p>
+    <w:p>
+      <w:pPr>
+        <w:pStyle w:val="Compact"/>
+        <w:numPr>
+          <w:ilvl w:val="0"/>
+          <w:numId w:val="1006"/>
+        </w:numPr>
+      </w:pPr>
+      <w:r>
+        <w:t xml:space="preserve">“in a hasty manner”</w:t>
+      </w:r>
+      <w:r>
+        <w:t xml:space="preserve"> </w:t>
+      </w:r>
+      <w:r>
+        <w:t xml:space="preserve">→</w:t>
+      </w:r>
+      <w:r>
+        <w:t xml:space="preserve"> </w:t>
+      </w:r>
+      <w:r>
+        <w:t xml:space="preserve">“hastily”</w:t>
+      </w:r>
+    </w:p>
+    <w:p>
+      <w:pPr>
+        <w:pStyle w:val="Compact"/>
+        <w:numPr>
+          <w:ilvl w:val="0"/>
+          <w:numId w:val="1006"/>
+        </w:numPr>
+      </w:pPr>
+      <w:r>
+        <w:t xml:space="preserve">“owing to the fact that”</w:t>
+      </w:r>
+      <w:r>
+        <w:t xml:space="preserve"> </w:t>
+      </w:r>
+      <w:r>
+        <w:t xml:space="preserve">→</w:t>
+      </w:r>
+      <w:r>
+        <w:t xml:space="preserve"> </w:t>
+      </w:r>
+      <w:r>
+        <w:t xml:space="preserve">“since”</w:t>
+      </w:r>
+    </w:p>
+    <w:p>
+      <w:pPr>
+        <w:pStyle w:val="Compact"/>
+        <w:numPr>
+          <w:ilvl w:val="0"/>
+          <w:numId w:val="1006"/>
+        </w:numPr>
+      </w:pPr>
+      <w:r>
+        <w:t xml:space="preserve">“the fact that he had not succeeded”</w:t>
+      </w:r>
+      <w:r>
+        <w:t xml:space="preserve"> </w:t>
+      </w:r>
+      <w:r>
+        <w:t xml:space="preserve">→</w:t>
+      </w:r>
+      <w:r>
+        <w:t xml:space="preserve"> </w:t>
+      </w:r>
+      <w:r>
+        <w:t xml:space="preserve">“his failure”</w:t>
+      </w:r>
+    </w:p>
+    <w:p>
+      <w:pPr>
+        <w:pStyle w:val="Compact"/>
+        <w:numPr>
+          <w:ilvl w:val="0"/>
+          <w:numId w:val="1006"/>
+        </w:numPr>
+      </w:pPr>
+      <w:r>
+        <w:t xml:space="preserve">“His brother, who is a member of the same firm”</w:t>
+      </w:r>
+      <w:r>
+        <w:t xml:space="preserve"> </w:t>
+      </w:r>
+      <w:r>
+        <w:t xml:space="preserve">→</w:t>
+      </w:r>
+      <w:r>
+        <w:t xml:space="preserve"> </w:t>
+      </w:r>
+      <w:r>
+        <w:t xml:space="preserve">“His brother, a member of the same firm”</w:t>
+      </w:r>
+    </w:p>
+    <w:p>
+      <w:pPr>
+        <w:pStyle w:val="FirstParagraph"/>
+      </w:pPr>
+      <w:r>
+        <w:t xml:space="preserve">The same rule applies to statistical writing:</w:t>
+      </w:r>
+      <w:r>
+        <w:t xml:space="preserve"> </w:t>
+      </w:r>
+      <w:r>
+        <w:t xml:space="preserve">“We conducted an analysis of the data to determine whether there is an association between smoking and lung cancer”</w:t>
+      </w:r>
+      <w:r>
+        <w:t xml:space="preserve"> </w:t>
+      </w:r>
+      <w:r>
+        <w:t xml:space="preserve">becomes</w:t>
+      </w:r>
+      <w:r>
+        <w:t xml:space="preserve"> </w:t>
+      </w:r>
+      <w:r>
+        <w:t xml:space="preserve">“We tested whether smoking is associated with lung cancer”</w:t>
+      </w:r>
+      <w:r>
+        <w:t xml:space="preserve">.</w:t>
+      </w:r>
+    </w:p>
+    <w:bookmarkEnd w:id="14"/>
+    <w:bookmarkStart w:id="16" w:name="write-in-the-active-voice"/>
+    <w:p>
+      <w:pPr>
+        <w:pStyle w:val="Heading2"/>
+      </w:pPr>
+      <w:r>
+        <w:t xml:space="preserve">3 Write in the active voice</w:t>
+      </w:r>
+    </w:p>
+    <w:p>
+      <w:pPr>
+        <w:pStyle w:val="FirstParagraph"/>
+      </w:pPr>
+      <w:r>
         <w:t xml:space="preserve">Use the</w:t>
       </w:r>
       <w:r>
         <w:t xml:space="preserve"> </w:t>
       </w:r>
-      <w:hyperlink r:id="rId14">
+      <w:hyperlink r:id="rId15">
         <w:r>
           <w:rPr>
             <w:rStyle w:val="Hyperlink"/>
@@ -592,7 +854,7 @@
         <w:pStyle w:val="Compact"/>
         <w:numPr>
           <w:ilvl w:val="0"/>
-          <w:numId w:val="1006"/>
+          <w:numId w:val="1007"/>
         </w:numPr>
       </w:pPr>
       <w:r>
@@ -624,83 +886,6 @@
       </w:r>
       <w:r>
         <w:t xml:space="preserve">.</w:t>
-      </w:r>
-    </w:p>
-    <w:p>
-      <w:pPr>
-        <w:pStyle w:val="Compact"/>
-        <w:numPr>
-          <w:ilvl w:val="0"/>
-          <w:numId w:val="1006"/>
-        </w:numPr>
-      </w:pPr>
-      <w:r>
-        <w:t xml:space="preserve">Use</w:t>
-      </w:r>
-      <w:r>
-        <w:t xml:space="preserve"> </w:t>
-      </w:r>
-      <w:r>
-        <w:t xml:space="preserve">“we”</w:t>
-      </w:r>
-      <w:r>
-        <w:t xml:space="preserve"> </w:t>
-      </w:r>
-      <w:r>
-        <w:t xml:space="preserve">when the author and the reader work through an argument together, as in</w:t>
-      </w:r>
-      <w:r>
-        <w:t xml:space="preserve"> </w:t>
-      </w:r>
-      <w:r>
-        <w:t xml:space="preserve">“we now compute the gradient”</w:t>
-      </w:r>
-      <w:r>
-        <w:t xml:space="preserve">.</w:t>
-      </w:r>
-    </w:p>
-    <w:p>
-      <w:pPr>
-        <w:pStyle w:val="BlockText"/>
-      </w:pPr>
-      <w:r>
-        <w:t xml:space="preserve">❌ The minimum was found exactly, and the model was chosen by eye.</w:t>
-      </w:r>
-    </w:p>
-    <w:p>
-      <w:pPr>
-        <w:pStyle w:val="BlockText"/>
-      </w:pPr>
-      <w:r>
-        <w:t xml:space="preserve">✅ We found the minimum exactly, and we chose the model by eye.</w:t>
-      </w:r>
-      <w:r>
-        <w:t xml:space="preserve"> </w:t>
-      </w:r>
-      <w:r>
-        <w:t xml:space="preserve">(The author and reader work through the example together.)</w:t>
-      </w:r>
-    </w:p>
-    <w:p>
-      <w:pPr>
-        <w:pStyle w:val="BlockText"/>
-      </w:pPr>
-      <w:r>
-        <w:t xml:space="preserve">✅ I chose the model by eye, because the study had five points.</w:t>
-      </w:r>
-      <w:r>
-        <w:t xml:space="preserve"> </w:t>
-      </w:r>
-      <w:r>
-        <w:t xml:space="preserve">(A single author reports a choice.)</w:t>
-      </w:r>
-    </w:p>
-    <w:p>
-      <w:pPr>
-        <w:pStyle w:val="FirstParagraph"/>
-      </w:pPr>
-      <w:r>
-        <w:t xml:space="preserve">Passive voice is the right choice in a few cases:</w:t>
       </w:r>
     </w:p>
     <w:p>
@@ -712,13 +897,72 @@
         </w:numPr>
       </w:pPr>
       <w:r>
-        <w:t xml:space="preserve">The actor is unknown or does not matter, as in</w:t>
-      </w:r>
-      <w:r>
-        <w:t xml:space="preserve"> </w:t>
-      </w:r>
-      <w:r>
-        <w:t xml:space="preserve">“The samples were contaminated.”</w:t>
+        <w:t xml:space="preserve">Use</w:t>
+      </w:r>
+      <w:r>
+        <w:t xml:space="preserve"> </w:t>
+      </w:r>
+      <w:r>
+        <w:t xml:space="preserve">“we”</w:t>
+      </w:r>
+      <w:r>
+        <w:t xml:space="preserve"> </w:t>
+      </w:r>
+      <w:r>
+        <w:t xml:space="preserve">when the author and the reader work through an argument together, as in</w:t>
+      </w:r>
+      <w:r>
+        <w:t xml:space="preserve"> </w:t>
+      </w:r>
+      <w:r>
+        <w:t xml:space="preserve">“we now compute the gradient”</w:t>
+      </w:r>
+      <w:r>
+        <w:t xml:space="preserve">.</w:t>
+      </w:r>
+    </w:p>
+    <w:p>
+      <w:pPr>
+        <w:pStyle w:val="BlockText"/>
+      </w:pPr>
+      <w:r>
+        <w:t xml:space="preserve">❌ The minimum was found exactly, and the model was chosen by eye.</w:t>
+      </w:r>
+    </w:p>
+    <w:p>
+      <w:pPr>
+        <w:pStyle w:val="BlockText"/>
+      </w:pPr>
+      <w:r>
+        <w:t xml:space="preserve">✅ We found the minimum exactly, and we chose the model by eye.</w:t>
+      </w:r>
+      <w:r>
+        <w:t xml:space="preserve"> </w:t>
+      </w:r>
+      <w:r>
+        <w:t xml:space="preserve">(The author and reader work through the example together.)</w:t>
+      </w:r>
+    </w:p>
+    <w:p>
+      <w:pPr>
+        <w:pStyle w:val="BlockText"/>
+      </w:pPr>
+      <w:r>
+        <w:t xml:space="preserve">✅ I chose the model by eye, because the study had five points.</w:t>
+      </w:r>
+      <w:r>
+        <w:t xml:space="preserve"> </w:t>
+      </w:r>
+      <w:r>
+        <w:t xml:space="preserve">(A single author reports a choice.)</w:t>
+      </w:r>
+    </w:p>
+    <w:p>
+      <w:pPr>
+        <w:pStyle w:val="FirstParagraph"/>
+      </w:pPr>
+      <w:r>
+        <w:t xml:space="preserve">Passive voice is the right choice in a few cases:</w:t>
       </w:r>
     </w:p>
     <w:p>
@@ -726,11 +970,17 @@
         <w:pStyle w:val="Compact"/>
         <w:numPr>
           <w:ilvl w:val="0"/>
-          <w:numId w:val="1007"/>
+          <w:numId w:val="1008"/>
         </w:numPr>
       </w:pPr>
       <w:r>
-        <w:t xml:space="preserve">The receiver of the action is the topic of the paragraph, and the sentence is easier to follow with it as the subject.</w:t>
+        <w:t xml:space="preserve">The actor is unknown or does not matter, as in</w:t>
+      </w:r>
+      <w:r>
+        <w:t xml:space="preserve"> </w:t>
+      </w:r>
+      <w:r>
+        <w:t xml:space="preserve">“The samples were contaminated.”</w:t>
       </w:r>
     </w:p>
     <w:p>
@@ -738,10 +988,22 @@
         <w:pStyle w:val="Compact"/>
         <w:numPr>
           <w:ilvl w:val="0"/>
-          <w:numId w:val="1007"/>
+          <w:numId w:val="1008"/>
         </w:numPr>
       </w:pPr>
       <w:r>
+        <w:t xml:space="preserve">The receiver of the action is the topic of the paragraph, and the sentence is easier to follow with it as the subject.</w:t>
+      </w:r>
+    </w:p>
+    <w:p>
+      <w:pPr>
+        <w:pStyle w:val="Compact"/>
+        <w:numPr>
+          <w:ilvl w:val="0"/>
+          <w:numId w:val="1008"/>
+        </w:numPr>
+      </w:pPr>
+      <w:r>
         <w:t xml:space="preserve">The actor would be a vague</w:t>
       </w:r>
       <w:r>
@@ -774,14 +1036,14 @@
         <w:t xml:space="preserve">When none of these applies, rewrite the sentence with an active verb.</w:t>
       </w:r>
     </w:p>
-    <w:bookmarkEnd w:id="15"/>
-    <w:bookmarkStart w:id="16" w:name="lead-with-the-subject"/>
+    <w:bookmarkEnd w:id="16"/>
+    <w:bookmarkStart w:id="17" w:name="lead-with-the-subject"/>
     <w:p>
       <w:pPr>
         <w:pStyle w:val="Heading2"/>
       </w:pPr>
       <w:r>
-        <w:t xml:space="preserve">3 Lead with the subject</w:t>
+        <w:t xml:space="preserve">4 Lead with the subject</w:t>
       </w:r>
     </w:p>
     <w:p>
@@ -906,14 +1168,14 @@
         <w:t xml:space="preserve">.</w:t>
       </w:r>
     </w:p>
-    <w:bookmarkEnd w:id="16"/>
-    <w:bookmarkStart w:id="18" w:name="limit-complex-sentence-structures"/>
+    <w:bookmarkEnd w:id="17"/>
+    <w:bookmarkStart w:id="19" w:name="limit-complex-sentence-structures"/>
     <w:p>
       <w:pPr>
         <w:pStyle w:val="Heading2"/>
       </w:pPr>
       <w:r>
-        <w:t xml:space="preserve">4 Limit complex sentence structures</w:t>
+        <w:t xml:space="preserve">5 Limit complex sentence structures</w:t>
       </w:r>
     </w:p>
     <w:p>
@@ -1016,7 +1278,7 @@
         <w:t xml:space="preserve">each carrying one main idea.</w:t>
       </w:r>
     </w:p>
-    <w:bookmarkStart w:id="17" w:name="exm-nested-clauses"/>
+    <w:bookmarkStart w:id="18" w:name="exm-nested-clauses"/>
     <w:p>
       <w:pPr>
         <w:pStyle w:val="BodyText"/>
@@ -1077,15 +1339,15 @@
         <w:t xml:space="preserve">so the reader can absorb each idea before moving on.</w:t>
       </w:r>
     </w:p>
-    <w:bookmarkEnd w:id="17"/>
     <w:bookmarkEnd w:id="18"/>
-    <w:bookmarkStart w:id="20" w:name="X831e99641ea6e3d916f49fb78be48dc576ff061"/>
+    <w:bookmarkEnd w:id="19"/>
+    <w:bookmarkStart w:id="21" w:name="X831e99641ea6e3d916f49fb78be48dc576ff061"/>
     <w:p>
       <w:pPr>
         <w:pStyle w:val="Heading2"/>
       </w:pPr>
       <w:r>
-        <w:t xml:space="preserve">5 Do not rule out readings no reader would make</w:t>
+        <w:t xml:space="preserve">6 Do not rule out readings no reader would make</w:t>
       </w:r>
     </w:p>
     <w:p>
@@ -1126,7 +1388,7 @@
         <w:t xml:space="preserve">and can plant the confusion it was meant to prevent.</w:t>
       </w:r>
     </w:p>
-    <w:bookmarkStart w:id="19" w:name="exm-gratuitous-disclaimer"/>
+    <w:bookmarkStart w:id="20" w:name="exm-gratuitous-disclaimer"/>
     <w:p>
       <w:pPr>
         <w:pStyle w:val="BodyText"/>
@@ -1211,7 +1473,7 @@
         <w:t xml:space="preserve">that the reader would not otherwise have considered.</w:t>
       </w:r>
     </w:p>
-    <w:bookmarkEnd w:id="19"/>
+    <w:bookmarkEnd w:id="20"/>
     <w:p>
       <w:pPr>
         <w:pStyle w:val="BodyText"/>
@@ -1282,14 +1544,14 @@
         <w:t xml:space="preserve">a report for clinicians might.</w:t>
       </w:r>
     </w:p>
-    <w:bookmarkEnd w:id="20"/>
-    <w:bookmarkStart w:id="22" w:name="avoid-double-negatives"/>
+    <w:bookmarkEnd w:id="21"/>
+    <w:bookmarkStart w:id="23" w:name="avoid-double-negatives"/>
     <w:p>
       <w:pPr>
         <w:pStyle w:val="Heading2"/>
       </w:pPr>
       <w:r>
-        <w:t xml:space="preserve">6 Avoid double negatives</w:t>
+        <w:t xml:space="preserve">7 Avoid double negatives</w:t>
       </w:r>
     </w:p>
     <w:p>
@@ -1311,7 +1573,7 @@
         <w:pStyle w:val="Compact"/>
         <w:numPr>
           <w:ilvl w:val="0"/>
-          <w:numId w:val="1008"/>
+          <w:numId w:val="1009"/>
         </w:numPr>
       </w:pPr>
       <w:r>
@@ -1323,7 +1585,7 @@
         <w:pStyle w:val="Compact"/>
         <w:numPr>
           <w:ilvl w:val="0"/>
-          <w:numId w:val="1008"/>
+          <w:numId w:val="1009"/>
         </w:numPr>
       </w:pPr>
       <w:r>
@@ -1335,7 +1597,7 @@
         <w:pStyle w:val="Compact"/>
         <w:numPr>
           <w:ilvl w:val="0"/>
-          <w:numId w:val="1008"/>
+          <w:numId w:val="1009"/>
         </w:numPr>
       </w:pPr>
       <w:r>
@@ -1400,7 +1662,7 @@
         <w:t xml:space="preserve">and it is the standard wording for a test result.</w:t>
       </w:r>
     </w:p>
-    <w:bookmarkStart w:id="21" w:name="exm-double-negative"/>
+    <w:bookmarkStart w:id="22" w:name="exm-double-negative"/>
     <w:p>
       <w:pPr>
         <w:pStyle w:val="BodyText"/>
@@ -1490,15 +1752,15 @@
         <w:t xml:space="preserve">Choose the one you mean.</w:t>
       </w:r>
     </w:p>
-    <w:bookmarkEnd w:id="21"/>
     <w:bookmarkEnd w:id="22"/>
-    <w:bookmarkStart w:id="25" w:name="Xa757197b9b942a803dc05820332a104a8aaeee4"/>
+    <w:bookmarkEnd w:id="23"/>
+    <w:bookmarkStart w:id="26" w:name="Xa757197b9b942a803dc05820332a104a8aaeee4"/>
     <w:p>
       <w:pPr>
         <w:pStyle w:val="Heading2"/>
       </w:pPr>
       <w:r>
-        <w:t xml:space="preserve">7 Write about the subject, not about the text</w:t>
+        <w:t xml:space="preserve">8 Write about the subject, not about the text</w:t>
       </w:r>
     </w:p>
     <w:p>
@@ -1520,7 +1782,7 @@
         <w:pStyle w:val="Compact"/>
         <w:numPr>
           <w:ilvl w:val="0"/>
-          <w:numId w:val="1009"/>
+          <w:numId w:val="1010"/>
         </w:numPr>
       </w:pPr>
       <w:r>
@@ -1532,7 +1794,7 @@
         <w:pStyle w:val="Compact"/>
         <w:numPr>
           <w:ilvl w:val="0"/>
-          <w:numId w:val="1009"/>
+          <w:numId w:val="1010"/>
         </w:numPr>
       </w:pPr>
       <w:r>
@@ -1544,7 +1806,7 @@
         <w:pStyle w:val="Compact"/>
         <w:numPr>
           <w:ilvl w:val="0"/>
-          <w:numId w:val="1009"/>
+          <w:numId w:val="1010"/>
         </w:numPr>
       </w:pPr>
       <w:r>
@@ -1573,7 +1835,7 @@
       <w:r>
         <w:t xml:space="preserve"> </w:t>
       </w:r>
-      <w:hyperlink r:id="rId23">
+      <w:hyperlink r:id="rId24">
         <w:r>
           <w:rPr>
             <w:rStyle w:val="Hyperlink"/>
@@ -1597,7 +1859,7 @@
         <w:t xml:space="preserve">.</w:t>
       </w:r>
     </w:p>
-    <w:bookmarkStart w:id="24" w:name="exm-self-referential"/>
+    <w:bookmarkStart w:id="25" w:name="exm-self-referential"/>
     <w:p>
       <w:pPr>
         <w:pStyle w:val="BodyText"/>
@@ -1696,15 +1958,15 @@
         <w:t xml:space="preserve">instead of saying that it changes something.</w:t>
       </w:r>
     </w:p>
-    <w:bookmarkEnd w:id="24"/>
     <w:bookmarkEnd w:id="25"/>
-    <w:bookmarkStart w:id="27" w:name="do-not-overexplain"/>
+    <w:bookmarkEnd w:id="26"/>
+    <w:bookmarkStart w:id="28" w:name="do-not-overexplain"/>
     <w:p>
       <w:pPr>
         <w:pStyle w:val="Heading2"/>
       </w:pPr>
       <w:r>
-        <w:t xml:space="preserve">8 Do not overexplain</w:t>
+        <w:t xml:space="preserve">9 Do not overexplain</w:t>
       </w:r>
     </w:p>
     <w:p>
@@ -1721,7 +1983,7 @@
         <w:t xml:space="preserve">Cut a qualifier, a restatement or a reason that the words before it already imply.</w:t>
       </w:r>
     </w:p>
-    <w:bookmarkStart w:id="26" w:name="exm-overexplain"/>
+    <w:bookmarkStart w:id="27" w:name="exm-overexplain"/>
     <w:p>
       <w:pPr>
         <w:pStyle w:val="BodyText"/>
@@ -1782,15 +2044,15 @@
         <w:t xml:space="preserve">The second is complete.</w:t>
       </w:r>
     </w:p>
-    <w:bookmarkEnd w:id="26"/>
     <w:bookmarkEnd w:id="27"/>
-    <w:bookmarkStart w:id="34" w:name="put-lists-in-bullet-points"/>
+    <w:bookmarkEnd w:id="28"/>
+    <w:bookmarkStart w:id="35" w:name="put-lists-in-bullet-points"/>
     <w:p>
       <w:pPr>
         <w:pStyle w:val="Heading2"/>
       </w:pPr>
       <w:r>
-        <w:t xml:space="preserve">9 Put lists in bullet points</w:t>
+        <w:t xml:space="preserve">10 Put lists in bullet points</w:t>
       </w:r>
     </w:p>
     <w:p>
@@ -1920,7 +2182,7 @@
         <w:pStyle w:val="Compact"/>
         <w:numPr>
           <w:ilvl w:val="0"/>
-          <w:numId w:val="1010"/>
+          <w:numId w:val="1011"/>
         </w:numPr>
       </w:pPr>
       <w:r>
@@ -1938,7 +2200,7 @@
         <w:pStyle w:val="Compact"/>
         <w:numPr>
           <w:ilvl w:val="0"/>
-          <w:numId w:val="1010"/>
+          <w:numId w:val="1011"/>
         </w:numPr>
       </w:pPr>
       <w:r>
@@ -1956,7 +2218,7 @@
         <w:pStyle w:val="Compact"/>
         <w:numPr>
           <w:ilvl w:val="0"/>
-          <w:numId w:val="1010"/>
+          <w:numId w:val="1011"/>
         </w:numPr>
       </w:pPr>
       <w:r>
@@ -1978,7 +2240,7 @@
         <w:t xml:space="preserve">.</w:t>
       </w:r>
     </w:p>
-    <w:bookmarkStart w:id="28" w:name="exm-bullet-lists"/>
+    <w:bookmarkStart w:id="29" w:name="exm-bullet-lists"/>
     <w:p>
       <w:pPr>
         <w:pStyle w:val="FirstParagraph"/>
@@ -2018,7 +2280,7 @@
         <w:pStyle w:val="Compact"/>
         <w:numPr>
           <w:ilvl w:val="0"/>
-          <w:numId w:val="1011"/>
+          <w:numId w:val="1012"/>
         </w:numPr>
       </w:pPr>
       <w:r>
@@ -2030,7 +2292,7 @@
         <w:pStyle w:val="Compact"/>
         <w:numPr>
           <w:ilvl w:val="0"/>
-          <w:numId w:val="1011"/>
+          <w:numId w:val="1012"/>
         </w:numPr>
       </w:pPr>
       <w:r>
@@ -2042,7 +2304,7 @@
         <w:pStyle w:val="Compact"/>
         <w:numPr>
           <w:ilvl w:val="0"/>
-          <w:numId w:val="1011"/>
+          <w:numId w:val="1012"/>
         </w:numPr>
       </w:pPr>
       <w:r>
@@ -2063,8 +2325,8 @@
         <w:t xml:space="preserve">so the reader sees at a glance that there are three.</w:t>
       </w:r>
     </w:p>
-    <w:bookmarkEnd w:id="28"/>
-    <w:bookmarkStart w:id="32" w:name="exm-resource-lists"/>
+    <w:bookmarkEnd w:id="29"/>
+    <w:bookmarkStart w:id="33" w:name="exm-resource-lists"/>
     <w:p>
       <w:pPr>
         <w:pStyle w:val="BodyText"/>
@@ -2093,7 +2355,7 @@
       <w:r>
         <w:t xml:space="preserve"> </w:t>
       </w:r>
-      <w:hyperlink r:id="rId29">
+      <w:hyperlink r:id="rId30">
         <w:r>
           <w:rPr>
             <w:rStyle w:val="Hyperlink"/>
@@ -2107,7 +2369,7 @@
       <w:r>
         <w:t xml:space="preserve"> </w:t>
       </w:r>
-      <w:hyperlink r:id="rId30">
+      <w:hyperlink r:id="rId31">
         <w:r>
           <w:rPr>
             <w:rStyle w:val="Hyperlink"/>
@@ -2132,7 +2394,7 @@
         <w:pStyle w:val="Compact"/>
         <w:numPr>
           <w:ilvl w:val="0"/>
-          <w:numId w:val="1012"/>
+          <w:numId w:val="1013"/>
         </w:numPr>
       </w:pPr>
       <w:r>
@@ -2141,7 +2403,7 @@
       <w:r>
         <w:t xml:space="preserve"> </w:t>
       </w:r>
-      <w:hyperlink r:id="rId29">
+      <w:hyperlink r:id="rId30">
         <w:r>
           <w:rPr>
             <w:rStyle w:val="Hyperlink"/>
@@ -2158,7 +2420,7 @@
         <w:pStyle w:val="Compact"/>
         <w:numPr>
           <w:ilvl w:val="0"/>
-          <w:numId w:val="1012"/>
+          <w:numId w:val="1013"/>
         </w:numPr>
       </w:pPr>
       <w:r>
@@ -2167,7 +2429,7 @@
       <w:r>
         <w:t xml:space="preserve"> </w:t>
       </w:r>
-      <w:hyperlink r:id="rId30">
+      <w:hyperlink r:id="rId31">
         <w:r>
           <w:rPr>
             <w:rStyle w:val="Hyperlink"/>
@@ -2189,7 +2451,7 @@
       <w:r>
         <w:t xml:space="preserve"> </w:t>
       </w:r>
-      <w:hyperlink r:id="rId31">
+      <w:hyperlink r:id="rId32">
         <w:r>
           <w:rPr>
             <w:rStyle w:val="Hyperlink"/>
@@ -2213,8 +2475,8 @@
         <w:t xml:space="preserve">so the reader can pick one without parsing the paragraph.</w:t>
       </w:r>
     </w:p>
-    <w:bookmarkEnd w:id="32"/>
-    <w:bookmarkStart w:id="33" w:name="exm-numbered-lists"/>
+    <w:bookmarkEnd w:id="33"/>
+    <w:bookmarkStart w:id="34" w:name="exm-numbered-lists"/>
     <w:p>
       <w:pPr>
         <w:pStyle w:val="BodyText"/>
@@ -2288,7 +2550,7 @@
         <w:pStyle w:val="Compact"/>
         <w:numPr>
           <w:ilvl w:val="0"/>
-          <w:numId w:val="1013"/>
+          <w:numId w:val="1014"/>
         </w:numPr>
       </w:pPr>
       <w:r>
@@ -2300,7 +2562,7 @@
         <w:pStyle w:val="Compact"/>
         <w:numPr>
           <w:ilvl w:val="0"/>
-          <w:numId w:val="1013"/>
+          <w:numId w:val="1014"/>
         </w:numPr>
       </w:pPr>
       <w:r>
@@ -2321,15 +2583,15 @@
         <w:t xml:space="preserve">and the loop condition moves into the introducing sentence.</w:t>
       </w:r>
     </w:p>
-    <w:bookmarkEnd w:id="33"/>
     <w:bookmarkEnd w:id="34"/>
-    <w:bookmarkStart w:id="40" w:name="examples-of-concise-writing"/>
+    <w:bookmarkEnd w:id="35"/>
+    <w:bookmarkStart w:id="43" w:name="examples-of-concise-writing"/>
     <w:p>
       <w:pPr>
         <w:pStyle w:val="Heading2"/>
       </w:pPr>
       <w:r>
-        <w:t xml:space="preserve">10 Examples of concise writing</w:t>
+        <w:t xml:space="preserve">11 Examples of concise writing</w:t>
       </w:r>
     </w:p>
     <w:p>
@@ -2420,8 +2682,45 @@
         <w:t xml:space="preserve">.</w:t>
       </w:r>
     </w:p>
-    <w:bookmarkStart w:id="39" w:name="refs"/>
-    <w:bookmarkStart w:id="36" w:name="ref-hemingway_style"/>
+    <w:bookmarkStart w:id="42" w:name="refs"/>
+    <w:bookmarkStart w:id="37" w:name="ref-strunk1920elements"/>
+    <w:p>
+      <w:pPr>
+        <w:pStyle w:val="Bibliography"/>
+      </w:pPr>
+      <w:r>
+        <w:t xml:space="preserve">Strunk, William, Jr. 1920.</w:t>
+      </w:r>
+      <w:r>
+        <w:t xml:space="preserve"> </w:t>
+      </w:r>
+      <w:r>
+        <w:rPr>
+          <w:i/>
+          <w:iCs/>
+        </w:rPr>
+        <w:t xml:space="preserve">The Elements of Style</w:t>
+      </w:r>
+      <w:r>
+        <w:t xml:space="preserve">. Harcourt, Brace; Howe.</w:t>
+      </w:r>
+      <w:r>
+        <w:t xml:space="preserve"> </w:t>
+      </w:r>
+      <w:hyperlink r:id="rId36">
+        <w:r>
+          <w:rPr>
+            <w:rStyle w:val="Hyperlink"/>
+          </w:rPr>
+          <w:t xml:space="preserve">https://www.gutenberg.org/ebooks/37134</w:t>
+        </w:r>
+      </w:hyperlink>
+      <w:r>
+        <w:t xml:space="preserve">.</w:t>
+      </w:r>
+    </w:p>
+    <w:bookmarkEnd w:id="37"/>
+    <w:bookmarkStart w:id="39" w:name="ref-hemingway_style"/>
     <w:p>
       <w:pPr>
         <w:pStyle w:val="Bibliography"/>
@@ -2480,7 +2779,7 @@
       <w:r>
         <w:t xml:space="preserve"> </w:t>
       </w:r>
-      <w:hyperlink r:id="rId35">
+      <w:hyperlink r:id="rId38">
         <w:r>
           <w:rPr>
             <w:rStyle w:val="Hyperlink"/>
@@ -2492,8 +2791,8 @@
         <w:t xml:space="preserve">.</w:t>
       </w:r>
     </w:p>
-    <w:bookmarkEnd w:id="36"/>
-    <w:bookmarkStart w:id="38" w:name="ref-caesar_gallic"/>
+    <w:bookmarkEnd w:id="39"/>
+    <w:bookmarkStart w:id="41" w:name="ref-caesar_gallic"/>
     <w:p>
       <w:pPr>
         <w:pStyle w:val="Bibliography"/>
@@ -2552,7 +2851,7 @@
       <w:r>
         <w:t xml:space="preserve"> </w:t>
       </w:r>
-      <w:hyperlink r:id="rId37">
+      <w:hyperlink r:id="rId40">
         <w:r>
           <w:rPr>
             <w:rStyle w:val="Hyperlink"/>
@@ -2564,9 +2863,9 @@
         <w:t xml:space="preserve">.</w:t>
       </w:r>
     </w:p>
-    <w:bookmarkEnd w:id="38"/>
-    <w:bookmarkEnd w:id="39"/>
-    <w:bookmarkEnd w:id="40"/>
+    <w:bookmarkEnd w:id="41"/>
+    <w:bookmarkEnd w:id="42"/>
+    <w:bookmarkEnd w:id="43"/>
     <w:sectPr>
       <w:footnotePr>
         <w:numRestart w:val="eachSect"/>
@@ -2905,6 +3204,9 @@
     <w:abstractNumId w:val="991"/>
   </w:num>
   <w:num w:numId="1013">
+    <w:abstractNumId w:val="991"/>
+  </w:num>
+  <w:num w:numId="1014">
     <w:abstractNumId w:val="99411"/>
     <w:lvlOverride w:ilvl="0">
       <w:startOverride w:val="1"/>

</xml_diff>

<commit_message>
Deploying to gh-pages from @ Morrison-Lab/psw@b6d1ddf67bb33facce95f070a89b54f4d112a150 🚀
</commit_message>
<xml_diff>
--- a/chapters/conciseness.docx
+++ b/chapters/conciseness.docx
@@ -15,7 +15,7 @@
         <w:pStyle w:val="Date"/>
       </w:pPr>
       <w:r>
-        <w:t xml:space="preserve">Last modified: 2026-10-16 10:35:43 (PDT)</w:t>
+        <w:t xml:space="preserve">Last modified: 2026-10-16 10:41:10 (PDT)</w:t>
       </w:r>
     </w:p>
     <w:tbl>
@@ -2023,13 +2023,13 @@
     </w:p>
     <w:bookmarkEnd w:id="27"/>
     <w:bookmarkEnd w:id="28"/>
-    <w:bookmarkStart w:id="30" w:name="do-not-overexplain"/>
+    <w:bookmarkStart w:id="31" w:name="let-a-self-describing-link-stand-alone"/>
     <w:p>
       <w:pPr>
         <w:pStyle w:val="Heading2"/>
       </w:pPr>
       <w:r>
-        <w:t xml:space="preserve">10 Do not overexplain</w:t>
+        <w:t xml:space="preserve">10 Let a self-describing link stand alone</w:t>
       </w:r>
     </w:p>
     <w:p>
@@ -2037,16 +2037,28 @@
         <w:pStyle w:val="FirstParagraph"/>
       </w:pPr>
       <w:r>
-        <w:t xml:space="preserve">Say what the reader needs, and stop.</w:t>
-      </w:r>
-      <w:r>
-        <w:t xml:space="preserve"> </w:t>
-      </w:r>
-      <w:r>
-        <w:t xml:space="preserve">Cut a qualifier, a restatement or a reason that the words before it already imply.</w:t>
-      </w:r>
-    </w:p>
-    <w:bookmarkStart w:id="29" w:name="exm-overexplain"/>
+        <w:t xml:space="preserve">A URL often shows the name of what it points to and where that thing lives.</w:t>
+      </w:r>
+      <w:r>
+        <w:t xml:space="preserve"> </w:t>
+      </w:r>
+      <w:r>
+        <w:t xml:space="preserve">When it does,</w:t>
+      </w:r>
+      <w:r>
+        <w:t xml:space="preserve"> </w:t>
+      </w:r>
+      <w:r>
+        <w:t xml:space="preserve">do not also spell out that name or host around the link.</w:t>
+      </w:r>
+      <w:r>
+        <w:t xml:space="preserve"> </w:t>
+      </w:r>
+      <w:r>
+        <w:t xml:space="preserve">The reader would read the same facts twice.</w:t>
+      </w:r>
+    </w:p>
+    <w:bookmarkStart w:id="30" w:name="exm-self-describing-link"/>
     <w:p>
       <w:pPr>
         <w:pStyle w:val="BodyText"/>
@@ -2056,7 +2068,7 @@
           <w:b/>
           <w:bCs/>
         </w:rPr>
-        <w:t xml:space="preserve">Example 5 (Cutting a clause the term already implies)</w:t>
+        <w:t xml:space="preserve">Example 5 (Dropping prose that repeats a URL)</w:t>
       </w:r>
       <w:r>
         <w:t xml:space="preserve"> </w:t>
@@ -2070,6 +2082,263 @@
         <w:pStyle w:val="BlockText"/>
       </w:pPr>
       <w:r>
+        <w:t xml:space="preserve">❌ For an example, see my public notes site Morrison-Lab/sds on GitHub</w:t>
+      </w:r>
+      <w:r>
+        <w:t xml:space="preserve"> </w:t>
+      </w:r>
+      <w:r>
+        <w:t xml:space="preserve">(</w:t>
+      </w:r>
+      <w:hyperlink r:id="rId29">
+        <w:r>
+          <w:rPr>
+            <w:rStyle w:val="Hyperlink"/>
+          </w:rPr>
+          <w:t xml:space="preserve">https://github.com/Morrison-Lab/sds</w:t>
+        </w:r>
+      </w:hyperlink>
+      <w:r>
+        <w:t xml:space="preserve">).</w:t>
+      </w:r>
+    </w:p>
+    <w:p>
+      <w:pPr>
+        <w:pStyle w:val="BlockText"/>
+      </w:pPr>
+      <w:r>
+        <w:t xml:space="preserve">✅ For an example, see</w:t>
+      </w:r>
+      <w:r>
+        <w:t xml:space="preserve"> </w:t>
+      </w:r>
+      <w:hyperlink r:id="rId29">
+        <w:r>
+          <w:rPr>
+            <w:rStyle w:val="Hyperlink"/>
+          </w:rPr>
+          <w:t xml:space="preserve">https://github.com/Morrison-Lab/sds</w:t>
+        </w:r>
+      </w:hyperlink>
+      <w:r>
+        <w:t xml:space="preserve">.</w:t>
+      </w:r>
+    </w:p>
+    <w:p>
+      <w:pPr>
+        <w:pStyle w:val="FirstParagraph"/>
+      </w:pPr>
+      <w:r>
+        <w:t xml:space="preserve">The URL already says that the site is on GitHub</w:t>
+      </w:r>
+      <w:r>
+        <w:t xml:space="preserve"> </w:t>
+      </w:r>
+      <w:r>
+        <w:t xml:space="preserve">and that the repository is</w:t>
+      </w:r>
+      <w:r>
+        <w:t xml:space="preserve"> </w:t>
+      </w:r>
+      <w:r>
+        <w:rPr>
+          <w:rStyle w:val="VerbatimChar"/>
+        </w:rPr>
+        <w:t xml:space="preserve">Morrison-Lab/sds</w:t>
+      </w:r>
+      <w:r>
+        <w:t xml:space="preserve">.</w:t>
+      </w:r>
+    </w:p>
+    <w:bookmarkEnd w:id="30"/>
+    <w:p>
+      <w:pPr>
+        <w:pStyle w:val="BodyText"/>
+      </w:pPr>
+      <w:r>
+        <w:t xml:space="preserve">Keep a descriptive label when the URL does not show what it points to,</w:t>
+      </w:r>
+      <w:r>
+        <w:t xml:space="preserve"> </w:t>
+      </w:r>
+      <w:r>
+        <w:t xml:space="preserve">such as a DOI or a shortened link.</w:t>
+      </w:r>
+    </w:p>
+    <w:bookmarkEnd w:id="31"/>
+    <w:bookmarkStart w:id="33" w:name="keep-the-writer-out-of-the-way"/>
+    <w:p>
+      <w:pPr>
+        <w:pStyle w:val="Heading2"/>
+      </w:pPr>
+      <w:r>
+        <w:t xml:space="preserve">11 Keep the writer out of the way</w:t>
+      </w:r>
+    </w:p>
+    <w:p>
+      <w:pPr>
+        <w:pStyle w:val="FirstParagraph"/>
+      </w:pPr>
+      <w:r>
+        <w:t xml:space="preserve">Mention yourself only where a sentence needs an actor,</w:t>
+      </w:r>
+      <w:r>
+        <w:t xml:space="preserve"> </w:t>
+      </w:r>
+      <w:r>
+        <w:t xml:space="preserve">such as a request, an offer, or a decision you made.</w:t>
+      </w:r>
+      <w:r>
+        <w:t xml:space="preserve"> </w:t>
+      </w:r>
+      <w:r>
+        <w:t xml:space="preserve">Elsewhere,</w:t>
+      </w:r>
+      <w:r>
+        <w:t xml:space="preserve"> </w:t>
+      </w:r>
+      <w:r>
+        <w:t xml:space="preserve">make the subject of the sentence the thing the reader cares about.</w:t>
+      </w:r>
+      <w:r>
+        <w:t xml:space="preserve"> </w:t>
+      </w:r>
+      <w:r>
+        <w:t xml:space="preserve">Extra references to the writer turn attention from the content to the person.</w:t>
+      </w:r>
+    </w:p>
+    <w:bookmarkStart w:id="32" w:name="exm-writer-out-of-the-way"/>
+    <w:p>
+      <w:pPr>
+        <w:pStyle w:val="BodyText"/>
+      </w:pPr>
+      <w:r>
+        <w:rPr>
+          <w:b/>
+          <w:bCs/>
+        </w:rPr>
+        <w:t xml:space="preserve">Example 6 (Moving the focus from the writer to the subject)</w:t>
+      </w:r>
+      <w:r>
+        <w:t xml:space="preserve"> </w:t>
+      </w:r>
+      <w:r>
+        <w:t xml:space="preserve"> </w:t>
+      </w:r>
+    </w:p>
+    <w:p>
+      <w:pPr>
+        <w:pStyle w:val="BlockText"/>
+      </w:pPr>
+      <w:r>
+        <w:t xml:space="preserve">❌ I tested this in a small private project, and I found that CI works well.</w:t>
+      </w:r>
+    </w:p>
+    <w:p>
+      <w:pPr>
+        <w:pStyle w:val="BlockText"/>
+      </w:pPr>
+      <w:r>
+        <w:t xml:space="preserve">✅ CI works well in a small private test project.</w:t>
+      </w:r>
+    </w:p>
+    <w:p>
+      <w:pPr>
+        <w:pStyle w:val="BlockText"/>
+      </w:pPr>
+      <w:r>
+        <w:t xml:space="preserve">❌ My build and review tools run on cloud services.</w:t>
+      </w:r>
+    </w:p>
+    <w:p>
+      <w:pPr>
+        <w:pStyle w:val="BlockText"/>
+      </w:pPr>
+      <w:r>
+        <w:t xml:space="preserve">✅ The build and review tools run on cloud services.</w:t>
+      </w:r>
+    </w:p>
+    <w:p>
+      <w:pPr>
+        <w:pStyle w:val="FirstParagraph"/>
+      </w:pPr>
+      <w:r>
+        <w:t xml:space="preserve">A request still needs its actor:</w:t>
+      </w:r>
+      <w:r>
+        <w:t xml:space="preserve"> </w:t>
+      </w:r>
+      <w:r>
+        <w:t xml:space="preserve">“Could the space be increased, or would you allow me to register my own runner?”</w:t>
+      </w:r>
+      <w:r>
+        <w:t xml:space="preserve"> </w:t>
+      </w:r>
+      <w:r>
+        <w:t xml:space="preserve">keeps</w:t>
+      </w:r>
+      <w:r>
+        <w:t xml:space="preserve"> </w:t>
+      </w:r>
+      <w:r>
+        <w:t xml:space="preserve">“me”</w:t>
+      </w:r>
+      <w:r>
+        <w:t xml:space="preserve"> </w:t>
+      </w:r>
+      <w:r>
+        <w:t xml:space="preserve">because the request is about the writer’s runner.</w:t>
+      </w:r>
+    </w:p>
+    <w:bookmarkEnd w:id="32"/>
+    <w:bookmarkEnd w:id="33"/>
+    <w:bookmarkStart w:id="35" w:name="do-not-overexplain"/>
+    <w:p>
+      <w:pPr>
+        <w:pStyle w:val="Heading2"/>
+      </w:pPr>
+      <w:r>
+        <w:t xml:space="preserve">12 Do not overexplain</w:t>
+      </w:r>
+    </w:p>
+    <w:p>
+      <w:pPr>
+        <w:pStyle w:val="FirstParagraph"/>
+      </w:pPr>
+      <w:r>
+        <w:t xml:space="preserve">Say what the reader needs, and stop.</w:t>
+      </w:r>
+      <w:r>
+        <w:t xml:space="preserve"> </w:t>
+      </w:r>
+      <w:r>
+        <w:t xml:space="preserve">Cut a qualifier, a restatement or a reason that the words before it already imply.</w:t>
+      </w:r>
+    </w:p>
+    <w:bookmarkStart w:id="34" w:name="exm-overexplain"/>
+    <w:p>
+      <w:pPr>
+        <w:pStyle w:val="BodyText"/>
+      </w:pPr>
+      <w:r>
+        <w:rPr>
+          <w:b/>
+          <w:bCs/>
+        </w:rPr>
+        <w:t xml:space="preserve">Example 7 (Cutting a clause the term already implies)</w:t>
+      </w:r>
+      <w:r>
+        <w:t xml:space="preserve"> </w:t>
+      </w:r>
+      <w:r>
+        <w:t xml:space="preserve"> </w:t>
+      </w:r>
+    </w:p>
+    <w:p>
+      <w:pPr>
+        <w:pStyle w:val="BlockText"/>
+      </w:pPr>
+      <w:r>
         <w:t xml:space="preserve">❌ Estimated mean: the estimated value of the mean, whether or not it is a mean of an outcome.</w:t>
       </w:r>
     </w:p>
@@ -2107,15 +2376,15 @@
         <w:t xml:space="preserve">The second is complete.</w:t>
       </w:r>
     </w:p>
-    <w:bookmarkEnd w:id="29"/>
-    <w:bookmarkEnd w:id="30"/>
-    <w:bookmarkStart w:id="37" w:name="put-lists-in-bullet-points"/>
+    <w:bookmarkEnd w:id="34"/>
+    <w:bookmarkEnd w:id="35"/>
+    <w:bookmarkStart w:id="42" w:name="put-lists-in-bullet-points"/>
     <w:p>
       <w:pPr>
         <w:pStyle w:val="Heading2"/>
       </w:pPr>
       <w:r>
-        <w:t xml:space="preserve">11 Put lists in bullet points</w:t>
+        <w:t xml:space="preserve">13 Put lists in bullet points</w:t>
       </w:r>
     </w:p>
     <w:p>
@@ -2303,7 +2572,7 @@
         <w:t xml:space="preserve">.</w:t>
       </w:r>
     </w:p>
-    <w:bookmarkStart w:id="31" w:name="exm-bullet-lists"/>
+    <w:bookmarkStart w:id="36" w:name="exm-bullet-lists"/>
     <w:p>
       <w:pPr>
         <w:pStyle w:val="FirstParagraph"/>
@@ -2313,7 +2582,7 @@
           <w:b/>
           <w:bCs/>
         </w:rPr>
-        <w:t xml:space="preserve">Example 6 (Turning an inline list into bullet points)</w:t>
+        <w:t xml:space="preserve">Example 8 (Turning an inline list into bullet points)</w:t>
       </w:r>
       <w:r>
         <w:t xml:space="preserve"> </w:t>
@@ -2388,8 +2657,8 @@
         <w:t xml:space="preserve">so the reader sees at a glance that there are three.</w:t>
       </w:r>
     </w:p>
-    <w:bookmarkEnd w:id="31"/>
-    <w:bookmarkStart w:id="35" w:name="exm-resource-lists"/>
+    <w:bookmarkEnd w:id="36"/>
+    <w:bookmarkStart w:id="40" w:name="exm-resource-lists"/>
     <w:p>
       <w:pPr>
         <w:pStyle w:val="BodyText"/>
@@ -2399,7 +2668,7 @@
           <w:b/>
           <w:bCs/>
         </w:rPr>
-        <w:t xml:space="preserve">Example 7 (Turning a run of resource sentences into bullet points)</w:t>
+        <w:t xml:space="preserve">Example 9 (Turning a run of resource sentences into bullet points)</w:t>
       </w:r>
       <w:r>
         <w:t xml:space="preserve"> </w:t>
@@ -2418,7 +2687,7 @@
       <w:r>
         <w:t xml:space="preserve"> </w:t>
       </w:r>
-      <w:hyperlink r:id="rId32">
+      <w:hyperlink r:id="rId37">
         <w:r>
           <w:rPr>
             <w:rStyle w:val="Hyperlink"/>
@@ -2432,7 +2701,7 @@
       <w:r>
         <w:t xml:space="preserve"> </w:t>
       </w:r>
-      <w:hyperlink r:id="rId33">
+      <w:hyperlink r:id="rId38">
         <w:r>
           <w:rPr>
             <w:rStyle w:val="Hyperlink"/>
@@ -2466,7 +2735,7 @@
       <w:r>
         <w:t xml:space="preserve"> </w:t>
       </w:r>
-      <w:hyperlink r:id="rId32">
+      <w:hyperlink r:id="rId37">
         <w:r>
           <w:rPr>
             <w:rStyle w:val="Hyperlink"/>
@@ -2492,7 +2761,7 @@
       <w:r>
         <w:t xml:space="preserve"> </w:t>
       </w:r>
-      <w:hyperlink r:id="rId33">
+      <w:hyperlink r:id="rId38">
         <w:r>
           <w:rPr>
             <w:rStyle w:val="Hyperlink"/>
@@ -2514,7 +2783,7 @@
       <w:r>
         <w:t xml:space="preserve"> </w:t>
       </w:r>
-      <w:hyperlink r:id="rId34">
+      <w:hyperlink r:id="rId39">
         <w:r>
           <w:rPr>
             <w:rStyle w:val="Hyperlink"/>
@@ -2538,8 +2807,8 @@
         <w:t xml:space="preserve">so the reader can pick one without parsing the paragraph.</w:t>
       </w:r>
     </w:p>
-    <w:bookmarkEnd w:id="35"/>
-    <w:bookmarkStart w:id="36" w:name="exm-numbered-lists"/>
+    <w:bookmarkEnd w:id="40"/>
+    <w:bookmarkStart w:id="41" w:name="exm-numbered-lists"/>
     <w:p>
       <w:pPr>
         <w:pStyle w:val="BodyText"/>
@@ -2549,7 +2818,7 @@
           <w:b/>
           <w:bCs/>
         </w:rPr>
-        <w:t xml:space="preserve">Example 8 (Turning inline steps into a numbered list)</w:t>
+        <w:t xml:space="preserve">Example 10 (Turning inline steps into a numbered list)</w:t>
       </w:r>
       <w:r>
         <w:t xml:space="preserve"> </w:t>
@@ -2646,15 +2915,15 @@
         <w:t xml:space="preserve">and the loop condition moves into the introducing sentence.</w:t>
       </w:r>
     </w:p>
-    <w:bookmarkEnd w:id="36"/>
-    <w:bookmarkEnd w:id="37"/>
-    <w:bookmarkStart w:id="45" w:name="examples-of-concise-writing"/>
+    <w:bookmarkEnd w:id="41"/>
+    <w:bookmarkEnd w:id="42"/>
+    <w:bookmarkStart w:id="50" w:name="examples-of-concise-writing"/>
     <w:p>
       <w:pPr>
         <w:pStyle w:val="Heading2"/>
       </w:pPr>
       <w:r>
-        <w:t xml:space="preserve">12 Examples of concise writing</w:t>
+        <w:t xml:space="preserve">14 Examples of concise writing</w:t>
       </w:r>
     </w:p>
     <w:p>
@@ -2745,8 +3014,8 @@
         <w:t xml:space="preserve">.</w:t>
       </w:r>
     </w:p>
-    <w:bookmarkStart w:id="44" w:name="refs"/>
-    <w:bookmarkStart w:id="39" w:name="ref-strunk1920elements"/>
+    <w:bookmarkStart w:id="49" w:name="refs"/>
+    <w:bookmarkStart w:id="44" w:name="ref-strunk1920elements"/>
     <w:p>
       <w:pPr>
         <w:pStyle w:val="Bibliography"/>
@@ -2770,7 +3039,7 @@
       <w:r>
         <w:t xml:space="preserve"> </w:t>
       </w:r>
-      <w:hyperlink r:id="rId38">
+      <w:hyperlink r:id="rId43">
         <w:r>
           <w:rPr>
             <w:rStyle w:val="Hyperlink"/>
@@ -2782,8 +3051,8 @@
         <w:t xml:space="preserve">.</w:t>
       </w:r>
     </w:p>
-    <w:bookmarkEnd w:id="39"/>
-    <w:bookmarkStart w:id="41" w:name="ref-hemingway_style"/>
+    <w:bookmarkEnd w:id="44"/>
+    <w:bookmarkStart w:id="46" w:name="ref-hemingway_style"/>
     <w:p>
       <w:pPr>
         <w:pStyle w:val="Bibliography"/>
@@ -2842,7 +3111,7 @@
       <w:r>
         <w:t xml:space="preserve"> </w:t>
       </w:r>
-      <w:hyperlink r:id="rId40">
+      <w:hyperlink r:id="rId45">
         <w:r>
           <w:rPr>
             <w:rStyle w:val="Hyperlink"/>
@@ -2854,8 +3123,8 @@
         <w:t xml:space="preserve">.</w:t>
       </w:r>
     </w:p>
-    <w:bookmarkEnd w:id="41"/>
-    <w:bookmarkStart w:id="43" w:name="ref-caesar_gallic"/>
+    <w:bookmarkEnd w:id="46"/>
+    <w:bookmarkStart w:id="48" w:name="ref-caesar_gallic"/>
     <w:p>
       <w:pPr>
         <w:pStyle w:val="Bibliography"/>
@@ -2914,7 +3183,7 @@
       <w:r>
         <w:t xml:space="preserve"> </w:t>
       </w:r>
-      <w:hyperlink r:id="rId42">
+      <w:hyperlink r:id="rId47">
         <w:r>
           <w:rPr>
             <w:rStyle w:val="Hyperlink"/>
@@ -2926,9 +3195,9 @@
         <w:t xml:space="preserve">.</w:t>
       </w:r>
     </w:p>
-    <w:bookmarkEnd w:id="43"/>
-    <w:bookmarkEnd w:id="44"/>
-    <w:bookmarkEnd w:id="45"/>
+    <w:bookmarkEnd w:id="48"/>
+    <w:bookmarkEnd w:id="49"/>
+    <w:bookmarkEnd w:id="50"/>
     <w:sectPr>
       <w:footnotePr>
         <w:numRestart w:val="eachSect"/>

</xml_diff>

<commit_message>
Deploying to gh-pages from @ Morrison-Lab/psw@1aee8c2f7737e8b229e2c787f6922e7714ceced5 🚀
</commit_message>
<xml_diff>
--- a/chapters/conciseness.docx
+++ b/chapters/conciseness.docx
@@ -15,7 +15,7 @@
         <w:pStyle w:val="Date"/>
       </w:pPr>
       <w:r>
-        <w:t xml:space="preserve">Last modified: 2026-10-25 19:43:06 (PDT)</w:t>
+        <w:t xml:space="preserve">Last modified: 2026-10-25 19:48:50 (PDT)</w:t>
       </w:r>
     </w:p>
     <w:tbl>
@@ -2917,13 +2917,436 @@
     </w:p>
     <w:bookmarkEnd w:id="41"/>
     <w:bookmarkEnd w:id="42"/>
-    <w:bookmarkStart w:id="50" w:name="examples-of-concise-writing"/>
+    <w:bookmarkStart w:id="48" w:name="write-to-communicate-not-to-impress"/>
     <w:p>
       <w:pPr>
         <w:pStyle w:val="Heading2"/>
       </w:pPr>
       <w:r>
-        <w:t xml:space="preserve">14 Examples of concise writing</w:t>
+        <w:t xml:space="preserve">14 Write to communicate, not to impress</w:t>
+      </w:r>
+    </w:p>
+    <w:p>
+      <w:pPr>
+        <w:pStyle w:val="FirstParagraph"/>
+      </w:pPr>
+      <w:r>
+        <w:t xml:space="preserve">Many rules in this chapter serve one aim:</w:t>
+      </w:r>
+      <w:r>
+        <w:t xml:space="preserve"> </w:t>
+      </w:r>
+      <w:r>
+        <w:t xml:space="preserve">the reader should reach your meaning without extra work.</w:t>
+      </w:r>
+      <w:r>
+        <w:t xml:space="preserve"> </w:t>
+      </w:r>
+      <w:r>
+        <w:t xml:space="preserve">A long word, a nested sentence or a crowded paragraph</w:t>
+      </w:r>
+      <w:r>
+        <w:t xml:space="preserve"> </w:t>
+      </w:r>
+      <w:r>
+        <w:t xml:space="preserve">can make a text sound more formal,</w:t>
+      </w:r>
+      <w:r>
+        <w:t xml:space="preserve"> </w:t>
+      </w:r>
+      <w:r>
+        <w:t xml:space="preserve">but it can add work for the reader</w:t>
+      </w:r>
+      <w:r>
+        <w:t xml:space="preserve"> </w:t>
+      </w:r>
+      <w:r>
+        <w:t xml:space="preserve">without adding to the meaning.</w:t>
+      </w:r>
+      <w:r>
+        <w:t xml:space="preserve"> </w:t>
+      </w:r>
+      <w:r>
+        <w:t xml:space="preserve">So at each level of the text,</w:t>
+      </w:r>
+      <w:r>
+        <w:t xml:space="preserve"> </w:t>
+      </w:r>
+      <w:r>
+        <w:t xml:space="preserve">choose the plainest form that still carries the full meaning:</w:t>
+      </w:r>
+    </w:p>
+    <w:p>
+      <w:pPr>
+        <w:pStyle w:val="Compact"/>
+        <w:numPr>
+          <w:ilvl w:val="0"/>
+          <w:numId w:val="1015"/>
+        </w:numPr>
+      </w:pPr>
+      <w:r>
+        <w:t xml:space="preserve">for words, see</w:t>
+      </w:r>
+      <w:r>
+        <w:t xml:space="preserve"> </w:t>
+      </w:r>
+      <w:hyperlink r:id="rId43">
+        <w:r>
+          <w:rPr>
+            <w:rStyle w:val="Hyperlink"/>
+          </w:rPr>
+          <w:t xml:space="preserve">Word choice</w:t>
+        </w:r>
+      </w:hyperlink>
+      <w:r>
+        <w:t xml:space="preserve">;</w:t>
+      </w:r>
+    </w:p>
+    <w:p>
+      <w:pPr>
+        <w:pStyle w:val="Compact"/>
+        <w:numPr>
+          <w:ilvl w:val="0"/>
+          <w:numId w:val="1015"/>
+        </w:numPr>
+      </w:pPr>
+      <w:r>
+        <w:t xml:space="preserve">for sentences, see</w:t>
+      </w:r>
+      <w:r>
+        <w:t xml:space="preserve"> </w:t>
+      </w:r>
+      <w:hyperlink w:anchor="limit-complex-sentence-structures">
+        <w:r>
+          <w:rPr>
+            <w:rStyle w:val="Hyperlink"/>
+          </w:rPr>
+          <w:t xml:space="preserve">Limit complex sentence structures</w:t>
+        </w:r>
+      </w:hyperlink>
+      <w:r>
+        <w:t xml:space="preserve">;</w:t>
+      </w:r>
+    </w:p>
+    <w:p>
+      <w:pPr>
+        <w:pStyle w:val="Compact"/>
+        <w:numPr>
+          <w:ilvl w:val="0"/>
+          <w:numId w:val="1015"/>
+        </w:numPr>
+      </w:pPr>
+      <w:r>
+        <w:t xml:space="preserve">for paragraphs, give each one a single topic,</w:t>
+      </w:r>
+      <w:r>
+        <w:t xml:space="preserve"> </w:t>
+      </w:r>
+      <w:r>
+        <w:t xml:space="preserve">as</w:t>
+      </w:r>
+      <w:r>
+        <w:t xml:space="preserve"> </w:t>
+      </w:r>
+      <w:hyperlink r:id="rId44">
+        <w:r>
+          <w:rPr>
+            <w:rStyle w:val="Hyperlink"/>
+          </w:rPr>
+          <w:t xml:space="preserve">Keep a predictable structure</w:t>
+        </w:r>
+      </w:hyperlink>
+      <w:r>
+        <w:t xml:space="preserve"> </w:t>
+      </w:r>
+      <w:r>
+        <w:t xml:space="preserve">says;</w:t>
+      </w:r>
+    </w:p>
+    <w:p>
+      <w:pPr>
+        <w:pStyle w:val="Compact"/>
+        <w:numPr>
+          <w:ilvl w:val="0"/>
+          <w:numId w:val="1015"/>
+        </w:numPr>
+      </w:pPr>
+      <w:r>
+        <w:t xml:space="preserve">for mathematics, see</w:t>
+      </w:r>
+      <w:r>
+        <w:t xml:space="preserve"> </w:t>
+      </w:r>
+      <w:hyperlink r:id="rId45">
+        <w:r>
+          <w:rPr>
+            <w:rStyle w:val="Hyperlink"/>
+          </w:rPr>
+          <w:t xml:space="preserve">Making expressions concise</w:t>
+        </w:r>
+      </w:hyperlink>
+      <w:r>
+        <w:t xml:space="preserve">.</w:t>
+      </w:r>
+    </w:p>
+    <w:bookmarkStart w:id="47" w:name="exm-communicate-not-impress"/>
+    <w:p>
+      <w:pPr>
+        <w:pStyle w:val="FirstParagraph"/>
+      </w:pPr>
+      <w:r>
+        <w:rPr>
+          <w:b/>
+          <w:bCs/>
+        </w:rPr>
+        <w:t xml:space="preserve">Example 11 (Rewriting a sentence written to sound formal)</w:t>
+      </w:r>
+      <w:r>
+        <w:t xml:space="preserve"> </w:t>
+      </w:r>
+      <w:r>
+        <w:t xml:space="preserve"> </w:t>
+      </w:r>
+    </w:p>
+    <w:p>
+      <w:pPr>
+        <w:pStyle w:val="BlockText"/>
+      </w:pPr>
+      <w:r>
+        <w:t xml:space="preserve">❌ It is imperative to acknowledge that, notwithstanding the methodological constraints</w:t>
+      </w:r>
+      <w:r>
+        <w:t xml:space="preserve"> </w:t>
+      </w:r>
+      <w:r>
+        <w:t xml:space="preserve">that were encountered in the course of the study,</w:t>
+      </w:r>
+      <w:r>
+        <w:t xml:space="preserve"> </w:t>
+      </w:r>
+      <w:r>
+        <w:t xml:space="preserve">the findings that were obtained are indicative of a substantial association</w:t>
+      </w:r>
+      <w:r>
+        <w:t xml:space="preserve"> </w:t>
+      </w:r>
+      <w:r>
+        <w:t xml:space="preserve">between the exposure and the outcome.</w:t>
+      </w:r>
+    </w:p>
+    <w:p>
+      <w:pPr>
+        <w:pStyle w:val="BlockText"/>
+      </w:pPr>
+      <w:r>
+        <w:t xml:space="preserve">✅ Despite the limits of the study’s methods,</w:t>
+      </w:r>
+      <w:r>
+        <w:t xml:space="preserve"> </w:t>
+      </w:r>
+      <w:r>
+        <w:t xml:space="preserve">the results suggest a substantial association between the exposure and the outcome.</w:t>
+      </w:r>
+    </w:p>
+    <w:p>
+      <w:pPr>
+        <w:pStyle w:val="FirstParagraph"/>
+      </w:pPr>
+      <w:r>
+        <w:t xml:space="preserve">The ✅ version drops</w:t>
+      </w:r>
+      <w:r>
+        <w:t xml:space="preserve"> </w:t>
+      </w:r>
+      <w:r>
+        <w:t xml:space="preserve">“It is imperative to acknowledge that”</w:t>
+      </w:r>
+      <w:r>
+        <w:t xml:space="preserve">,</w:t>
+      </w:r>
+      <w:r>
+        <w:t xml:space="preserve"> </w:t>
+      </w:r>
+      <w:r>
+        <w:t xml:space="preserve">which only says that the next claim matters.</w:t>
+      </w:r>
+      <w:r>
+        <w:t xml:space="preserve"> </w:t>
+      </w:r>
+      <w:r>
+        <w:t xml:space="preserve">It replaces</w:t>
+      </w:r>
+      <w:r>
+        <w:t xml:space="preserve"> </w:t>
+      </w:r>
+      <w:r>
+        <w:t xml:space="preserve">“notwithstanding”</w:t>
+      </w:r>
+      <w:r>
+        <w:t xml:space="preserve"> </w:t>
+      </w:r>
+      <w:r>
+        <w:t xml:space="preserve">with</w:t>
+      </w:r>
+      <w:r>
+        <w:t xml:space="preserve"> </w:t>
+      </w:r>
+      <w:r>
+        <w:t xml:space="preserve">“despite”</w:t>
+      </w:r>
+      <w:r>
+        <w:t xml:space="preserve"> </w:t>
+      </w:r>
+      <w:r>
+        <w:t xml:space="preserve">and</w:t>
+      </w:r>
+      <w:r>
+        <w:t xml:space="preserve"> </w:t>
+      </w:r>
+      <w:r>
+        <w:t xml:space="preserve">“are indicative of”</w:t>
+      </w:r>
+      <w:r>
+        <w:t xml:space="preserve"> </w:t>
+      </w:r>
+      <w:r>
+        <w:t xml:space="preserve">with</w:t>
+      </w:r>
+      <w:r>
+        <w:t xml:space="preserve"> </w:t>
+      </w:r>
+      <w:r>
+        <w:t xml:space="preserve">“suggest”</w:t>
+      </w:r>
+      <w:r>
+        <w:t xml:space="preserve">,</w:t>
+      </w:r>
+      <w:r>
+        <w:t xml:space="preserve"> </w:t>
+      </w:r>
+      <w:r>
+        <w:t xml:space="preserve">as</w:t>
+      </w:r>
+      <w:r>
+        <w:t xml:space="preserve"> </w:t>
+      </w:r>
+      <w:hyperlink r:id="rId46">
+        <w:r>
+          <w:rPr>
+            <w:rStyle w:val="Hyperlink"/>
+          </w:rPr>
+          <w:t xml:space="preserve">Replacing unnecessary jargon</w:t>
+        </w:r>
+      </w:hyperlink>
+      <w:r>
+        <w:t xml:space="preserve"> </w:t>
+      </w:r>
+      <w:r>
+        <w:t xml:space="preserve">does for single words.</w:t>
+      </w:r>
+      <w:r>
+        <w:t xml:space="preserve"> </w:t>
+      </w:r>
+      <w:r>
+        <w:t xml:space="preserve">It puts the noun phrases in plainer words too:</w:t>
+      </w:r>
+      <w:r>
+        <w:t xml:space="preserve"> </w:t>
+      </w:r>
+      <w:r>
+        <w:t xml:space="preserve">“methodological constraints”</w:t>
+      </w:r>
+      <w:r>
+        <w:t xml:space="preserve"> </w:t>
+      </w:r>
+      <w:r>
+        <w:t xml:space="preserve">becomes</w:t>
+      </w:r>
+      <w:r>
+        <w:t xml:space="preserve"> </w:t>
+      </w:r>
+      <w:r>
+        <w:t xml:space="preserve">“the limits of the study’s methods”</w:t>
+      </w:r>
+      <w:r>
+        <w:t xml:space="preserve">,</w:t>
+      </w:r>
+      <w:r>
+        <w:t xml:space="preserve"> </w:t>
+      </w:r>
+      <w:r>
+        <w:t xml:space="preserve">and</w:t>
+      </w:r>
+      <w:r>
+        <w:t xml:space="preserve"> </w:t>
+      </w:r>
+      <w:r>
+        <w:t xml:space="preserve">“findings”</w:t>
+      </w:r>
+      <w:r>
+        <w:t xml:space="preserve"> </w:t>
+      </w:r>
+      <w:r>
+        <w:t xml:space="preserve">becomes</w:t>
+      </w:r>
+      <w:r>
+        <w:t xml:space="preserve"> </w:t>
+      </w:r>
+      <w:r>
+        <w:t xml:space="preserve">“results”</w:t>
+      </w:r>
+      <w:r>
+        <w:t xml:space="preserve">.</w:t>
+      </w:r>
+      <w:r>
+        <w:t xml:space="preserve"> </w:t>
+      </w:r>
+      <w:r>
+        <w:t xml:space="preserve">It also removes the relative clauses</w:t>
+      </w:r>
+      <w:r>
+        <w:t xml:space="preserve"> </w:t>
+      </w:r>
+      <w:r>
+        <w:t xml:space="preserve">“that were encountered in the course of the study”</w:t>
+      </w:r>
+      <w:r>
+        <w:t xml:space="preserve"> </w:t>
+      </w:r>
+      <w:r>
+        <w:t xml:space="preserve">and</w:t>
+      </w:r>
+      <w:r>
+        <w:t xml:space="preserve"> </w:t>
+      </w:r>
+      <w:r>
+        <w:t xml:space="preserve">“that were obtained”</w:t>
+      </w:r>
+      <w:r>
+        <w:t xml:space="preserve">,</w:t>
+      </w:r>
+      <w:r>
+        <w:t xml:space="preserve"> </w:t>
+      </w:r>
+      <w:r>
+        <w:t xml:space="preserve">because a study’s constraints are ones it faced,</w:t>
+      </w:r>
+      <w:r>
+        <w:t xml:space="preserve"> </w:t>
+      </w:r>
+      <w:r>
+        <w:t xml:space="preserve">and its findings are ones it obtained.</w:t>
+      </w:r>
+    </w:p>
+    <w:bookmarkEnd w:id="47"/>
+    <w:bookmarkEnd w:id="48"/>
+    <w:bookmarkStart w:id="56" w:name="examples-of-concise-writing"/>
+    <w:p>
+      <w:pPr>
+        <w:pStyle w:val="Heading2"/>
+      </w:pPr>
+      <w:r>
+        <w:t xml:space="preserve">15 Examples of concise writing</w:t>
       </w:r>
     </w:p>
     <w:p>
@@ -3014,8 +3437,8 @@
         <w:t xml:space="preserve">.</w:t>
       </w:r>
     </w:p>
-    <w:bookmarkStart w:id="49" w:name="refs"/>
-    <w:bookmarkStart w:id="44" w:name="ref-strunk1920elements"/>
+    <w:bookmarkStart w:id="55" w:name="refs"/>
+    <w:bookmarkStart w:id="50" w:name="ref-strunk1920elements"/>
     <w:p>
       <w:pPr>
         <w:pStyle w:val="Bibliography"/>
@@ -3039,7 +3462,7 @@
       <w:r>
         <w:t xml:space="preserve"> </w:t>
       </w:r>
-      <w:hyperlink r:id="rId43">
+      <w:hyperlink r:id="rId49">
         <w:r>
           <w:rPr>
             <w:rStyle w:val="Hyperlink"/>
@@ -3051,8 +3474,8 @@
         <w:t xml:space="preserve">.</w:t>
       </w:r>
     </w:p>
-    <w:bookmarkEnd w:id="44"/>
-    <w:bookmarkStart w:id="46" w:name="ref-hemingway_style"/>
+    <w:bookmarkEnd w:id="50"/>
+    <w:bookmarkStart w:id="52" w:name="ref-hemingway_style"/>
     <w:p>
       <w:pPr>
         <w:pStyle w:val="Bibliography"/>
@@ -3111,7 +3534,7 @@
       <w:r>
         <w:t xml:space="preserve"> </w:t>
       </w:r>
-      <w:hyperlink r:id="rId45">
+      <w:hyperlink r:id="rId51">
         <w:r>
           <w:rPr>
             <w:rStyle w:val="Hyperlink"/>
@@ -3123,8 +3546,8 @@
         <w:t xml:space="preserve">.</w:t>
       </w:r>
     </w:p>
-    <w:bookmarkEnd w:id="46"/>
-    <w:bookmarkStart w:id="48" w:name="ref-caesar_gallic"/>
+    <w:bookmarkEnd w:id="52"/>
+    <w:bookmarkStart w:id="54" w:name="ref-caesar_gallic"/>
     <w:p>
       <w:pPr>
         <w:pStyle w:val="Bibliography"/>
@@ -3183,7 +3606,7 @@
       <w:r>
         <w:t xml:space="preserve"> </w:t>
       </w:r>
-      <w:hyperlink r:id="rId47">
+      <w:hyperlink r:id="rId53">
         <w:r>
           <w:rPr>
             <w:rStyle w:val="Hyperlink"/>
@@ -3195,9 +3618,9 @@
         <w:t xml:space="preserve">.</w:t>
       </w:r>
     </w:p>
-    <w:bookmarkEnd w:id="48"/>
-    <w:bookmarkEnd w:id="49"/>
-    <w:bookmarkEnd w:id="50"/>
+    <w:bookmarkEnd w:id="54"/>
+    <w:bookmarkEnd w:id="55"/>
+    <w:bookmarkEnd w:id="56"/>
     <w:sectPr>
       <w:footnotePr>
         <w:numRestart w:val="eachSect"/>
@@ -3567,6 +3990,9 @@
     <w:lvlOverride w:ilvl="8">
       <w:startOverride w:val="1"/>
     </w:lvlOverride>
+  </w:num>
+  <w:num w:numId="1015">
+    <w:abstractNumId w:val="991"/>
   </w:num>
 </w:numbering>
 </file>

</xml_diff>

<commit_message>
Deploying to gh-pages from @ Morrison-Lab/psw@7c6bc4cfe42cd4df5ee7d392c9e558317bcd5c72 🚀
</commit_message>
<xml_diff>
--- a/chapters/conciseness.docx
+++ b/chapters/conciseness.docx
@@ -15,7 +15,7 @@
         <w:pStyle w:val="Date"/>
       </w:pPr>
       <w:r>
-        <w:t xml:space="preserve">Last modified: 2026-10-26 01:27:11 (PDT)</w:t>
+        <w:t xml:space="preserve">Last modified: 2026-10-26 01:33:48 (PDT)</w:t>
       </w:r>
     </w:p>
     <w:tbl>
@@ -2378,7 +2378,7 @@
     </w:p>
     <w:bookmarkEnd w:id="34"/>
     <w:bookmarkEnd w:id="35"/>
-    <w:bookmarkStart w:id="42" w:name="put-lists-in-bullet-points"/>
+    <w:bookmarkStart w:id="43" w:name="put-lists-in-bullet-points"/>
     <w:p>
       <w:pPr>
         <w:pStyle w:val="Heading2"/>
@@ -2480,6 +2480,26 @@
         <w:pStyle w:val="BodyText"/>
       </w:pPr>
       <w:r>
+        <w:t xml:space="preserve">A case analysis is a parallel run too.</w:t>
+      </w:r>
+      <w:r>
+        <w:t xml:space="preserve"> </w:t>
+      </w:r>
+      <w:r>
+        <w:t xml:space="preserve">Write one bullet per case,</w:t>
+      </w:r>
+      <w:r>
+        <w:t xml:space="preserve"> </w:t>
+      </w:r>
+      <w:r>
+        <w:t xml:space="preserve">and begin each with a bold label that names the case.</w:t>
+      </w:r>
+    </w:p>
+    <w:p>
+      <w:pPr>
+        <w:pStyle w:val="BodyText"/>
+      </w:pPr>
+      <w:r>
         <w:t xml:space="preserve">Bullet lists matter most on slides,</w:t>
       </w:r>
       <w:r>
@@ -2506,7 +2526,7 @@
         <w:pStyle w:val="BodyText"/>
       </w:pPr>
       <w:r>
-        <w:t xml:space="preserve">A few mechanics to keep in mind when writing one:</w:t>
+        <w:t xml:space="preserve">A few mechanics to keep in mind when writing a bullet list:</w:t>
       </w:r>
     </w:p>
     <w:p>
@@ -2916,64 +2936,176 @@
       </w:r>
     </w:p>
     <w:bookmarkEnd w:id="41"/>
-    <w:bookmarkEnd w:id="42"/>
-    <w:bookmarkStart w:id="48" w:name="write-to-communicate-not-to-impress"/>
-    <w:p>
-      <w:pPr>
-        <w:pStyle w:val="Heading2"/>
-      </w:pPr>
-      <w:r>
-        <w:t xml:space="preserve">14 Write to communicate, not to impress</w:t>
-      </w:r>
-    </w:p>
-    <w:p>
-      <w:pPr>
-        <w:pStyle w:val="FirstParagraph"/>
-      </w:pPr>
-      <w:r>
-        <w:t xml:space="preserve">Many rules in this chapter serve one aim:</w:t>
-      </w:r>
-      <w:r>
-        <w:t xml:space="preserve"> </w:t>
-      </w:r>
-      <w:r>
-        <w:t xml:space="preserve">the reader should reach your meaning without extra work.</w:t>
-      </w:r>
-      <w:r>
-        <w:t xml:space="preserve"> </w:t>
-      </w:r>
-      <w:r>
-        <w:t xml:space="preserve">A long word, a nested sentence or a crowded paragraph</w:t>
-      </w:r>
-      <w:r>
-        <w:t xml:space="preserve"> </w:t>
-      </w:r>
-      <w:r>
-        <w:t xml:space="preserve">can make a text sound more formal,</w:t>
-      </w:r>
-      <w:r>
-        <w:t xml:space="preserve"> </w:t>
-      </w:r>
-      <w:r>
-        <w:t xml:space="preserve">but it can add work for the reader</w:t>
-      </w:r>
-      <w:r>
-        <w:t xml:space="preserve"> </w:t>
-      </w:r>
-      <w:r>
-        <w:t xml:space="preserve">without adding to the meaning.</w:t>
-      </w:r>
-      <w:r>
-        <w:t xml:space="preserve"> </w:t>
-      </w:r>
-      <w:r>
-        <w:t xml:space="preserve">So at each level of the text,</w:t>
-      </w:r>
-      <w:r>
-        <w:t xml:space="preserve"> </w:t>
-      </w:r>
-      <w:r>
-        <w:t xml:space="preserve">choose the plainest form that still carries the full meaning:</w:t>
+    <w:bookmarkStart w:id="42" w:name="exm-case-bullets"/>
+    <w:p>
+      <w:pPr>
+        <w:pStyle w:val="BodyText"/>
+      </w:pPr>
+      <w:r>
+        <w:rPr>
+          <w:b/>
+          <w:bCs/>
+        </w:rPr>
+        <w:t xml:space="preserve">Example 11 (Turning a paragraph of cases into bullet points)</w:t>
+      </w:r>
+      <w:r>
+        <w:t xml:space="preserve"> </w:t>
+      </w:r>
+      <w:r>
+        <w:t xml:space="preserve"> </w:t>
+      </w:r>
+    </w:p>
+    <w:p>
+      <w:pPr>
+        <w:pStyle w:val="BlockText"/>
+      </w:pPr>
+      <w:r>
+        <w:t xml:space="preserve">❌ At</w:t>
+      </w:r>
+      <w:r>
+        <w:t xml:space="preserve"> </w:t>
+      </w:r>
+      <m:oMath>
+        <m:r>
+          <m:t>z</m:t>
+        </m:r>
+        <m:r>
+          <m:rPr>
+            <m:sty m:val="p"/>
+          </m:rPr>
+          <m:t>=</m:t>
+        </m:r>
+        <m:r>
+          <m:t>0</m:t>
+        </m:r>
+      </m:oMath>
+      <w:r>
+        <w:t xml:space="preserve"> </w:t>
+      </w:r>
+      <w:r>
+        <w:t xml:space="preserve">the slope is</w:t>
+      </w:r>
+      <w:r>
+        <w:t xml:space="preserve"> </w:t>
+      </w:r>
+      <w:r>
+        <w:t xml:space="preserve">$\dexpitf{0} = 1/4$</w:t>
+      </w:r>
+      <w:r>
+        <w:t xml:space="preserve">.</w:t>
+      </w:r>
+      <w:r>
+        <w:t xml:space="preserve"> </w:t>
+      </w:r>
+      <w:r>
+        <w:t xml:space="preserve">At</w:t>
+      </w:r>
+      <w:r>
+        <w:t xml:space="preserve"> </w:t>
+      </w:r>
+      <m:oMath>
+        <m:r>
+          <m:t>z</m:t>
+        </m:r>
+        <m:r>
+          <m:rPr>
+            <m:sty m:val="p"/>
+          </m:rPr>
+          <m:t>=</m:t>
+        </m:r>
+        <m:r>
+          <m:t>2</m:t>
+        </m:r>
+      </m:oMath>
+      <w:r>
+        <w:t xml:space="preserve"> </w:t>
+      </w:r>
+      <w:r>
+        <w:t xml:space="preserve">it is</w:t>
+      </w:r>
+      <w:r>
+        <w:t xml:space="preserve"> </w:t>
+      </w:r>
+      <w:r>
+        <w:t xml:space="preserve">$\dexpitf{2} \approx 0.105$</w:t>
+      </w:r>
+      <w:r>
+        <w:t xml:space="preserve">.</w:t>
+      </w:r>
+      <w:r>
+        <w:t xml:space="preserve"> </w:t>
+      </w:r>
+      <w:r>
+        <w:t xml:space="preserve">At</w:t>
+      </w:r>
+      <w:r>
+        <w:t xml:space="preserve"> </w:t>
+      </w:r>
+      <m:oMath>
+        <m:r>
+          <m:t>z</m:t>
+        </m:r>
+        <m:r>
+          <m:rPr>
+            <m:sty m:val="p"/>
+          </m:rPr>
+          <m:t>=</m:t>
+        </m:r>
+        <m:r>
+          <m:rPr>
+            <m:sty m:val="p"/>
+          </m:rPr>
+          <m:t>−</m:t>
+        </m:r>
+        <m:r>
+          <m:t>2</m:t>
+        </m:r>
+      </m:oMath>
+      <w:r>
+        <w:t xml:space="preserve"> </w:t>
+      </w:r>
+      <w:r>
+        <w:t xml:space="preserve">it is</w:t>
+      </w:r>
+      <w:r>
+        <w:t xml:space="preserve"> </w:t>
+      </w:r>
+      <w:r>
+        <w:t xml:space="preserve">$\dexpitf{-2} \approx 0.105$</w:t>
+      </w:r>
+      <w:r>
+        <w:t xml:space="preserve">.</w:t>
+      </w:r>
+    </w:p>
+    <w:p>
+      <w:pPr>
+        <w:pStyle w:val="BlockText"/>
+      </w:pPr>
+      <w:r>
+        <w:t xml:space="preserve">✅ The slope</w:t>
+      </w:r>
+      <w:r>
+        <w:t xml:space="preserve"> </w:t>
+      </w:r>
+      <w:r>
+        <w:t xml:space="preserve">$\dexpitf{z}$</w:t>
+      </w:r>
+      <w:r>
+        <w:t xml:space="preserve"> </w:t>
+      </w:r>
+      <w:r>
+        <w:t xml:space="preserve">at three values of</w:t>
+      </w:r>
+      <w:r>
+        <w:t xml:space="preserve"> </w:t>
+      </w:r>
+      <m:oMath>
+        <m:r>
+          <m:t>z</m:t>
+        </m:r>
+      </m:oMath>
+      <w:r>
+        <w:t xml:space="preserve">:</w:t>
       </w:r>
     </w:p>
     <w:p>
@@ -2984,13 +3116,211 @@
           <w:numId w:val="1015"/>
         </w:numPr>
       </w:pPr>
+      <m:oMath>
+        <m:r>
+          <m:t>z</m:t>
+        </m:r>
+        <m:r>
+          <m:rPr>
+            <m:sty m:val="p"/>
+          </m:rPr>
+          <m:t>=</m:t>
+        </m:r>
+        <m:r>
+          <m:t>0</m:t>
+        </m:r>
+      </m:oMath>
+      <w:r>
+        <w:rPr>
+          <w:b/>
+          <w:bCs/>
+        </w:rPr>
+        <w:t xml:space="preserve">:</w:t>
+      </w:r>
+      <w:r>
+        <w:t xml:space="preserve"> </w:t>
+      </w:r>
+      <w:r>
+        <w:t xml:space="preserve">$\dexpitf{0} = 1/4$</w:t>
+      </w:r>
+      <w:r>
+        <w:t xml:space="preserve">.</w:t>
+      </w:r>
+    </w:p>
+    <w:p>
+      <w:pPr>
+        <w:pStyle w:val="Compact"/>
+        <w:numPr>
+          <w:ilvl w:val="0"/>
+          <w:numId w:val="1015"/>
+        </w:numPr>
+      </w:pPr>
+      <m:oMath>
+        <m:r>
+          <m:t>z</m:t>
+        </m:r>
+        <m:r>
+          <m:rPr>
+            <m:sty m:val="p"/>
+          </m:rPr>
+          <m:t>=</m:t>
+        </m:r>
+        <m:r>
+          <m:t>2</m:t>
+        </m:r>
+      </m:oMath>
+      <w:r>
+        <w:rPr>
+          <w:b/>
+          <w:bCs/>
+        </w:rPr>
+        <w:t xml:space="preserve">:</w:t>
+      </w:r>
+      <w:r>
+        <w:t xml:space="preserve"> </w:t>
+      </w:r>
+      <w:r>
+        <w:t xml:space="preserve">$\dexpitf{2} \approx 0.105$</w:t>
+      </w:r>
+      <w:r>
+        <w:t xml:space="preserve">.</w:t>
+      </w:r>
+    </w:p>
+    <w:p>
+      <w:pPr>
+        <w:pStyle w:val="Compact"/>
+        <w:numPr>
+          <w:ilvl w:val="0"/>
+          <w:numId w:val="1015"/>
+        </w:numPr>
+      </w:pPr>
+      <m:oMath>
+        <m:r>
+          <m:t>z</m:t>
+        </m:r>
+        <m:r>
+          <m:rPr>
+            <m:sty m:val="p"/>
+          </m:rPr>
+          <m:t>=</m:t>
+        </m:r>
+        <m:r>
+          <m:rPr>
+            <m:sty m:val="p"/>
+          </m:rPr>
+          <m:t>−</m:t>
+        </m:r>
+        <m:r>
+          <m:t>2</m:t>
+        </m:r>
+      </m:oMath>
+      <w:r>
+        <w:rPr>
+          <w:b/>
+          <w:bCs/>
+        </w:rPr>
+        <w:t xml:space="preserve">:</w:t>
+      </w:r>
+      <w:r>
+        <w:t xml:space="preserve"> </w:t>
+      </w:r>
+      <w:r>
+        <w:t xml:space="preserve">$\dexpitf{-2} \approx 0.105$</w:t>
+      </w:r>
+      <w:r>
+        <w:t xml:space="preserve">.</w:t>
+      </w:r>
+    </w:p>
+    <w:p>
+      <w:pPr>
+        <w:pStyle w:val="FirstParagraph"/>
+      </w:pPr>
+      <w:r>
+        <w:t xml:space="preserve">The labels let the reader find a case at a glance,</w:t>
+      </w:r>
+      <w:r>
+        <w:t xml:space="preserve"> </w:t>
+      </w:r>
+      <w:r>
+        <w:t xml:space="preserve">and the bullets show that there are three.</w:t>
+      </w:r>
+    </w:p>
+    <w:bookmarkEnd w:id="42"/>
+    <w:bookmarkEnd w:id="43"/>
+    <w:bookmarkStart w:id="49" w:name="write-to-communicate-not-to-impress"/>
+    <w:p>
+      <w:pPr>
+        <w:pStyle w:val="Heading2"/>
+      </w:pPr>
+      <w:r>
+        <w:t xml:space="preserve">14 Write to communicate, not to impress</w:t>
+      </w:r>
+    </w:p>
+    <w:p>
+      <w:pPr>
+        <w:pStyle w:val="FirstParagraph"/>
+      </w:pPr>
+      <w:r>
+        <w:t xml:space="preserve">Many rules in this chapter serve one aim:</w:t>
+      </w:r>
+      <w:r>
+        <w:t xml:space="preserve"> </w:t>
+      </w:r>
+      <w:r>
+        <w:t xml:space="preserve">the reader should reach your meaning without extra work.</w:t>
+      </w:r>
+      <w:r>
+        <w:t xml:space="preserve"> </w:t>
+      </w:r>
+      <w:r>
+        <w:t xml:space="preserve">A long word, a nested sentence or a crowded paragraph</w:t>
+      </w:r>
+      <w:r>
+        <w:t xml:space="preserve"> </w:t>
+      </w:r>
+      <w:r>
+        <w:t xml:space="preserve">can make a text sound more formal,</w:t>
+      </w:r>
+      <w:r>
+        <w:t xml:space="preserve"> </w:t>
+      </w:r>
+      <w:r>
+        <w:t xml:space="preserve">but it can add work for the reader</w:t>
+      </w:r>
+      <w:r>
+        <w:t xml:space="preserve"> </w:t>
+      </w:r>
+      <w:r>
+        <w:t xml:space="preserve">without adding to the meaning.</w:t>
+      </w:r>
+      <w:r>
+        <w:t xml:space="preserve"> </w:t>
+      </w:r>
+      <w:r>
+        <w:t xml:space="preserve">So at each level of the text,</w:t>
+      </w:r>
+      <w:r>
+        <w:t xml:space="preserve"> </w:t>
+      </w:r>
+      <w:r>
+        <w:t xml:space="preserve">choose the plainest form that still carries the full meaning:</w:t>
+      </w:r>
+    </w:p>
+    <w:p>
+      <w:pPr>
+        <w:pStyle w:val="Compact"/>
+        <w:numPr>
+          <w:ilvl w:val="0"/>
+          <w:numId w:val="1016"/>
+        </w:numPr>
+      </w:pPr>
       <w:r>
         <w:t xml:space="preserve">for words, see</w:t>
       </w:r>
       <w:r>
         <w:t xml:space="preserve"> </w:t>
       </w:r>
-      <w:hyperlink r:id="rId43">
+      <w:hyperlink r:id="rId44">
         <w:r>
           <w:rPr>
             <w:rStyle w:val="Hyperlink"/>
@@ -3007,7 +3337,7 @@
         <w:pStyle w:val="Compact"/>
         <w:numPr>
           <w:ilvl w:val="0"/>
-          <w:numId w:val="1015"/>
+          <w:numId w:val="1016"/>
         </w:numPr>
       </w:pPr>
       <w:r>
@@ -3033,7 +3363,7 @@
         <w:pStyle w:val="Compact"/>
         <w:numPr>
           <w:ilvl w:val="0"/>
-          <w:numId w:val="1015"/>
+          <w:numId w:val="1016"/>
         </w:numPr>
       </w:pPr>
       <w:r>
@@ -3048,7 +3378,7 @@
       <w:r>
         <w:t xml:space="preserve"> </w:t>
       </w:r>
-      <w:hyperlink r:id="rId44">
+      <w:hyperlink r:id="rId45">
         <w:r>
           <w:rPr>
             <w:rStyle w:val="Hyperlink"/>
@@ -3068,7 +3398,7 @@
         <w:pStyle w:val="Compact"/>
         <w:numPr>
           <w:ilvl w:val="0"/>
-          <w:numId w:val="1015"/>
+          <w:numId w:val="1016"/>
         </w:numPr>
       </w:pPr>
       <w:r>
@@ -3077,7 +3407,7 @@
       <w:r>
         <w:t xml:space="preserve"> </w:t>
       </w:r>
-      <w:hyperlink r:id="rId45">
+      <w:hyperlink r:id="rId46">
         <w:r>
           <w:rPr>
             <w:rStyle w:val="Hyperlink"/>
@@ -3089,7 +3419,7 @@
         <w:t xml:space="preserve">.</w:t>
       </w:r>
     </w:p>
-    <w:bookmarkStart w:id="47" w:name="exm-communicate-not-impress"/>
+    <w:bookmarkStart w:id="48" w:name="exm-communicate-not-impress"/>
     <w:p>
       <w:pPr>
         <w:pStyle w:val="FirstParagraph"/>
@@ -3099,7 +3429,7 @@
           <w:b/>
           <w:bCs/>
         </w:rPr>
-        <w:t xml:space="preserve">Example 11 (Rewriting a sentence written to sound formal)</w:t>
+        <w:t xml:space="preserve">Example 12 (Rewriting a sentence written to sound formal)</w:t>
       </w:r>
       <w:r>
         <w:t xml:space="preserve"> </w:t>
@@ -3230,7 +3560,7 @@
       <w:r>
         <w:t xml:space="preserve"> </w:t>
       </w:r>
-      <w:hyperlink r:id="rId46">
+      <w:hyperlink r:id="rId47">
         <w:r>
           <w:rPr>
             <w:rStyle w:val="Hyperlink"/>
@@ -3338,9 +3668,9 @@
         <w:t xml:space="preserve">and its findings are ones it obtained.</w:t>
       </w:r>
     </w:p>
-    <w:bookmarkEnd w:id="47"/>
     <w:bookmarkEnd w:id="48"/>
-    <w:bookmarkStart w:id="56" w:name="examples-of-concise-writing"/>
+    <w:bookmarkEnd w:id="49"/>
+    <w:bookmarkStart w:id="57" w:name="examples-of-concise-writing"/>
     <w:p>
       <w:pPr>
         <w:pStyle w:val="Heading2"/>
@@ -3437,8 +3767,8 @@
         <w:t xml:space="preserve">.</w:t>
       </w:r>
     </w:p>
-    <w:bookmarkStart w:id="55" w:name="refs"/>
-    <w:bookmarkStart w:id="50" w:name="ref-strunk1920elements"/>
+    <w:bookmarkStart w:id="56" w:name="refs"/>
+    <w:bookmarkStart w:id="51" w:name="ref-strunk1920elements"/>
     <w:p>
       <w:pPr>
         <w:pStyle w:val="Bibliography"/>
@@ -3462,7 +3792,7 @@
       <w:r>
         <w:t xml:space="preserve"> </w:t>
       </w:r>
-      <w:hyperlink r:id="rId49">
+      <w:hyperlink r:id="rId50">
         <w:r>
           <w:rPr>
             <w:rStyle w:val="Hyperlink"/>
@@ -3474,8 +3804,8 @@
         <w:t xml:space="preserve">.</w:t>
       </w:r>
     </w:p>
-    <w:bookmarkEnd w:id="50"/>
-    <w:bookmarkStart w:id="52" w:name="ref-hemingway_style"/>
+    <w:bookmarkEnd w:id="51"/>
+    <w:bookmarkStart w:id="53" w:name="ref-hemingway_style"/>
     <w:p>
       <w:pPr>
         <w:pStyle w:val="Bibliography"/>
@@ -3534,7 +3864,7 @@
       <w:r>
         <w:t xml:space="preserve"> </w:t>
       </w:r>
-      <w:hyperlink r:id="rId51">
+      <w:hyperlink r:id="rId52">
         <w:r>
           <w:rPr>
             <w:rStyle w:val="Hyperlink"/>
@@ -3546,8 +3876,8 @@
         <w:t xml:space="preserve">.</w:t>
       </w:r>
     </w:p>
-    <w:bookmarkEnd w:id="52"/>
-    <w:bookmarkStart w:id="54" w:name="ref-caesar_gallic"/>
+    <w:bookmarkEnd w:id="53"/>
+    <w:bookmarkStart w:id="55" w:name="ref-caesar_gallic"/>
     <w:p>
       <w:pPr>
         <w:pStyle w:val="Bibliography"/>
@@ -3606,7 +3936,7 @@
       <w:r>
         <w:t xml:space="preserve"> </w:t>
       </w:r>
-      <w:hyperlink r:id="rId53">
+      <w:hyperlink r:id="rId54">
         <w:r>
           <w:rPr>
             <w:rStyle w:val="Hyperlink"/>
@@ -3618,9 +3948,9 @@
         <w:t xml:space="preserve">.</w:t>
       </w:r>
     </w:p>
-    <w:bookmarkEnd w:id="54"/>
     <w:bookmarkEnd w:id="55"/>
     <w:bookmarkEnd w:id="56"/>
+    <w:bookmarkEnd w:id="57"/>
     <w:sectPr>
       <w:footnotePr>
         <w:numRestart w:val="eachSect"/>
@@ -3992,6 +4322,9 @@
     </w:lvlOverride>
   </w:num>
   <w:num w:numId="1015">
+    <w:abstractNumId w:val="991"/>
+  </w:num>
+  <w:num w:numId="1016">
     <w:abstractNumId w:val="991"/>
   </w:num>
 </w:numbering>

</xml_diff>

<commit_message>
Deploying to gh-pages from @ Morrison-Lab/psw@4fb2ec51535cff7826b0287685e32864439e3f89 🚀
</commit_message>
<xml_diff>
--- a/chapters/conciseness.docx
+++ b/chapters/conciseness.docx
@@ -15,7 +15,7 @@
         <w:pStyle w:val="Date"/>
       </w:pPr>
       <w:r>
-        <w:t xml:space="preserve">Last modified: 2026-10-27 21:26:52 (PDT)</w:t>
+        <w:t xml:space="preserve">Last modified: 2026-10-27 21:52:02 (PDT)</w:t>
       </w:r>
     </w:p>
     <w:tbl>
@@ -2988,9 +2988,63 @@
       <w:r>
         <w:t xml:space="preserve"> </w:t>
       </w:r>
-      <w:r>
-        <w:t xml:space="preserve">$\dexpitf{0} = 1/4$</w:t>
-      </w:r>
+      <m:oMath>
+        <m:sSup>
+          <m:e>
+            <m:r>
+              <m:rPr>
+                <m:sty m:val="p"/>
+              </m:rPr>
+              <m:t>expit</m:t>
+            </m:r>
+          </m:e>
+          <m:sup>
+            <m:r>
+              <m:rPr>
+                <m:sty m:val="p"/>
+              </m:rPr>
+              <m:t>′</m:t>
+            </m:r>
+          </m:sup>
+        </m:sSup>
+        <m:r>
+          <m:t>​</m:t>
+        </m:r>
+        <m:d>
+          <m:dPr>
+            <m:begChr m:val="{"/>
+            <m:sepChr m:val=""/>
+            <m:endChr m:val="}"/>
+            <m:grow/>
+          </m:dPr>
+          <m:e>
+            <m:r>
+              <m:t>0</m:t>
+            </m:r>
+          </m:e>
+        </m:d>
+        <m:r>
+          <m:t>​</m:t>
+        </m:r>
+        <m:r>
+          <m:rPr>
+            <m:sty m:val="p"/>
+          </m:rPr>
+          <m:t>=</m:t>
+        </m:r>
+        <m:r>
+          <m:t>1</m:t>
+        </m:r>
+        <m:r>
+          <m:rPr>
+            <m:sty m:val="p"/>
+          </m:rPr>
+          <m:t>/</m:t>
+        </m:r>
+        <m:r>
+          <m:t>4</m:t>
+        </m:r>
+      </m:oMath>
       <w:r>
         <w:t xml:space="preserve">.</w:t>
       </w:r>
@@ -3026,9 +3080,54 @@
       <w:r>
         <w:t xml:space="preserve"> </w:t>
       </w:r>
-      <w:r>
-        <w:t xml:space="preserve">$\dexpitf{2} \approx 0.105$</w:t>
-      </w:r>
+      <m:oMath>
+        <m:sSup>
+          <m:e>
+            <m:r>
+              <m:rPr>
+                <m:sty m:val="p"/>
+              </m:rPr>
+              <m:t>expit</m:t>
+            </m:r>
+          </m:e>
+          <m:sup>
+            <m:r>
+              <m:rPr>
+                <m:sty m:val="p"/>
+              </m:rPr>
+              <m:t>′</m:t>
+            </m:r>
+          </m:sup>
+        </m:sSup>
+        <m:r>
+          <m:t>​</m:t>
+        </m:r>
+        <m:d>
+          <m:dPr>
+            <m:begChr m:val="{"/>
+            <m:sepChr m:val=""/>
+            <m:endChr m:val="}"/>
+            <m:grow/>
+          </m:dPr>
+          <m:e>
+            <m:r>
+              <m:t>2</m:t>
+            </m:r>
+          </m:e>
+        </m:d>
+        <m:r>
+          <m:t>​</m:t>
+        </m:r>
+        <m:r>
+          <m:rPr>
+            <m:sty m:val="p"/>
+          </m:rPr>
+          <m:t>≈</m:t>
+        </m:r>
+        <m:r>
+          <m:t>0.105</m:t>
+        </m:r>
+      </m:oMath>
       <w:r>
         <w:t xml:space="preserve">.</w:t>
       </w:r>
@@ -3070,9 +3169,60 @@
       <w:r>
         <w:t xml:space="preserve"> </w:t>
       </w:r>
-      <w:r>
-        <w:t xml:space="preserve">$\dexpitf{-2} \approx 0.105$</w:t>
-      </w:r>
+      <m:oMath>
+        <m:sSup>
+          <m:e>
+            <m:r>
+              <m:rPr>
+                <m:sty m:val="p"/>
+              </m:rPr>
+              <m:t>expit</m:t>
+            </m:r>
+          </m:e>
+          <m:sup>
+            <m:r>
+              <m:rPr>
+                <m:sty m:val="p"/>
+              </m:rPr>
+              <m:t>′</m:t>
+            </m:r>
+          </m:sup>
+        </m:sSup>
+        <m:r>
+          <m:t>​</m:t>
+        </m:r>
+        <m:d>
+          <m:dPr>
+            <m:begChr m:val="{"/>
+            <m:sepChr m:val=""/>
+            <m:endChr m:val="}"/>
+            <m:grow/>
+          </m:dPr>
+          <m:e>
+            <m:r>
+              <m:rPr>
+                <m:sty m:val="p"/>
+              </m:rPr>
+              <m:t>−</m:t>
+            </m:r>
+            <m:r>
+              <m:t>2</m:t>
+            </m:r>
+          </m:e>
+        </m:d>
+        <m:r>
+          <m:t>​</m:t>
+        </m:r>
+        <m:r>
+          <m:rPr>
+            <m:sty m:val="p"/>
+          </m:rPr>
+          <m:t>≈</m:t>
+        </m:r>
+        <m:r>
+          <m:t>0.105</m:t>
+        </m:r>
+      </m:oMath>
       <w:r>
         <w:t xml:space="preserve">.</w:t>
       </w:r>
@@ -3087,9 +3237,45 @@
       <w:r>
         <w:t xml:space="preserve"> </w:t>
       </w:r>
-      <w:r>
-        <w:t xml:space="preserve">$\dexpitf{z}$</w:t>
-      </w:r>
+      <m:oMath>
+        <m:sSup>
+          <m:e>
+            <m:r>
+              <m:rPr>
+                <m:sty m:val="p"/>
+              </m:rPr>
+              <m:t>expit</m:t>
+            </m:r>
+          </m:e>
+          <m:sup>
+            <m:r>
+              <m:rPr>
+                <m:sty m:val="p"/>
+              </m:rPr>
+              <m:t>′</m:t>
+            </m:r>
+          </m:sup>
+        </m:sSup>
+        <m:r>
+          <m:t>​</m:t>
+        </m:r>
+        <m:d>
+          <m:dPr>
+            <m:begChr m:val="{"/>
+            <m:sepChr m:val=""/>
+            <m:endChr m:val="}"/>
+            <m:grow/>
+          </m:dPr>
+          <m:e>
+            <m:r>
+              <m:t>z</m:t>
+            </m:r>
+          </m:e>
+        </m:d>
+        <m:r>
+          <m:t>​</m:t>
+        </m:r>
+      </m:oMath>
       <w:r>
         <w:t xml:space="preserve"> </w:t>
       </w:r>
@@ -3140,9 +3326,63 @@
       <w:r>
         <w:t xml:space="preserve"> </w:t>
       </w:r>
-      <w:r>
-        <w:t xml:space="preserve">$\dexpitf{0} = 1/4$</w:t>
-      </w:r>
+      <m:oMath>
+        <m:sSup>
+          <m:e>
+            <m:r>
+              <m:rPr>
+                <m:sty m:val="p"/>
+              </m:rPr>
+              <m:t>expit</m:t>
+            </m:r>
+          </m:e>
+          <m:sup>
+            <m:r>
+              <m:rPr>
+                <m:sty m:val="p"/>
+              </m:rPr>
+              <m:t>′</m:t>
+            </m:r>
+          </m:sup>
+        </m:sSup>
+        <m:r>
+          <m:t>​</m:t>
+        </m:r>
+        <m:d>
+          <m:dPr>
+            <m:begChr m:val="{"/>
+            <m:sepChr m:val=""/>
+            <m:endChr m:val="}"/>
+            <m:grow/>
+          </m:dPr>
+          <m:e>
+            <m:r>
+              <m:t>0</m:t>
+            </m:r>
+          </m:e>
+        </m:d>
+        <m:r>
+          <m:t>​</m:t>
+        </m:r>
+        <m:r>
+          <m:rPr>
+            <m:sty m:val="p"/>
+          </m:rPr>
+          <m:t>=</m:t>
+        </m:r>
+        <m:r>
+          <m:t>1</m:t>
+        </m:r>
+        <m:r>
+          <m:rPr>
+            <m:sty m:val="p"/>
+          </m:rPr>
+          <m:t>/</m:t>
+        </m:r>
+        <m:r>
+          <m:t>4</m:t>
+        </m:r>
+      </m:oMath>
       <w:r>
         <w:t xml:space="preserve">.</w:t>
       </w:r>
@@ -3179,9 +3419,54 @@
       <w:r>
         <w:t xml:space="preserve"> </w:t>
       </w:r>
-      <w:r>
-        <w:t xml:space="preserve">$\dexpitf{2} \approx 0.105$</w:t>
-      </w:r>
+      <m:oMath>
+        <m:sSup>
+          <m:e>
+            <m:r>
+              <m:rPr>
+                <m:sty m:val="p"/>
+              </m:rPr>
+              <m:t>expit</m:t>
+            </m:r>
+          </m:e>
+          <m:sup>
+            <m:r>
+              <m:rPr>
+                <m:sty m:val="p"/>
+              </m:rPr>
+              <m:t>′</m:t>
+            </m:r>
+          </m:sup>
+        </m:sSup>
+        <m:r>
+          <m:t>​</m:t>
+        </m:r>
+        <m:d>
+          <m:dPr>
+            <m:begChr m:val="{"/>
+            <m:sepChr m:val=""/>
+            <m:endChr m:val="}"/>
+            <m:grow/>
+          </m:dPr>
+          <m:e>
+            <m:r>
+              <m:t>2</m:t>
+            </m:r>
+          </m:e>
+        </m:d>
+        <m:r>
+          <m:t>​</m:t>
+        </m:r>
+        <m:r>
+          <m:rPr>
+            <m:sty m:val="p"/>
+          </m:rPr>
+          <m:t>≈</m:t>
+        </m:r>
+        <m:r>
+          <m:t>0.105</m:t>
+        </m:r>
+      </m:oMath>
       <w:r>
         <w:t xml:space="preserve">.</w:t>
       </w:r>
@@ -3224,9 +3509,60 @@
       <w:r>
         <w:t xml:space="preserve"> </w:t>
       </w:r>
-      <w:r>
-        <w:t xml:space="preserve">$\dexpitf{-2} \approx 0.105$</w:t>
-      </w:r>
+      <m:oMath>
+        <m:sSup>
+          <m:e>
+            <m:r>
+              <m:rPr>
+                <m:sty m:val="p"/>
+              </m:rPr>
+              <m:t>expit</m:t>
+            </m:r>
+          </m:e>
+          <m:sup>
+            <m:r>
+              <m:rPr>
+                <m:sty m:val="p"/>
+              </m:rPr>
+              <m:t>′</m:t>
+            </m:r>
+          </m:sup>
+        </m:sSup>
+        <m:r>
+          <m:t>​</m:t>
+        </m:r>
+        <m:d>
+          <m:dPr>
+            <m:begChr m:val="{"/>
+            <m:sepChr m:val=""/>
+            <m:endChr m:val="}"/>
+            <m:grow/>
+          </m:dPr>
+          <m:e>
+            <m:r>
+              <m:rPr>
+                <m:sty m:val="p"/>
+              </m:rPr>
+              <m:t>−</m:t>
+            </m:r>
+            <m:r>
+              <m:t>2</m:t>
+            </m:r>
+          </m:e>
+        </m:d>
+        <m:r>
+          <m:t>​</m:t>
+        </m:r>
+        <m:r>
+          <m:rPr>
+            <m:sty m:val="p"/>
+          </m:rPr>
+          <m:t>≈</m:t>
+        </m:r>
+        <m:r>
+          <m:t>0.105</m:t>
+        </m:r>
+      </m:oMath>
       <w:r>
         <w:t xml:space="preserve">.</w:t>
       </w:r>

</xml_diff>

<commit_message>
Deploying to gh-pages from @ Morrison-Lab/psw@1fa4cfd462c665e0ccf3260d414bcf621dc2c45c 🚀
</commit_message>
<xml_diff>
--- a/chapters/conciseness.docx
+++ b/chapters/conciseness.docx
@@ -15,7 +15,7 @@
         <w:pStyle w:val="Date"/>
       </w:pPr>
       <w:r>
-        <w:t xml:space="preserve">Last modified: 2026-10-28 20:05:55 (PDT)</w:t>
+        <w:t xml:space="preserve">Last modified: 2026-10-28 20:59:43 (PDT)</w:t>
       </w:r>
     </w:p>
     <w:tbl>
@@ -1438,7 +1438,7 @@
     </w:p>
     <w:bookmarkEnd w:id="21"/>
     <w:bookmarkEnd w:id="22"/>
-    <w:bookmarkStart w:id="24" w:name="X831e99641ea6e3d916f49fb78be48dc576ff061"/>
+    <w:bookmarkStart w:id="25" w:name="X831e99641ea6e3d916f49fb78be48dc576ff061"/>
     <w:p>
       <w:pPr>
         <w:pStyle w:val="Heading2"/>
@@ -1634,6 +1634,214 @@
         <w:pStyle w:val="BodyText"/>
       </w:pPr>
       <w:r>
+        <w:t xml:space="preserve">A contrast you keep must not be a straw man.</w:t>
+      </w:r>
+      <w:r>
+        <w:t xml:space="preserve"> </w:t>
+      </w:r>
+      <w:r>
+        <w:t xml:space="preserve">Say who holds the confusing reading, and cite a source that shows it,</w:t>
+      </w:r>
+      <w:r>
+        <w:t xml:space="preserve"> </w:t>
+      </w:r>
+      <w:r>
+        <w:t xml:space="preserve">so the reader sees why the alternative needs ruling out.</w:t>
+      </w:r>
+      <w:r>
+        <w:t xml:space="preserve"> </w:t>
+      </w:r>
+      <w:r>
+        <w:t xml:space="preserve">A bare</w:t>
+      </w:r>
+      <w:r>
+        <w:t xml:space="preserve"> </w:t>
+      </w:r>
+      <w:r>
+        <w:t xml:space="preserve">“not X”</w:t>
+      </w:r>
+      <w:r>
+        <w:t xml:space="preserve"> </w:t>
+      </w:r>
+      <w:r>
+        <w:t xml:space="preserve">leaves the reader to guess</w:t>
+      </w:r>
+      <w:r>
+        <w:t xml:space="preserve"> </w:t>
+      </w:r>
+      <w:r>
+        <w:t xml:space="preserve">whether anyone reads the term as X.</w:t>
+      </w:r>
+      <w:r>
+        <w:t xml:space="preserve"> </w:t>
+      </w:r>
+      <w:r>
+        <w:t xml:space="preserve"> </w:t>
+      </w:r>
+      <w:r>
+        <w:t xml:space="preserve">If you cannot find a source or a reader who holds the reading,</w:t>
+      </w:r>
+      <w:r>
+        <w:t xml:space="preserve"> </w:t>
+      </w:r>
+      <w:r>
+        <w:t xml:space="preserve">the contrast fails the test above, so remove it.</w:t>
+      </w:r>
+    </w:p>
+    <w:bookmarkStart w:id="24" w:name="exm-fleshed-out-contrast"/>
+    <w:p>
+      <w:pPr>
+        <w:pStyle w:val="BodyText"/>
+      </w:pPr>
+      <w:r>
+        <w:rPr>
+          <w:b/>
+          <w:bCs/>
+        </w:rPr>
+        <w:t xml:space="preserve">Example 3 (Explaining the contrast, or dropping it)</w:t>
+      </w:r>
+      <w:r>
+        <w:t xml:space="preserve"> </w:t>
+      </w:r>
+      <w:r>
+        <w:t xml:space="preserve"> </w:t>
+      </w:r>
+    </w:p>
+    <w:p>
+      <w:pPr>
+        <w:pStyle w:val="BlockText"/>
+      </w:pPr>
+      <w:r>
+        <w:t xml:space="preserve">❌ Statistics uses</w:t>
+      </w:r>
+      <w:r>
+        <w:t xml:space="preserve"> </w:t>
+      </w:r>
+      <w:r>
+        <w:t xml:space="preserve">“predictor”</w:t>
+      </w:r>
+      <w:r>
+        <w:t xml:space="preserve"> </w:t>
+      </w:r>
+      <w:r>
+        <w:t xml:space="preserve">for a feature, not for a model.</w:t>
+      </w:r>
+    </w:p>
+    <w:p>
+      <w:pPr>
+        <w:pStyle w:val="BlockText"/>
+      </w:pPr>
+      <w:r>
+        <w:t xml:space="preserve">✅ Statistics uses</w:t>
+      </w:r>
+      <w:r>
+        <w:t xml:space="preserve"> </w:t>
+      </w:r>
+      <w:r>
+        <w:t xml:space="preserve">“predictor”</w:t>
+      </w:r>
+      <w:r>
+        <w:t xml:space="preserve"> </w:t>
+      </w:r>
+      <w:r>
+        <w:t xml:space="preserve">for a feature.</w:t>
+      </w:r>
+      <w:r>
+        <w:t xml:space="preserve"> </w:t>
+      </w:r>
+      <w:r>
+        <w:t xml:space="preserve">Some machine learning texts use the same word for a fitted prediction function:</w:t>
+      </w:r>
+      <w:r>
+        <w:t xml:space="preserve"> </w:t>
+      </w:r>
+      <w:r>
+        <w:t xml:space="preserve"> </w:t>
+      </w:r>
+      <w:r>
+        <w:t xml:space="preserve">Hastie, Tibshirani and Friedman call the averaged forest function</w:t>
+      </w:r>
+      <w:r>
+        <w:t xml:space="preserve"> </w:t>
+      </w:r>
+      <w:r>
+        <w:t xml:space="preserve">“the random forest (regression) predictor”</w:t>
+      </w:r>
+      <w:r>
+        <w:t xml:space="preserve"> </w:t>
+      </w:r>
+      <w:r>
+        <w:t xml:space="preserve">(Hastie et al. 2009, equation 15.2)</w:t>
+      </w:r>
+      <w:r>
+        <w:t xml:space="preserve">.</w:t>
+      </w:r>
+      <w:r>
+        <w:t xml:space="preserve"> </w:t>
+      </w:r>
+      <w:r>
+        <w:t xml:space="preserve">In these notes,</w:t>
+      </w:r>
+      <w:r>
+        <w:t xml:space="preserve"> </w:t>
+      </w:r>
+      <w:r>
+        <w:t xml:space="preserve">“predictor”</w:t>
+      </w:r>
+      <w:r>
+        <w:t xml:space="preserve"> </w:t>
+      </w:r>
+      <w:r>
+        <w:t xml:space="preserve">always means a feature.</w:t>
+      </w:r>
+    </w:p>
+    <w:p>
+      <w:pPr>
+        <w:pStyle w:val="FirstParagraph"/>
+      </w:pPr>
+      <w:r>
+        <w:t xml:space="preserve">The first version rules out a reading without saying that anyone holds it.</w:t>
+      </w:r>
+      <w:r>
+        <w:t xml:space="preserve"> </w:t>
+      </w:r>
+      <w:r>
+        <w:t xml:space="preserve">The second shows that the reading exists, with a source,</w:t>
+      </w:r>
+      <w:r>
+        <w:t xml:space="preserve"> </w:t>
+      </w:r>
+      <w:r>
+        <w:t xml:space="preserve">and says which meaning the text uses.</w:t>
+      </w:r>
+      <w:r>
+        <w:t xml:space="preserve"> </w:t>
+      </w:r>
+      <w:r>
+        <w:t xml:space="preserve">If no text used the word that way,</w:t>
+      </w:r>
+      <w:r>
+        <w:t xml:space="preserve"> </w:t>
+      </w:r>
+      <w:r>
+        <w:t xml:space="preserve">the right revision would be to delete the clause</w:t>
+      </w:r>
+      <w:r>
+        <w:t xml:space="preserve"> </w:t>
+      </w:r>
+      <w:r>
+        <w:t xml:space="preserve">“not for a model”</w:t>
+      </w:r>
+      <w:r>
+        <w:t xml:space="preserve">.</w:t>
+      </w:r>
+    </w:p>
+    <w:bookmarkEnd w:id="24"/>
+    <w:p>
+      <w:pPr>
+        <w:pStyle w:val="BodyText"/>
+      </w:pPr>
+      <w:r>
         <w:t xml:space="preserve">The same test applies to explanations:</w:t>
       </w:r>
       <w:r>
@@ -1661,8 +1869,8 @@
         <w:t xml:space="preserve">a report for clinicians might.</w:t>
       </w:r>
     </w:p>
-    <w:bookmarkEnd w:id="24"/>
-    <w:bookmarkStart w:id="26" w:name="avoid-double-negatives"/>
+    <w:bookmarkEnd w:id="25"/>
+    <w:bookmarkStart w:id="27" w:name="avoid-double-negatives"/>
     <w:p>
       <w:pPr>
         <w:pStyle w:val="Heading2"/>
@@ -1779,7 +1987,7 @@
         <w:t xml:space="preserve">and it is the standard wording for a test result.</w:t>
       </w:r>
     </w:p>
-    <w:bookmarkStart w:id="25" w:name="exm-double-negative"/>
+    <w:bookmarkStart w:id="26" w:name="exm-double-negative"/>
     <w:p>
       <w:pPr>
         <w:pStyle w:val="BodyText"/>
@@ -1789,7 +1997,7 @@
           <w:b/>
           <w:bCs/>
         </w:rPr>
-        <w:t xml:space="preserve">Example 3 (Stating a claim directly)</w:t>
+        <w:t xml:space="preserve">Example 4 (Stating a claim directly)</w:t>
       </w:r>
       <w:r>
         <w:t xml:space="preserve"> </w:t>
@@ -1880,9 +2088,9 @@
         <w:t xml:space="preserve">Choose the one you mean.</w:t>
       </w:r>
     </w:p>
-    <w:bookmarkEnd w:id="25"/>
     <w:bookmarkEnd w:id="26"/>
-    <w:bookmarkStart w:id="29" w:name="Xa757197b9b942a803dc05820332a104a8aaeee4"/>
+    <w:bookmarkEnd w:id="27"/>
+    <w:bookmarkStart w:id="30" w:name="Xa757197b9b942a803dc05820332a104a8aaeee4"/>
     <w:p>
       <w:pPr>
         <w:pStyle w:val="Heading2"/>
@@ -1963,7 +2171,7 @@
       <w:r>
         <w:t xml:space="preserve"> </w:t>
       </w:r>
-      <w:hyperlink r:id="rId27">
+      <w:hyperlink r:id="rId28">
         <w:r>
           <w:rPr>
             <w:rStyle w:val="Hyperlink"/>
@@ -1987,7 +2195,7 @@
         <w:t xml:space="preserve">.</w:t>
       </w:r>
     </w:p>
-    <w:bookmarkStart w:id="28" w:name="exm-self-referential"/>
+    <w:bookmarkStart w:id="29" w:name="exm-self-referential"/>
     <w:p>
       <w:pPr>
         <w:pStyle w:val="BodyText"/>
@@ -1997,7 +2205,7 @@
           <w:b/>
           <w:bCs/>
         </w:rPr>
-        <w:t xml:space="preserve">Example 4 (Replacing a sentence about the text)</w:t>
+        <w:t xml:space="preserve">Example 5 (Replacing a sentence about the text)</w:t>
       </w:r>
       <w:r>
         <w:t xml:space="preserve"> </w:t>
@@ -2086,9 +2294,9 @@
         <w:t xml:space="preserve">instead of saying that it changes something.</w:t>
       </w:r>
     </w:p>
-    <w:bookmarkEnd w:id="28"/>
     <w:bookmarkEnd w:id="29"/>
-    <w:bookmarkStart w:id="32" w:name="let-a-self-describing-link-stand-alone"/>
+    <w:bookmarkEnd w:id="30"/>
+    <w:bookmarkStart w:id="33" w:name="let-a-self-describing-link-stand-alone"/>
     <w:p>
       <w:pPr>
         <w:pStyle w:val="Heading2"/>
@@ -2123,7 +2331,7 @@
         <w:t xml:space="preserve">The reader would read the same facts twice.</w:t>
       </w:r>
     </w:p>
-    <w:bookmarkStart w:id="31" w:name="exm-self-describing-link"/>
+    <w:bookmarkStart w:id="32" w:name="exm-self-describing-link"/>
     <w:p>
       <w:pPr>
         <w:pStyle w:val="BodyText"/>
@@ -2133,7 +2341,7 @@
           <w:b/>
           <w:bCs/>
         </w:rPr>
-        <w:t xml:space="preserve">Example 5 (Dropping prose that repeats a URL)</w:t>
+        <w:t xml:space="preserve">Example 6 (Dropping prose that repeats a URL)</w:t>
       </w:r>
       <w:r>
         <w:t xml:space="preserve"> </w:t>
@@ -2155,7 +2363,7 @@
       <w:r>
         <w:t xml:space="preserve">(</w:t>
       </w:r>
-      <w:hyperlink r:id="rId30">
+      <w:hyperlink r:id="rId31">
         <w:r>
           <w:rPr>
             <w:rStyle w:val="Hyperlink"/>
@@ -2177,7 +2385,7 @@
       <w:r>
         <w:t xml:space="preserve"> </w:t>
       </w:r>
-      <w:hyperlink r:id="rId30">
+      <w:hyperlink r:id="rId31">
         <w:r>
           <w:rPr>
             <w:rStyle w:val="Hyperlink"/>
@@ -2215,7 +2423,7 @@
         <w:t xml:space="preserve">.</w:t>
       </w:r>
     </w:p>
-    <w:bookmarkEnd w:id="31"/>
+    <w:bookmarkEnd w:id="32"/>
     <w:p>
       <w:pPr>
         <w:pStyle w:val="BodyText"/>
@@ -2230,8 +2438,8 @@
         <w:t xml:space="preserve">such as a DOI or a shortened link.</w:t>
       </w:r>
     </w:p>
-    <w:bookmarkEnd w:id="32"/>
-    <w:bookmarkStart w:id="34" w:name="keep-the-writer-out-of-the-way"/>
+    <w:bookmarkEnd w:id="33"/>
+    <w:bookmarkStart w:id="35" w:name="keep-the-writer-out-of-the-way"/>
     <w:p>
       <w:pPr>
         <w:pStyle w:val="Heading2"/>
@@ -2272,7 +2480,7 @@
         <w:t xml:space="preserve">Extra references to the writer turn attention from the content to the person.</w:t>
       </w:r>
     </w:p>
-    <w:bookmarkStart w:id="33" w:name="exm-writer-out-of-the-way"/>
+    <w:bookmarkStart w:id="34" w:name="exm-writer-out-of-the-way"/>
     <w:p>
       <w:pPr>
         <w:pStyle w:val="BodyText"/>
@@ -2282,7 +2490,7 @@
           <w:b/>
           <w:bCs/>
         </w:rPr>
-        <w:t xml:space="preserve">Example 6 (Moving the focus from the writer to the subject)</w:t>
+        <w:t xml:space="preserve">Example 7 (Moving the focus from the writer to the subject)</w:t>
       </w:r>
       <w:r>
         <w:t xml:space="preserve"> </w:t>
@@ -2358,9 +2566,9 @@
         <w:t xml:space="preserve">because the request is about the writer’s runner.</w:t>
       </w:r>
     </w:p>
-    <w:bookmarkEnd w:id="33"/>
     <w:bookmarkEnd w:id="34"/>
-    <w:bookmarkStart w:id="36" w:name="do-not-overexplain"/>
+    <w:bookmarkEnd w:id="35"/>
+    <w:bookmarkStart w:id="37" w:name="do-not-overexplain"/>
     <w:p>
       <w:pPr>
         <w:pStyle w:val="Heading2"/>
@@ -2383,7 +2591,7 @@
         <w:t xml:space="preserve">Cut a qualifier, a restatement or a reason that the words before it already imply.</w:t>
       </w:r>
     </w:p>
-    <w:bookmarkStart w:id="35" w:name="exm-overexplain"/>
+    <w:bookmarkStart w:id="36" w:name="exm-overexplain"/>
     <w:p>
       <w:pPr>
         <w:pStyle w:val="BodyText"/>
@@ -2393,7 +2601,7 @@
           <w:b/>
           <w:bCs/>
         </w:rPr>
-        <w:t xml:space="preserve">Example 7 (Cutting a clause the term already implies)</w:t>
+        <w:t xml:space="preserve">Example 8 (Cutting a clause the term already implies)</w:t>
       </w:r>
       <w:r>
         <w:t xml:space="preserve"> </w:t>
@@ -2444,9 +2652,9 @@
         <w:t xml:space="preserve">The second is complete.</w:t>
       </w:r>
     </w:p>
-    <w:bookmarkEnd w:id="35"/>
     <w:bookmarkEnd w:id="36"/>
-    <w:bookmarkStart w:id="44" w:name="put-lists-in-bullet-points"/>
+    <w:bookmarkEnd w:id="37"/>
+    <w:bookmarkStart w:id="45" w:name="put-lists-in-bullet-points"/>
     <w:p>
       <w:pPr>
         <w:pStyle w:val="Heading2"/>
@@ -2660,7 +2868,7 @@
         <w:t xml:space="preserve">.</w:t>
       </w:r>
     </w:p>
-    <w:bookmarkStart w:id="37" w:name="exm-bullet-lists"/>
+    <w:bookmarkStart w:id="38" w:name="exm-bullet-lists"/>
     <w:p>
       <w:pPr>
         <w:pStyle w:val="FirstParagraph"/>
@@ -2670,7 +2878,7 @@
           <w:b/>
           <w:bCs/>
         </w:rPr>
-        <w:t xml:space="preserve">Example 8 (Turning an inline list into bullet points)</w:t>
+        <w:t xml:space="preserve">Example 9 (Turning an inline list into bullet points)</w:t>
       </w:r>
       <w:r>
         <w:t xml:space="preserve"> </w:t>
@@ -2745,8 +2953,8 @@
         <w:t xml:space="preserve">so the reader sees at a glance that there are three.</w:t>
       </w:r>
     </w:p>
-    <w:bookmarkEnd w:id="37"/>
-    <w:bookmarkStart w:id="41" w:name="exm-resource-lists"/>
+    <w:bookmarkEnd w:id="38"/>
+    <w:bookmarkStart w:id="42" w:name="exm-resource-lists"/>
     <w:p>
       <w:pPr>
         <w:pStyle w:val="BodyText"/>
@@ -2756,7 +2964,7 @@
           <w:b/>
           <w:bCs/>
         </w:rPr>
-        <w:t xml:space="preserve">Example 9 (Turning a run of resource sentences into bullet points)</w:t>
+        <w:t xml:space="preserve">Example 10 (Turning a run of resource sentences into bullet points)</w:t>
       </w:r>
       <w:r>
         <w:t xml:space="preserve"> </w:t>
@@ -2775,7 +2983,7 @@
       <w:r>
         <w:t xml:space="preserve"> </w:t>
       </w:r>
-      <w:hyperlink r:id="rId38">
+      <w:hyperlink r:id="rId39">
         <w:r>
           <w:rPr>
             <w:rStyle w:val="Hyperlink"/>
@@ -2789,7 +2997,7 @@
       <w:r>
         <w:t xml:space="preserve"> </w:t>
       </w:r>
-      <w:hyperlink r:id="rId39">
+      <w:hyperlink r:id="rId40">
         <w:r>
           <w:rPr>
             <w:rStyle w:val="Hyperlink"/>
@@ -2823,7 +3031,7 @@
       <w:r>
         <w:t xml:space="preserve"> </w:t>
       </w:r>
-      <w:hyperlink r:id="rId38">
+      <w:hyperlink r:id="rId39">
         <w:r>
           <w:rPr>
             <w:rStyle w:val="Hyperlink"/>
@@ -2849,7 +3057,7 @@
       <w:r>
         <w:t xml:space="preserve"> </w:t>
       </w:r>
-      <w:hyperlink r:id="rId39">
+      <w:hyperlink r:id="rId40">
         <w:r>
           <w:rPr>
             <w:rStyle w:val="Hyperlink"/>
@@ -2871,7 +3079,7 @@
       <w:r>
         <w:t xml:space="preserve"> </w:t>
       </w:r>
-      <w:hyperlink r:id="rId40">
+      <w:hyperlink r:id="rId41">
         <w:r>
           <w:rPr>
             <w:rStyle w:val="Hyperlink"/>
@@ -2895,8 +3103,8 @@
         <w:t xml:space="preserve">so the reader can pick one without parsing the paragraph.</w:t>
       </w:r>
     </w:p>
-    <w:bookmarkEnd w:id="41"/>
-    <w:bookmarkStart w:id="42" w:name="exm-numbered-lists"/>
+    <w:bookmarkEnd w:id="42"/>
+    <w:bookmarkStart w:id="43" w:name="exm-numbered-lists"/>
     <w:p>
       <w:pPr>
         <w:pStyle w:val="BodyText"/>
@@ -2906,7 +3114,7 @@
           <w:b/>
           <w:bCs/>
         </w:rPr>
-        <w:t xml:space="preserve">Example 10 (Turning inline steps into a numbered list)</w:t>
+        <w:t xml:space="preserve">Example 11 (Turning inline steps into a numbered list)</w:t>
       </w:r>
       <w:r>
         <w:t xml:space="preserve"> </w:t>
@@ -3003,8 +3211,8 @@
         <w:t xml:space="preserve">and the loop condition moves into the introducing sentence.</w:t>
       </w:r>
     </w:p>
-    <w:bookmarkEnd w:id="42"/>
-    <w:bookmarkStart w:id="43" w:name="exm-case-bullets"/>
+    <w:bookmarkEnd w:id="43"/>
+    <w:bookmarkStart w:id="44" w:name="exm-case-bullets"/>
     <w:p>
       <w:pPr>
         <w:pStyle w:val="BodyText"/>
@@ -3014,7 +3222,7 @@
           <w:b/>
           <w:bCs/>
         </w:rPr>
-        <w:t xml:space="preserve">Example 11 (Turning a paragraph of cases into bullet points)</w:t>
+        <w:t xml:space="preserve">Example 12 (Turning a paragraph of cases into bullet points)</w:t>
       </w:r>
       <w:r>
         <w:t xml:space="preserve"> </w:t>
@@ -3649,9 +3857,9 @@
         <w:t xml:space="preserve">and the bullets show that there are three.</w:t>
       </w:r>
     </w:p>
-    <w:bookmarkEnd w:id="43"/>
     <w:bookmarkEnd w:id="44"/>
-    <w:bookmarkStart w:id="50" w:name="write-to-communicate-not-to-impress"/>
+    <w:bookmarkEnd w:id="45"/>
+    <w:bookmarkStart w:id="51" w:name="write-to-communicate-not-to-impress"/>
     <w:p>
       <w:pPr>
         <w:pStyle w:val="Heading2"/>
@@ -3724,7 +3932,7 @@
       <w:r>
         <w:t xml:space="preserve"> </w:t>
       </w:r>
-      <w:hyperlink r:id="rId45">
+      <w:hyperlink r:id="rId46">
         <w:r>
           <w:rPr>
             <w:rStyle w:val="Hyperlink"/>
@@ -3782,7 +3990,7 @@
       <w:r>
         <w:t xml:space="preserve"> </w:t>
       </w:r>
-      <w:hyperlink r:id="rId46">
+      <w:hyperlink r:id="rId47">
         <w:r>
           <w:rPr>
             <w:rStyle w:val="Hyperlink"/>
@@ -3811,7 +4019,7 @@
       <w:r>
         <w:t xml:space="preserve"> </w:t>
       </w:r>
-      <w:hyperlink r:id="rId47">
+      <w:hyperlink r:id="rId48">
         <w:r>
           <w:rPr>
             <w:rStyle w:val="Hyperlink"/>
@@ -3823,7 +4031,7 @@
         <w:t xml:space="preserve">.</w:t>
       </w:r>
     </w:p>
-    <w:bookmarkStart w:id="49" w:name="exm-communicate-not-impress"/>
+    <w:bookmarkStart w:id="50" w:name="exm-communicate-not-impress"/>
     <w:p>
       <w:pPr>
         <w:pStyle w:val="FirstParagraph"/>
@@ -3833,7 +4041,7 @@
           <w:b/>
           <w:bCs/>
         </w:rPr>
-        <w:t xml:space="preserve">Example 12 (Rewriting a sentence written to sound formal)</w:t>
+        <w:t xml:space="preserve">Example 13 (Rewriting a sentence written to sound formal)</w:t>
       </w:r>
       <w:r>
         <w:t xml:space="preserve"> </w:t>
@@ -3964,7 +4172,7 @@
       <w:r>
         <w:t xml:space="preserve"> </w:t>
       </w:r>
-      <w:hyperlink r:id="rId48">
+      <w:hyperlink r:id="rId49">
         <w:r>
           <w:rPr>
             <w:rStyle w:val="Hyperlink"/>
@@ -4072,9 +4280,9 @@
         <w:t xml:space="preserve">and its findings are ones it obtained.</w:t>
       </w:r>
     </w:p>
-    <w:bookmarkEnd w:id="49"/>
     <w:bookmarkEnd w:id="50"/>
-    <w:bookmarkStart w:id="58" w:name="examples-of-concise-writing"/>
+    <w:bookmarkEnd w:id="51"/>
+    <w:bookmarkStart w:id="61" w:name="examples-of-concise-writing"/>
     <w:p>
       <w:pPr>
         <w:pStyle w:val="Heading2"/>
@@ -4171,8 +4379,45 @@
         <w:t xml:space="preserve">.</w:t>
       </w:r>
     </w:p>
-    <w:bookmarkStart w:id="57" w:name="refs"/>
-    <w:bookmarkStart w:id="52" w:name="ref-strunk1920elements"/>
+    <w:bookmarkStart w:id="60" w:name="refs"/>
+    <w:bookmarkStart w:id="53" w:name="ref-hastie2009esl"/>
+    <w:p>
+      <w:pPr>
+        <w:pStyle w:val="Bibliography"/>
+      </w:pPr>
+      <w:r>
+        <w:t xml:space="preserve">Hastie, Trevor, Robert Tibshirani, and Jerome Friedman. 2009.</w:t>
+      </w:r>
+      <w:r>
+        <w:t xml:space="preserve"> </w:t>
+      </w:r>
+      <w:r>
+        <w:rPr>
+          <w:i/>
+          <w:iCs/>
+        </w:rPr>
+        <w:t xml:space="preserve">The Elements of Statistical Learning: Data Mining, Inference, and Prediction</w:t>
+      </w:r>
+      <w:r>
+        <w:t xml:space="preserve">. 2nd ed. Springer.</w:t>
+      </w:r>
+      <w:r>
+        <w:t xml:space="preserve"> </w:t>
+      </w:r>
+      <w:hyperlink r:id="rId52">
+        <w:r>
+          <w:rPr>
+            <w:rStyle w:val="Hyperlink"/>
+          </w:rPr>
+          <w:t xml:space="preserve">https://hastie.su.domains/ElemStatLearn/</w:t>
+        </w:r>
+      </w:hyperlink>
+      <w:r>
+        <w:t xml:space="preserve">.</w:t>
+      </w:r>
+    </w:p>
+    <w:bookmarkEnd w:id="53"/>
+    <w:bookmarkStart w:id="55" w:name="ref-strunk1920elements"/>
     <w:p>
       <w:pPr>
         <w:pStyle w:val="Bibliography"/>
@@ -4196,7 +4441,7 @@
       <w:r>
         <w:t xml:space="preserve"> </w:t>
       </w:r>
-      <w:hyperlink r:id="rId51">
+      <w:hyperlink r:id="rId54">
         <w:r>
           <w:rPr>
             <w:rStyle w:val="Hyperlink"/>
@@ -4208,8 +4453,8 @@
         <w:t xml:space="preserve">.</w:t>
       </w:r>
     </w:p>
-    <w:bookmarkEnd w:id="52"/>
-    <w:bookmarkStart w:id="54" w:name="ref-hemingway_style"/>
+    <w:bookmarkEnd w:id="55"/>
+    <w:bookmarkStart w:id="57" w:name="ref-hemingway_style"/>
     <w:p>
       <w:pPr>
         <w:pStyle w:val="Bibliography"/>
@@ -4268,7 +4513,7 @@
       <w:r>
         <w:t xml:space="preserve"> </w:t>
       </w:r>
-      <w:hyperlink r:id="rId53">
+      <w:hyperlink r:id="rId56">
         <w:r>
           <w:rPr>
             <w:rStyle w:val="Hyperlink"/>
@@ -4280,8 +4525,8 @@
         <w:t xml:space="preserve">.</w:t>
       </w:r>
     </w:p>
-    <w:bookmarkEnd w:id="54"/>
-    <w:bookmarkStart w:id="56" w:name="ref-caesar_gallic"/>
+    <w:bookmarkEnd w:id="57"/>
+    <w:bookmarkStart w:id="59" w:name="ref-caesar_gallic"/>
     <w:p>
       <w:pPr>
         <w:pStyle w:val="Bibliography"/>
@@ -4340,7 +4585,7 @@
       <w:r>
         <w:t xml:space="preserve"> </w:t>
       </w:r>
-      <w:hyperlink r:id="rId55">
+      <w:hyperlink r:id="rId58">
         <w:r>
           <w:rPr>
             <w:rStyle w:val="Hyperlink"/>
@@ -4352,9 +4597,9 @@
         <w:t xml:space="preserve">.</w:t>
       </w:r>
     </w:p>
-    <w:bookmarkEnd w:id="56"/>
-    <w:bookmarkEnd w:id="57"/>
-    <w:bookmarkEnd w:id="58"/>
+    <w:bookmarkEnd w:id="59"/>
+    <w:bookmarkEnd w:id="60"/>
+    <w:bookmarkEnd w:id="61"/>
     <w:sectPr>
       <w:footnotePr>
         <w:numRestart w:val="eachSect"/>

</xml_diff>

<commit_message>
Deploying to gh-pages from @ Morrison-Lab/psw@d7593021dd9462e00c2d760eebe7ac39bc83b916 🚀
</commit_message>
<xml_diff>
--- a/chapters/conciseness.docx
+++ b/chapters/conciseness.docx
@@ -15,7 +15,7 @@
         <w:pStyle w:val="Date"/>
       </w:pPr>
       <w:r>
-        <w:t xml:space="preserve">Last modified: 2026-10-29 13:51:16 (PDT)</w:t>
+        <w:t xml:space="preserve">Last modified: 2026-10-29 14:29:08 (PDT)</w:t>
       </w:r>
     </w:p>
     <w:tbl>
@@ -1266,13 +1266,182 @@
       </w:r>
     </w:p>
     <w:bookmarkEnd w:id="20"/>
-    <w:bookmarkStart w:id="22" w:name="limit-complex-sentence-structures"/>
+    <w:bookmarkStart w:id="21" w:name="put-the-emphatic-words-at-the-end"/>
     <w:p>
       <w:pPr>
         <w:pStyle w:val="Heading2"/>
       </w:pPr>
       <w:r>
-        <w:t xml:space="preserve">6 Limit complex sentence structures</w:t>
+        <w:t xml:space="preserve">6 Put the emphatic words at the end</w:t>
+      </w:r>
+    </w:p>
+    <w:p>
+      <w:pPr>
+        <w:pStyle w:val="FirstParagraph"/>
+      </w:pPr>
+      <w:r>
+        <w:t xml:space="preserve">The end of a sentence is the position the reader remembers.</w:t>
+      </w:r>
+      <w:r>
+        <w:t xml:space="preserve"> </w:t>
+      </w:r>
+      <w:r>
+        <w:t xml:space="preserve">Strunk states the rule as</w:t>
+      </w:r>
+      <w:r>
+        <w:t xml:space="preserve"> </w:t>
+      </w:r>
+      <w:r>
+        <w:t xml:space="preserve">“Place the emphatic words of a sentence at the end”</w:t>
+      </w:r>
+      <w:r>
+        <w:t xml:space="preserve"> </w:t>
+      </w:r>
+      <w:r>
+        <w:t xml:space="preserve">(Strunk 1920, rule 18)</w:t>
+      </w:r>
+      <w:r>
+        <w:t xml:space="preserve">.</w:t>
+      </w:r>
+      <w:r>
+        <w:t xml:space="preserve"> </w:t>
+      </w:r>
+      <w:r>
+        <w:t xml:space="preserve">Put the claim you want the reader to keep last,</w:t>
+      </w:r>
+      <w:r>
+        <w:t xml:space="preserve"> </w:t>
+      </w:r>
+      <w:r>
+        <w:t xml:space="preserve">and put the qualifications, the citation and the filler before it.</w:t>
+      </w:r>
+    </w:p>
+    <w:p>
+      <w:pPr>
+        <w:pStyle w:val="BlockText"/>
+      </w:pPr>
+      <w:r>
+        <w:t xml:space="preserve">❌ The estimate becomes more precise as the sample size grows, in general.</w:t>
+      </w:r>
+    </w:p>
+    <w:p>
+      <w:pPr>
+        <w:pStyle w:val="BlockText"/>
+      </w:pPr>
+      <w:r>
+        <w:t xml:space="preserve">✅ In general, the estimate becomes more precise as the sample size grows.</w:t>
+      </w:r>
+    </w:p>
+    <w:bookmarkEnd w:id="21"/>
+    <w:bookmarkStart w:id="22" w:name="X3e4d68df1b860ce9b082eb82ed52743b2d8229e"/>
+    <w:p>
+      <w:pPr>
+        <w:pStyle w:val="Heading2"/>
+      </w:pPr>
+      <w:r>
+        <w:t xml:space="preserve">7 Express coordinate ideas in parallel form</w:t>
+      </w:r>
+    </w:p>
+    <w:p>
+      <w:pPr>
+        <w:pStyle w:val="FirstParagraph"/>
+      </w:pPr>
+      <w:r>
+        <w:t xml:space="preserve">Items that play the same role in a sentence or a list</w:t>
+      </w:r>
+      <w:r>
+        <w:t xml:space="preserve"> </w:t>
+      </w:r>
+      <w:r>
+        <w:t xml:space="preserve">take the same grammatical form.</w:t>
+      </w:r>
+      <w:r>
+        <w:t xml:space="preserve"> </w:t>
+      </w:r>
+      <w:r>
+        <w:t xml:space="preserve">Strunk calls this parallel construction,</w:t>
+      </w:r>
+      <w:r>
+        <w:t xml:space="preserve"> </w:t>
+      </w:r>
+      <w:r>
+        <w:t xml:space="preserve">and states the rule as</w:t>
+      </w:r>
+      <w:r>
+        <w:t xml:space="preserve"> </w:t>
+      </w:r>
+      <w:r>
+        <w:t xml:space="preserve">“Express co-ordinate ideas in similar form”</w:t>
+      </w:r>
+      <w:r>
+        <w:t xml:space="preserve"> </w:t>
+      </w:r>
+      <w:r>
+        <w:t xml:space="preserve">(Strunk 1920, rule 15)</w:t>
+      </w:r>
+      <w:r>
+        <w:t xml:space="preserve">.</w:t>
+      </w:r>
+      <w:r>
+        <w:t xml:space="preserve"> </w:t>
+      </w:r>
+      <w:hyperlink w:anchor="put-lists-in-bullet-points">
+        <w:r>
+          <w:rPr>
+            <w:rStyle w:val="Hyperlink"/>
+          </w:rPr>
+          <w:t xml:space="preserve">Put lists in bullet points</w:t>
+        </w:r>
+      </w:hyperlink>
+      <w:r>
+        <w:t xml:space="preserve"> </w:t>
+      </w:r>
+      <w:r>
+        <w:t xml:space="preserve">applies the rule to the items of a list.</w:t>
+      </w:r>
+      <w:r>
+        <w:t xml:space="preserve"> </w:t>
+      </w:r>
+      <w:r>
+        <w:t xml:space="preserve">The rule also holds inside one sentence,</w:t>
+      </w:r>
+      <w:r>
+        <w:t xml:space="preserve"> </w:t>
+      </w:r>
+      <w:r>
+        <w:t xml:space="preserve">where a series joins verbs, noun phrases or adjectives</w:t>
+      </w:r>
+      <w:r>
+        <w:t xml:space="preserve"> </w:t>
+      </w:r>
+      <w:r>
+        <w:t xml:space="preserve">and each item should be the same kind of phrase.</w:t>
+      </w:r>
+    </w:p>
+    <w:p>
+      <w:pPr>
+        <w:pStyle w:val="BlockText"/>
+      </w:pPr>
+      <w:r>
+        <w:t xml:space="preserve">❌ The model is fast, accurate and has been validated.</w:t>
+      </w:r>
+    </w:p>
+    <w:p>
+      <w:pPr>
+        <w:pStyle w:val="BlockText"/>
+      </w:pPr>
+      <w:r>
+        <w:t xml:space="preserve">✅ The model is fast, accurate and validated.</w:t>
+      </w:r>
+    </w:p>
+    <w:bookmarkEnd w:id="22"/>
+    <w:bookmarkStart w:id="24" w:name="limit-complex-sentence-structures"/>
+    <w:p>
+      <w:pPr>
+        <w:pStyle w:val="Heading2"/>
+      </w:pPr>
+      <w:r>
+        <w:t xml:space="preserve">8 Limit complex sentence structures</w:t>
       </w:r>
     </w:p>
     <w:p>
@@ -1375,7 +1544,7 @@
         <w:t xml:space="preserve">each carrying one main idea.</w:t>
       </w:r>
     </w:p>
-    <w:bookmarkStart w:id="21" w:name="exm-nested-clauses"/>
+    <w:bookmarkStart w:id="23" w:name="exm-nested-clauses"/>
     <w:p>
       <w:pPr>
         <w:pStyle w:val="BodyText"/>
@@ -1436,15 +1605,15 @@
         <w:t xml:space="preserve">so the reader can absorb each idea before moving on.</w:t>
       </w:r>
     </w:p>
-    <w:bookmarkEnd w:id="21"/>
-    <w:bookmarkEnd w:id="22"/>
-    <w:bookmarkStart w:id="25" w:name="X831e99641ea6e3d916f49fb78be48dc576ff061"/>
+    <w:bookmarkEnd w:id="23"/>
+    <w:bookmarkEnd w:id="24"/>
+    <w:bookmarkStart w:id="27" w:name="X831e99641ea6e3d916f49fb78be48dc576ff061"/>
     <w:p>
       <w:pPr>
         <w:pStyle w:val="Heading2"/>
       </w:pPr>
       <w:r>
-        <w:t xml:space="preserve">7 Do not rule out readings no reader would make</w:t>
+        <w:t xml:space="preserve">9 Do not rule out readings no reader would make</w:t>
       </w:r>
     </w:p>
     <w:p>
@@ -1502,7 +1671,7 @@
         <w:t xml:space="preserve">and can plant the confusion it was meant to prevent.</w:t>
       </w:r>
     </w:p>
-    <w:bookmarkStart w:id="23" w:name="exm-gratuitous-disclaimer"/>
+    <w:bookmarkStart w:id="25" w:name="exm-gratuitous-disclaimer"/>
     <w:p>
       <w:pPr>
         <w:pStyle w:val="BodyText"/>
@@ -1587,7 +1756,7 @@
         <w:t xml:space="preserve">that the reader would not otherwise have considered.</w:t>
       </w:r>
     </w:p>
-    <w:bookmarkEnd w:id="23"/>
+    <w:bookmarkEnd w:id="25"/>
     <w:p>
       <w:pPr>
         <w:pStyle w:val="BodyText"/>
@@ -1688,7 +1857,7 @@
         <w:t xml:space="preserve">the contrast fails the test above, so remove it.</w:t>
       </w:r>
     </w:p>
-    <w:bookmarkStart w:id="24" w:name="exm-fleshed-out-contrast"/>
+    <w:bookmarkStart w:id="26" w:name="exm-fleshed-out-contrast"/>
     <w:p>
       <w:pPr>
         <w:pStyle w:val="BodyText"/>
@@ -1836,7 +2005,7 @@
         <w:t xml:space="preserve">.</w:t>
       </w:r>
     </w:p>
-    <w:bookmarkEnd w:id="24"/>
+    <w:bookmarkEnd w:id="26"/>
     <w:p>
       <w:pPr>
         <w:pStyle w:val="BodyText"/>
@@ -1869,14 +2038,14 @@
         <w:t xml:space="preserve">a report for clinicians might.</w:t>
       </w:r>
     </w:p>
-    <w:bookmarkEnd w:id="25"/>
-    <w:bookmarkStart w:id="27" w:name="avoid-double-negatives"/>
+    <w:bookmarkEnd w:id="27"/>
+    <w:bookmarkStart w:id="29" w:name="avoid-double-negatives"/>
     <w:p>
       <w:pPr>
         <w:pStyle w:val="Heading2"/>
       </w:pPr>
       <w:r>
-        <w:t xml:space="preserve">8 Avoid double negatives</w:t>
+        <w:t xml:space="preserve">10 Avoid double negatives</w:t>
       </w:r>
     </w:p>
     <w:p>
@@ -1987,7 +2156,7 @@
         <w:t xml:space="preserve">and it is the standard wording for a test result.</w:t>
       </w:r>
     </w:p>
-    <w:bookmarkStart w:id="26" w:name="exm-double-negative"/>
+    <w:bookmarkStart w:id="28" w:name="exm-double-negative"/>
     <w:p>
       <w:pPr>
         <w:pStyle w:val="BodyText"/>
@@ -2088,15 +2257,15 @@
         <w:t xml:space="preserve">Choose the one you mean.</w:t>
       </w:r>
     </w:p>
-    <w:bookmarkEnd w:id="26"/>
-    <w:bookmarkEnd w:id="27"/>
-    <w:bookmarkStart w:id="30" w:name="Xa757197b9b942a803dc05820332a104a8aaeee4"/>
+    <w:bookmarkEnd w:id="28"/>
+    <w:bookmarkEnd w:id="29"/>
+    <w:bookmarkStart w:id="32" w:name="Xa757197b9b942a803dc05820332a104a8aaeee4"/>
     <w:p>
       <w:pPr>
         <w:pStyle w:val="Heading2"/>
       </w:pPr>
       <w:r>
-        <w:t xml:space="preserve">9 Write about the subject, not about the text</w:t>
+        <w:t xml:space="preserve">11 Write about the subject, not about the text</w:t>
       </w:r>
     </w:p>
     <w:p>
@@ -2171,7 +2340,7 @@
       <w:r>
         <w:t xml:space="preserve"> </w:t>
       </w:r>
-      <w:hyperlink r:id="rId28">
+      <w:hyperlink r:id="rId30">
         <w:r>
           <w:rPr>
             <w:rStyle w:val="Hyperlink"/>
@@ -2195,7 +2364,7 @@
         <w:t xml:space="preserve">.</w:t>
       </w:r>
     </w:p>
-    <w:bookmarkStart w:id="29" w:name="exm-self-referential"/>
+    <w:bookmarkStart w:id="31" w:name="exm-self-referential"/>
     <w:p>
       <w:pPr>
         <w:pStyle w:val="BodyText"/>
@@ -2294,15 +2463,15 @@
         <w:t xml:space="preserve">instead of saying that it changes something.</w:t>
       </w:r>
     </w:p>
-    <w:bookmarkEnd w:id="29"/>
-    <w:bookmarkEnd w:id="30"/>
-    <w:bookmarkStart w:id="33" w:name="let-a-self-describing-link-stand-alone"/>
+    <w:bookmarkEnd w:id="31"/>
+    <w:bookmarkEnd w:id="32"/>
+    <w:bookmarkStart w:id="35" w:name="let-a-self-describing-link-stand-alone"/>
     <w:p>
       <w:pPr>
         <w:pStyle w:val="Heading2"/>
       </w:pPr>
       <w:r>
-        <w:t xml:space="preserve">10 Let a self-describing link stand alone</w:t>
+        <w:t xml:space="preserve">12 Let a self-describing link stand alone</w:t>
       </w:r>
     </w:p>
     <w:p>
@@ -2331,7 +2500,7 @@
         <w:t xml:space="preserve">The reader would read the same facts twice.</w:t>
       </w:r>
     </w:p>
-    <w:bookmarkStart w:id="32" w:name="exm-self-describing-link"/>
+    <w:bookmarkStart w:id="34" w:name="exm-self-describing-link"/>
     <w:p>
       <w:pPr>
         <w:pStyle w:val="BodyText"/>
@@ -2363,7 +2532,7 @@
       <w:r>
         <w:t xml:space="preserve">(</w:t>
       </w:r>
-      <w:hyperlink r:id="rId31">
+      <w:hyperlink r:id="rId33">
         <w:r>
           <w:rPr>
             <w:rStyle w:val="Hyperlink"/>
@@ -2385,7 +2554,7 @@
       <w:r>
         <w:t xml:space="preserve"> </w:t>
       </w:r>
-      <w:hyperlink r:id="rId31">
+      <w:hyperlink r:id="rId33">
         <w:r>
           <w:rPr>
             <w:rStyle w:val="Hyperlink"/>
@@ -2423,7 +2592,7 @@
         <w:t xml:space="preserve">.</w:t>
       </w:r>
     </w:p>
-    <w:bookmarkEnd w:id="32"/>
+    <w:bookmarkEnd w:id="34"/>
     <w:p>
       <w:pPr>
         <w:pStyle w:val="BodyText"/>
@@ -2438,14 +2607,14 @@
         <w:t xml:space="preserve">such as a DOI or a shortened link.</w:t>
       </w:r>
     </w:p>
-    <w:bookmarkEnd w:id="33"/>
-    <w:bookmarkStart w:id="35" w:name="keep-the-writer-out-of-the-way"/>
+    <w:bookmarkEnd w:id="35"/>
+    <w:bookmarkStart w:id="37" w:name="keep-the-writer-out-of-the-way"/>
     <w:p>
       <w:pPr>
         <w:pStyle w:val="Heading2"/>
       </w:pPr>
       <w:r>
-        <w:t xml:space="preserve">11 Keep the writer out of the way</w:t>
+        <w:t xml:space="preserve">13 Keep the writer out of the way</w:t>
       </w:r>
     </w:p>
     <w:p>
@@ -2480,7 +2649,7 @@
         <w:t xml:space="preserve">Extra references to the writer turn attention from the content to the person.</w:t>
       </w:r>
     </w:p>
-    <w:bookmarkStart w:id="34" w:name="exm-writer-out-of-the-way"/>
+    <w:bookmarkStart w:id="36" w:name="exm-writer-out-of-the-way"/>
     <w:p>
       <w:pPr>
         <w:pStyle w:val="BodyText"/>
@@ -2566,15 +2735,15 @@
         <w:t xml:space="preserve">because the request is about the writer’s runner.</w:t>
       </w:r>
     </w:p>
-    <w:bookmarkEnd w:id="34"/>
-    <w:bookmarkEnd w:id="35"/>
-    <w:bookmarkStart w:id="37" w:name="do-not-overexplain"/>
+    <w:bookmarkEnd w:id="36"/>
+    <w:bookmarkEnd w:id="37"/>
+    <w:bookmarkStart w:id="39" w:name="do-not-overexplain"/>
     <w:p>
       <w:pPr>
         <w:pStyle w:val="Heading2"/>
       </w:pPr>
       <w:r>
-        <w:t xml:space="preserve">12 Do not overexplain</w:t>
+        <w:t xml:space="preserve">14 Do not overexplain</w:t>
       </w:r>
     </w:p>
     <w:p>
@@ -2591,7 +2760,7 @@
         <w:t xml:space="preserve">Cut a qualifier, a restatement or a reason that the words before it already imply.</w:t>
       </w:r>
     </w:p>
-    <w:bookmarkStart w:id="36" w:name="exm-overexplain"/>
+    <w:bookmarkStart w:id="38" w:name="exm-overexplain"/>
     <w:p>
       <w:pPr>
         <w:pStyle w:val="BodyText"/>
@@ -2652,15 +2821,15 @@
         <w:t xml:space="preserve">The second is complete.</w:t>
       </w:r>
     </w:p>
-    <w:bookmarkEnd w:id="36"/>
-    <w:bookmarkEnd w:id="37"/>
-    <w:bookmarkStart w:id="45" w:name="put-lists-in-bullet-points"/>
+    <w:bookmarkEnd w:id="38"/>
+    <w:bookmarkEnd w:id="39"/>
+    <w:bookmarkStart w:id="47" w:name="put-lists-in-bullet-points"/>
     <w:p>
       <w:pPr>
         <w:pStyle w:val="Heading2"/>
       </w:pPr>
       <w:r>
-        <w:t xml:space="preserve">13 Put lists in bullet points</w:t>
+        <w:t xml:space="preserve">15 Put lists in bullet points</w:t>
       </w:r>
     </w:p>
     <w:p>
@@ -2868,7 +3037,7 @@
         <w:t xml:space="preserve">.</w:t>
       </w:r>
     </w:p>
-    <w:bookmarkStart w:id="38" w:name="exm-bullet-lists"/>
+    <w:bookmarkStart w:id="40" w:name="exm-bullet-lists"/>
     <w:p>
       <w:pPr>
         <w:pStyle w:val="FirstParagraph"/>
@@ -2953,8 +3122,8 @@
         <w:t xml:space="preserve">so the reader sees at a glance that there are three.</w:t>
       </w:r>
     </w:p>
-    <w:bookmarkEnd w:id="38"/>
-    <w:bookmarkStart w:id="42" w:name="exm-resource-lists"/>
+    <w:bookmarkEnd w:id="40"/>
+    <w:bookmarkStart w:id="44" w:name="exm-resource-lists"/>
     <w:p>
       <w:pPr>
         <w:pStyle w:val="BodyText"/>
@@ -2983,7 +3152,7 @@
       <w:r>
         <w:t xml:space="preserve"> </w:t>
       </w:r>
-      <w:hyperlink r:id="rId39">
+      <w:hyperlink r:id="rId41">
         <w:r>
           <w:rPr>
             <w:rStyle w:val="Hyperlink"/>
@@ -2997,7 +3166,7 @@
       <w:r>
         <w:t xml:space="preserve"> </w:t>
       </w:r>
-      <w:hyperlink r:id="rId40">
+      <w:hyperlink r:id="rId42">
         <w:r>
           <w:rPr>
             <w:rStyle w:val="Hyperlink"/>
@@ -3031,7 +3200,7 @@
       <w:r>
         <w:t xml:space="preserve"> </w:t>
       </w:r>
-      <w:hyperlink r:id="rId39">
+      <w:hyperlink r:id="rId41">
         <w:r>
           <w:rPr>
             <w:rStyle w:val="Hyperlink"/>
@@ -3057,7 +3226,7 @@
       <w:r>
         <w:t xml:space="preserve"> </w:t>
       </w:r>
-      <w:hyperlink r:id="rId40">
+      <w:hyperlink r:id="rId42">
         <w:r>
           <w:rPr>
             <w:rStyle w:val="Hyperlink"/>
@@ -3079,7 +3248,7 @@
       <w:r>
         <w:t xml:space="preserve"> </w:t>
       </w:r>
-      <w:hyperlink r:id="rId41">
+      <w:hyperlink r:id="rId43">
         <w:r>
           <w:rPr>
             <w:rStyle w:val="Hyperlink"/>
@@ -3103,8 +3272,8 @@
         <w:t xml:space="preserve">so the reader can pick one without parsing the paragraph.</w:t>
       </w:r>
     </w:p>
-    <w:bookmarkEnd w:id="42"/>
-    <w:bookmarkStart w:id="43" w:name="exm-numbered-lists"/>
+    <w:bookmarkEnd w:id="44"/>
+    <w:bookmarkStart w:id="45" w:name="exm-numbered-lists"/>
     <w:p>
       <w:pPr>
         <w:pStyle w:val="BodyText"/>
@@ -3211,8 +3380,8 @@
         <w:t xml:space="preserve">and the loop condition moves into the introducing sentence.</w:t>
       </w:r>
     </w:p>
-    <w:bookmarkEnd w:id="43"/>
-    <w:bookmarkStart w:id="44" w:name="exm-case-bullets"/>
+    <w:bookmarkEnd w:id="45"/>
+    <w:bookmarkStart w:id="46" w:name="exm-case-bullets"/>
     <w:p>
       <w:pPr>
         <w:pStyle w:val="BodyText"/>
@@ -3857,15 +4026,15 @@
         <w:t xml:space="preserve">and the bullets show that there are three.</w:t>
       </w:r>
     </w:p>
-    <w:bookmarkEnd w:id="44"/>
-    <w:bookmarkEnd w:id="45"/>
-    <w:bookmarkStart w:id="51" w:name="write-to-communicate-not-to-impress"/>
+    <w:bookmarkEnd w:id="46"/>
+    <w:bookmarkEnd w:id="47"/>
+    <w:bookmarkStart w:id="53" w:name="write-to-communicate-not-to-impress"/>
     <w:p>
       <w:pPr>
         <w:pStyle w:val="Heading2"/>
       </w:pPr>
       <w:r>
-        <w:t xml:space="preserve">14 Write to communicate, not to impress</w:t>
+        <w:t xml:space="preserve">16 Write to communicate, not to impress</w:t>
       </w:r>
     </w:p>
     <w:p>
@@ -3932,7 +4101,7 @@
       <w:r>
         <w:t xml:space="preserve"> </w:t>
       </w:r>
-      <w:hyperlink r:id="rId46">
+      <w:hyperlink r:id="rId48">
         <w:r>
           <w:rPr>
             <w:rStyle w:val="Hyperlink"/>
@@ -3990,7 +4159,7 @@
       <w:r>
         <w:t xml:space="preserve"> </w:t>
       </w:r>
-      <w:hyperlink r:id="rId47">
+      <w:hyperlink r:id="rId49">
         <w:r>
           <w:rPr>
             <w:rStyle w:val="Hyperlink"/>
@@ -4019,7 +4188,7 @@
       <w:r>
         <w:t xml:space="preserve"> </w:t>
       </w:r>
-      <w:hyperlink r:id="rId48">
+      <w:hyperlink r:id="rId50">
         <w:r>
           <w:rPr>
             <w:rStyle w:val="Hyperlink"/>
@@ -4031,7 +4200,7 @@
         <w:t xml:space="preserve">.</w:t>
       </w:r>
     </w:p>
-    <w:bookmarkStart w:id="50" w:name="exm-communicate-not-impress"/>
+    <w:bookmarkStart w:id="52" w:name="exm-communicate-not-impress"/>
     <w:p>
       <w:pPr>
         <w:pStyle w:val="FirstParagraph"/>
@@ -4172,7 +4341,7 @@
       <w:r>
         <w:t xml:space="preserve"> </w:t>
       </w:r>
-      <w:hyperlink r:id="rId49">
+      <w:hyperlink r:id="rId51">
         <w:r>
           <w:rPr>
             <w:rStyle w:val="Hyperlink"/>
@@ -4280,15 +4449,15 @@
         <w:t xml:space="preserve">and its findings are ones it obtained.</w:t>
       </w:r>
     </w:p>
-    <w:bookmarkEnd w:id="50"/>
-    <w:bookmarkEnd w:id="51"/>
-    <w:bookmarkStart w:id="61" w:name="examples-of-concise-writing"/>
+    <w:bookmarkEnd w:id="52"/>
+    <w:bookmarkEnd w:id="53"/>
+    <w:bookmarkStart w:id="63" w:name="examples-of-concise-writing"/>
     <w:p>
       <w:pPr>
         <w:pStyle w:val="Heading2"/>
       </w:pPr>
       <w:r>
-        <w:t xml:space="preserve">15 Examples of concise writing</w:t>
+        <w:t xml:space="preserve">17 Examples of concise writing</w:t>
       </w:r>
     </w:p>
     <w:p>
@@ -4379,8 +4548,8 @@
         <w:t xml:space="preserve">.</w:t>
       </w:r>
     </w:p>
-    <w:bookmarkStart w:id="60" w:name="refs"/>
-    <w:bookmarkStart w:id="53" w:name="ref-hastie2009esl"/>
+    <w:bookmarkStart w:id="62" w:name="refs"/>
+    <w:bookmarkStart w:id="55" w:name="ref-hastie2009esl"/>
     <w:p>
       <w:pPr>
         <w:pStyle w:val="Bibliography"/>
@@ -4404,7 +4573,7 @@
       <w:r>
         <w:t xml:space="preserve"> </w:t>
       </w:r>
-      <w:hyperlink r:id="rId52">
+      <w:hyperlink r:id="rId54">
         <w:r>
           <w:rPr>
             <w:rStyle w:val="Hyperlink"/>
@@ -4416,8 +4585,8 @@
         <w:t xml:space="preserve">.</w:t>
       </w:r>
     </w:p>
-    <w:bookmarkEnd w:id="53"/>
-    <w:bookmarkStart w:id="55" w:name="ref-strunk1920elements"/>
+    <w:bookmarkEnd w:id="55"/>
+    <w:bookmarkStart w:id="57" w:name="ref-strunk1920elements"/>
     <w:p>
       <w:pPr>
         <w:pStyle w:val="Bibliography"/>
@@ -4441,7 +4610,7 @@
       <w:r>
         <w:t xml:space="preserve"> </w:t>
       </w:r>
-      <w:hyperlink r:id="rId54">
+      <w:hyperlink r:id="rId56">
         <w:r>
           <w:rPr>
             <w:rStyle w:val="Hyperlink"/>
@@ -4453,8 +4622,8 @@
         <w:t xml:space="preserve">.</w:t>
       </w:r>
     </w:p>
-    <w:bookmarkEnd w:id="55"/>
-    <w:bookmarkStart w:id="57" w:name="ref-hemingway_style"/>
+    <w:bookmarkEnd w:id="57"/>
+    <w:bookmarkStart w:id="59" w:name="ref-hemingway_style"/>
     <w:p>
       <w:pPr>
         <w:pStyle w:val="Bibliography"/>
@@ -4513,7 +4682,7 @@
       <w:r>
         <w:t xml:space="preserve"> </w:t>
       </w:r>
-      <w:hyperlink r:id="rId56">
+      <w:hyperlink r:id="rId58">
         <w:r>
           <w:rPr>
             <w:rStyle w:val="Hyperlink"/>
@@ -4525,8 +4694,8 @@
         <w:t xml:space="preserve">.</w:t>
       </w:r>
     </w:p>
-    <w:bookmarkEnd w:id="57"/>
-    <w:bookmarkStart w:id="59" w:name="ref-caesar_gallic"/>
+    <w:bookmarkEnd w:id="59"/>
+    <w:bookmarkStart w:id="61" w:name="ref-caesar_gallic"/>
     <w:p>
       <w:pPr>
         <w:pStyle w:val="Bibliography"/>
@@ -4585,7 +4754,7 @@
       <w:r>
         <w:t xml:space="preserve"> </w:t>
       </w:r>
-      <w:hyperlink r:id="rId58">
+      <w:hyperlink r:id="rId60">
         <w:r>
           <w:rPr>
             <w:rStyle w:val="Hyperlink"/>
@@ -4597,9 +4766,9 @@
         <w:t xml:space="preserve">.</w:t>
       </w:r>
     </w:p>
-    <w:bookmarkEnd w:id="59"/>
-    <w:bookmarkEnd w:id="60"/>
     <w:bookmarkEnd w:id="61"/>
+    <w:bookmarkEnd w:id="62"/>
+    <w:bookmarkEnd w:id="63"/>
     <w:sectPr>
       <w:footnotePr>
         <w:numRestart w:val="eachSect"/>

</xml_diff>